<commit_message>
docs: separate frontend and backend delivery ownership
</commit_message>
<xml_diff>
--- a/docs/delivery/邻里闲置_项目设计说明书.docx
+++ b/docs/delivery/邻里闲置_项目设计说明书.docx
@@ -1047,7 +1047,7 @@
         <w:spacing w:after="140"/>
       </w:pPr>
       <w:r>
-        <w:t>浏览器通过同源 /api/v1 访问后端；后端访问 SQLite 并调用模型服务。密钥只放在服务端环境变量中。前端、API 与数据库保持明确边界。上述选型为计划，依赖版本将在工程初始化时锁定。</w:t>
+        <w:t>浏览器通过同源 /api/v1 访问后端；后端访问 SQLite 并调用模型服务。密钥只放在服务端环境变量中。前端、API 与数据库保持明确边界。工程骨架与共享接口契约已建立，具体业务仍在开发中。</w:t>
       </w:r>
     </w:p>
     <w:p>
@@ -2597,7 +2597,7 @@
         <w:spacing w:after="140"/>
       </w:pPr>
       <w:r>
-        <w:t>GitHub Epic #1 下设 11 个必需开发任务，另有 1 个可选部署任务。先建立工程与契约，再实施数据库和模块，最后联调、验证并制作交付材料。页面原型与本报告不代表这些开发任务已完成。</w:t>
+        <w:t>GitHub Epic #1 下设 6 个必需交付任务，另有 1 个可选部署任务。工程与契约完成后，完整前端 #9 和完整后端 #4 分别由一个会话独立并行开发，再由 #11 联调、#12 制作最终材料。前端以统一 API 适配层预留接口，开发 Mock 只用于独立交互演示。页面原型与本报告不代表这些开发任务已完成。</w:t>
       </w:r>
     </w:p>
     <w:tbl>
@@ -3115,7 +3115,7 @@
                 <w:b w:val="0"/>
                 <w:sz w:val="20"/>
               </w:rPr>
-              <w:t>当前未配置</w:t>
+              <w:t>CI 已配置；未部署</w:t>
             </w:r>
           </w:p>
         </w:tc>

</xml_diff>

<commit_message>
docs: move ER diagram annotations into report text
</commit_message>
<xml_diff>
--- a/docs/delivery/邻里闲置_项目设计说明书.docx
+++ b/docs/delivery/邻里闲置_项目设计说明书.docx
@@ -1129,6 +1129,7 @@
     </w:p>
     <w:p>
       <w:pPr>
+        <w:keepNext/>
         <w:spacing w:after="40"/>
         <w:jc w:val="center"/>
       </w:pPr>
@@ -1224,6 +1225,7 @@
     </w:p>
     <w:p>
       <w:pPr>
+        <w:keepNext/>
         <w:spacing w:after="40"/>
         <w:jc w:val="center"/>
       </w:pPr>
@@ -1319,6 +1321,7 @@
     </w:p>
     <w:p>
       <w:pPr>
+        <w:keepNext/>
         <w:spacing w:after="40"/>
         <w:jc w:val="center"/>
       </w:pPr>
@@ -1414,6 +1417,7 @@
     </w:p>
     <w:p>
       <w:pPr>
+        <w:keepNext/>
         <w:spacing w:after="40"/>
         <w:jc w:val="center"/>
       </w:pPr>
@@ -1509,13 +1513,14 @@
     </w:p>
     <w:p>
       <w:pPr>
+        <w:keepNext/>
         <w:spacing w:after="40"/>
         <w:jc w:val="center"/>
       </w:pPr>
       <w:r>
         <w:drawing>
           <wp:inline xmlns:a="http://schemas.openxmlformats.org/drawingml/2006/main" xmlns:pic="http://schemas.openxmlformats.org/drawingml/2006/picture">
-            <wp:extent cx="5486400" cy="5266944"/>
+            <wp:extent cx="5486400" cy="4620333"/>
             <wp:docPr id="5" name="Picture 5"/>
             <wp:cNvGraphicFramePr>
               <a:graphicFrameLocks noChangeAspect="1"/>
@@ -1536,7 +1541,7 @@
                   <pic:spPr>
                     <a:xfrm>
                       <a:off x="0" y="0"/>
-                      <a:ext cx="5486400" cy="5266944"/>
+                      <a:ext cx="5486400" cy="4620333"/>
                     </a:xfrm>
                     <a:prstGeom prst="rect"/>
                   </pic:spPr>
@@ -1562,7 +1567,7 @@
         <w:spacing w:after="140"/>
       </w:pPr>
       <w:r>
-        <w:t>六个实体为用户、登录会话、物品、意向记录、留言和交易记录。取消联系可选，交易有零个或一个取消人；物品与交易的一对多包含取消历史，不表示允许同时成交给多人。</w:t>
+        <w:t>六个实体为用户、登录会话、物品、意向记录、留言和交易记录，实体属性见第 5 节。取消联系可选，交易有零个或一个取消人；物品与交易的一对多包含取消历史，不表示允许同时成交给多人。</w:t>
       </w:r>
     </w:p>
     <w:p>
@@ -1580,13 +1585,14 @@
     </w:p>
     <w:p>
       <w:pPr>
+        <w:keepNext/>
         <w:spacing w:after="40"/>
         <w:jc w:val="center"/>
       </w:pPr>
       <w:r>
         <w:drawing>
           <wp:inline xmlns:a="http://schemas.openxmlformats.org/drawingml/2006/main" xmlns:pic="http://schemas.openxmlformats.org/drawingml/2006/picture">
-            <wp:extent cx="5166360" cy="3444240"/>
+            <wp:extent cx="5166360" cy="2771969"/>
             <wp:docPr id="6" name="Picture 6"/>
             <wp:cNvGraphicFramePr>
               <a:graphicFrameLocks noChangeAspect="1"/>
@@ -1607,7 +1613,7 @@
                   <pic:spPr>
                     <a:xfrm>
                       <a:off x="0" y="0"/>
-                      <a:ext cx="5166360" cy="3444240"/>
+                      <a:ext cx="5166360" cy="2771969"/>
                     </a:xfrm>
                     <a:prstGeom prst="rect"/>
                   </pic:spPr>
@@ -1630,13 +1636,14 @@
     </w:p>
     <w:p>
       <w:pPr>
+        <w:keepNext/>
         <w:spacing w:after="40"/>
         <w:jc w:val="center"/>
       </w:pPr>
       <w:r>
         <w:drawing>
           <wp:inline xmlns:a="http://schemas.openxmlformats.org/drawingml/2006/main" xmlns:pic="http://schemas.openxmlformats.org/drawingml/2006/picture">
-            <wp:extent cx="5166360" cy="3444240"/>
+            <wp:extent cx="5166360" cy="2771969"/>
             <wp:docPr id="7" name="Picture 7"/>
             <wp:cNvGraphicFramePr>
               <a:graphicFrameLocks noChangeAspect="1"/>
@@ -1657,7 +1664,7 @@
                   <pic:spPr>
                     <a:xfrm>
                       <a:off x="0" y="0"/>
-                      <a:ext cx="5166360" cy="3444240"/>
+                      <a:ext cx="5166360" cy="2771969"/>
                     </a:xfrm>
                     <a:prstGeom prst="rect"/>
                   </pic:spPr>
@@ -1701,13 +1708,14 @@
     </w:p>
     <w:p>
       <w:pPr>
+        <w:keepNext/>
         <w:spacing w:after="40"/>
         <w:jc w:val="center"/>
       </w:pPr>
       <w:r>
         <w:drawing>
           <wp:inline xmlns:a="http://schemas.openxmlformats.org/drawingml/2006/main" xmlns:pic="http://schemas.openxmlformats.org/drawingml/2006/picture">
-            <wp:extent cx="5166360" cy="3444240"/>
+            <wp:extent cx="5166360" cy="2750136"/>
             <wp:docPr id="8" name="Picture 8"/>
             <wp:cNvGraphicFramePr>
               <a:graphicFrameLocks noChangeAspect="1"/>
@@ -1728,7 +1736,7 @@
                   <pic:spPr>
                     <a:xfrm>
                       <a:off x="0" y="0"/>
-                      <a:ext cx="5166360" cy="3444240"/>
+                      <a:ext cx="5166360" cy="2750136"/>
                     </a:xfrm>
                     <a:prstGeom prst="rect"/>
                   </pic:spPr>
@@ -1751,13 +1759,14 @@
     </w:p>
     <w:p>
       <w:pPr>
+        <w:keepNext/>
         <w:spacing w:after="40"/>
         <w:jc w:val="center"/>
       </w:pPr>
       <w:r>
         <w:drawing>
           <wp:inline xmlns:a="http://schemas.openxmlformats.org/drawingml/2006/main" xmlns:pic="http://schemas.openxmlformats.org/drawingml/2006/picture">
-            <wp:extent cx="5166360" cy="3444240"/>
+            <wp:extent cx="5166360" cy="2771969"/>
             <wp:docPr id="9" name="Picture 9"/>
             <wp:cNvGraphicFramePr>
               <a:graphicFrameLocks noChangeAspect="1"/>
@@ -1778,7 +1787,7 @@
                   <pic:spPr>
                     <a:xfrm>
                       <a:off x="0" y="0"/>
-                      <a:ext cx="5166360" cy="3444240"/>
+                      <a:ext cx="5166360" cy="2771969"/>
                     </a:xfrm>
                     <a:prstGeom prst="rect"/>
                   </pic:spPr>
@@ -1814,13 +1823,14 @@
     </w:p>
     <w:p>
       <w:pPr>
+        <w:keepNext/>
         <w:spacing w:after="40"/>
         <w:jc w:val="center"/>
       </w:pPr>
       <w:r>
         <w:drawing>
           <wp:inline xmlns:a="http://schemas.openxmlformats.org/drawingml/2006/main" xmlns:pic="http://schemas.openxmlformats.org/drawingml/2006/picture">
-            <wp:extent cx="5166360" cy="3444240"/>
+            <wp:extent cx="5166360" cy="2493219"/>
             <wp:docPr id="10" name="Picture 10"/>
             <wp:cNvGraphicFramePr>
               <a:graphicFrameLocks noChangeAspect="1"/>
@@ -1841,7 +1851,7 @@
                   <pic:spPr>
                     <a:xfrm>
                       <a:off x="0" y="0"/>
-                      <a:ext cx="5166360" cy="3444240"/>
+                      <a:ext cx="5166360" cy="2493219"/>
                     </a:xfrm>
                     <a:prstGeom prst="rect"/>
                   </pic:spPr>
@@ -1864,13 +1874,14 @@
     </w:p>
     <w:p>
       <w:pPr>
+        <w:keepNext/>
         <w:spacing w:after="40"/>
         <w:jc w:val="center"/>
       </w:pPr>
       <w:r>
         <w:drawing>
           <wp:inline xmlns:a="http://schemas.openxmlformats.org/drawingml/2006/main" xmlns:pic="http://schemas.openxmlformats.org/drawingml/2006/picture">
-            <wp:extent cx="5166360" cy="3444240"/>
+            <wp:extent cx="5166360" cy="2739242"/>
             <wp:docPr id="11" name="Picture 11"/>
             <wp:cNvGraphicFramePr>
               <a:graphicFrameLocks noChangeAspect="1"/>
@@ -1891,7 +1902,7 @@
                   <pic:spPr>
                     <a:xfrm>
                       <a:off x="0" y="0"/>
-                      <a:ext cx="5166360" cy="3444240"/>
+                      <a:ext cx="5166360" cy="2739242"/>
                     </a:xfrm>
                     <a:prstGeom prst="rect"/>
                   </pic:spPr>
@@ -1927,13 +1938,14 @@
     </w:p>
     <w:p>
       <w:pPr>
+        <w:keepNext/>
         <w:spacing w:after="40"/>
         <w:jc w:val="center"/>
       </w:pPr>
       <w:r>
         <w:drawing>
           <wp:inline xmlns:a="http://schemas.openxmlformats.org/drawingml/2006/main" xmlns:pic="http://schemas.openxmlformats.org/drawingml/2006/picture">
-            <wp:extent cx="5760720" cy="4114800"/>
+            <wp:extent cx="5760720" cy="3314941"/>
             <wp:docPr id="12" name="Picture 12"/>
             <wp:cNvGraphicFramePr>
               <a:graphicFrameLocks noChangeAspect="1"/>
@@ -1954,7 +1966,7 @@
                   <pic:spPr>
                     <a:xfrm>
                       <a:off x="0" y="0"/>
-                      <a:ext cx="5760720" cy="4114800"/>
+                      <a:ext cx="5760720" cy="3314941"/>
                     </a:xfrm>
                     <a:prstGeom prst="rect"/>
                   </pic:spPr>
@@ -1998,13 +2010,14 @@
     </w:p>
     <w:p>
       <w:pPr>
+        <w:keepNext/>
         <w:spacing w:after="40"/>
         <w:jc w:val="center"/>
       </w:pPr>
       <w:r>
         <w:drawing>
           <wp:inline xmlns:a="http://schemas.openxmlformats.org/drawingml/2006/main" xmlns:pic="http://schemas.openxmlformats.org/drawingml/2006/picture">
-            <wp:extent cx="5760720" cy="4114800"/>
+            <wp:extent cx="5760720" cy="3250078"/>
             <wp:docPr id="13" name="Picture 13"/>
             <wp:cNvGraphicFramePr>
               <a:graphicFrameLocks noChangeAspect="1"/>
@@ -2025,7 +2038,7 @@
                   <pic:spPr>
                     <a:xfrm>
                       <a:off x="0" y="0"/>
-                      <a:ext cx="5760720" cy="4114800"/>
+                      <a:ext cx="5760720" cy="3250078"/>
                     </a:xfrm>
                     <a:prstGeom prst="rect"/>
                   </pic:spPr>
@@ -2069,13 +2082,14 @@
     </w:p>
     <w:p>
       <w:pPr>
+        <w:keepNext/>
         <w:spacing w:after="40"/>
         <w:jc w:val="center"/>
       </w:pPr>
       <w:r>
         <w:drawing>
           <wp:inline xmlns:a="http://schemas.openxmlformats.org/drawingml/2006/main" xmlns:pic="http://schemas.openxmlformats.org/drawingml/2006/picture">
-            <wp:extent cx="5760720" cy="4114800"/>
+            <wp:extent cx="5760720" cy="3182112"/>
             <wp:docPr id="14" name="Picture 14"/>
             <wp:cNvGraphicFramePr>
               <a:graphicFrameLocks noChangeAspect="1"/>
@@ -2096,7 +2110,7 @@
                   <pic:spPr>
                     <a:xfrm>
                       <a:off x="0" y="0"/>
-                      <a:ext cx="5760720" cy="4114800"/>
+                      <a:ext cx="5760720" cy="3182112"/>
                     </a:xfrm>
                     <a:prstGeom prst="rect"/>
                   </pic:spPr>
@@ -2122,7 +2136,7 @@
         <w:spacing w:after="140"/>
       </w:pPr>
       <w:r>
-        <w:t>每笔交易关联一件物品和一个指定领取者；发布者由物品确定。取消人必须是双方之一；同一物品最多一笔未取消交易。</w:t>
+        <w:t>每笔交易关联一件物品和一个指定领取者；发布者由物品确定。取消联系可选，取消人必须是双方之一；一件物品可有多次取消历史，但最多一笔未取消交易。</w:t>
       </w:r>
     </w:p>
     <w:p>

</xml_diff>

<commit_message>
docs: move ER diagram annotations into report text (#16)
</commit_message>
<xml_diff>
--- a/docs/delivery/邻里闲置_项目设计说明书.docx
+++ b/docs/delivery/邻里闲置_项目设计说明书.docx
@@ -1129,6 +1129,7 @@
     </w:p>
     <w:p>
       <w:pPr>
+        <w:keepNext/>
         <w:spacing w:after="40"/>
         <w:jc w:val="center"/>
       </w:pPr>
@@ -1224,6 +1225,7 @@
     </w:p>
     <w:p>
       <w:pPr>
+        <w:keepNext/>
         <w:spacing w:after="40"/>
         <w:jc w:val="center"/>
       </w:pPr>
@@ -1319,6 +1321,7 @@
     </w:p>
     <w:p>
       <w:pPr>
+        <w:keepNext/>
         <w:spacing w:after="40"/>
         <w:jc w:val="center"/>
       </w:pPr>
@@ -1414,6 +1417,7 @@
     </w:p>
     <w:p>
       <w:pPr>
+        <w:keepNext/>
         <w:spacing w:after="40"/>
         <w:jc w:val="center"/>
       </w:pPr>
@@ -1509,13 +1513,14 @@
     </w:p>
     <w:p>
       <w:pPr>
+        <w:keepNext/>
         <w:spacing w:after="40"/>
         <w:jc w:val="center"/>
       </w:pPr>
       <w:r>
         <w:drawing>
           <wp:inline xmlns:a="http://schemas.openxmlformats.org/drawingml/2006/main" xmlns:pic="http://schemas.openxmlformats.org/drawingml/2006/picture">
-            <wp:extent cx="5486400" cy="5266944"/>
+            <wp:extent cx="5486400" cy="4620333"/>
             <wp:docPr id="5" name="Picture 5"/>
             <wp:cNvGraphicFramePr>
               <a:graphicFrameLocks noChangeAspect="1"/>
@@ -1536,7 +1541,7 @@
                   <pic:spPr>
                     <a:xfrm>
                       <a:off x="0" y="0"/>
-                      <a:ext cx="5486400" cy="5266944"/>
+                      <a:ext cx="5486400" cy="4620333"/>
                     </a:xfrm>
                     <a:prstGeom prst="rect"/>
                   </pic:spPr>
@@ -1562,7 +1567,7 @@
         <w:spacing w:after="140"/>
       </w:pPr>
       <w:r>
-        <w:t>六个实体为用户、登录会话、物品、意向记录、留言和交易记录。取消联系可选，交易有零个或一个取消人；物品与交易的一对多包含取消历史，不表示允许同时成交给多人。</w:t>
+        <w:t>六个实体为用户、登录会话、物品、意向记录、留言和交易记录，实体属性见第 5 节。取消联系可选，交易有零个或一个取消人；物品与交易的一对多包含取消历史，不表示允许同时成交给多人。</w:t>
       </w:r>
     </w:p>
     <w:p>
@@ -1580,13 +1585,14 @@
     </w:p>
     <w:p>
       <w:pPr>
+        <w:keepNext/>
         <w:spacing w:after="40"/>
         <w:jc w:val="center"/>
       </w:pPr>
       <w:r>
         <w:drawing>
           <wp:inline xmlns:a="http://schemas.openxmlformats.org/drawingml/2006/main" xmlns:pic="http://schemas.openxmlformats.org/drawingml/2006/picture">
-            <wp:extent cx="5166360" cy="3444240"/>
+            <wp:extent cx="5166360" cy="2771969"/>
             <wp:docPr id="6" name="Picture 6"/>
             <wp:cNvGraphicFramePr>
               <a:graphicFrameLocks noChangeAspect="1"/>
@@ -1607,7 +1613,7 @@
                   <pic:spPr>
                     <a:xfrm>
                       <a:off x="0" y="0"/>
-                      <a:ext cx="5166360" cy="3444240"/>
+                      <a:ext cx="5166360" cy="2771969"/>
                     </a:xfrm>
                     <a:prstGeom prst="rect"/>
                   </pic:spPr>
@@ -1630,13 +1636,14 @@
     </w:p>
     <w:p>
       <w:pPr>
+        <w:keepNext/>
         <w:spacing w:after="40"/>
         <w:jc w:val="center"/>
       </w:pPr>
       <w:r>
         <w:drawing>
           <wp:inline xmlns:a="http://schemas.openxmlformats.org/drawingml/2006/main" xmlns:pic="http://schemas.openxmlformats.org/drawingml/2006/picture">
-            <wp:extent cx="5166360" cy="3444240"/>
+            <wp:extent cx="5166360" cy="2771969"/>
             <wp:docPr id="7" name="Picture 7"/>
             <wp:cNvGraphicFramePr>
               <a:graphicFrameLocks noChangeAspect="1"/>
@@ -1657,7 +1664,7 @@
                   <pic:spPr>
                     <a:xfrm>
                       <a:off x="0" y="0"/>
-                      <a:ext cx="5166360" cy="3444240"/>
+                      <a:ext cx="5166360" cy="2771969"/>
                     </a:xfrm>
                     <a:prstGeom prst="rect"/>
                   </pic:spPr>
@@ -1701,13 +1708,14 @@
     </w:p>
     <w:p>
       <w:pPr>
+        <w:keepNext/>
         <w:spacing w:after="40"/>
         <w:jc w:val="center"/>
       </w:pPr>
       <w:r>
         <w:drawing>
           <wp:inline xmlns:a="http://schemas.openxmlformats.org/drawingml/2006/main" xmlns:pic="http://schemas.openxmlformats.org/drawingml/2006/picture">
-            <wp:extent cx="5166360" cy="3444240"/>
+            <wp:extent cx="5166360" cy="2750136"/>
             <wp:docPr id="8" name="Picture 8"/>
             <wp:cNvGraphicFramePr>
               <a:graphicFrameLocks noChangeAspect="1"/>
@@ -1728,7 +1736,7 @@
                   <pic:spPr>
                     <a:xfrm>
                       <a:off x="0" y="0"/>
-                      <a:ext cx="5166360" cy="3444240"/>
+                      <a:ext cx="5166360" cy="2750136"/>
                     </a:xfrm>
                     <a:prstGeom prst="rect"/>
                   </pic:spPr>
@@ -1751,13 +1759,14 @@
     </w:p>
     <w:p>
       <w:pPr>
+        <w:keepNext/>
         <w:spacing w:after="40"/>
         <w:jc w:val="center"/>
       </w:pPr>
       <w:r>
         <w:drawing>
           <wp:inline xmlns:a="http://schemas.openxmlformats.org/drawingml/2006/main" xmlns:pic="http://schemas.openxmlformats.org/drawingml/2006/picture">
-            <wp:extent cx="5166360" cy="3444240"/>
+            <wp:extent cx="5166360" cy="2771969"/>
             <wp:docPr id="9" name="Picture 9"/>
             <wp:cNvGraphicFramePr>
               <a:graphicFrameLocks noChangeAspect="1"/>
@@ -1778,7 +1787,7 @@
                   <pic:spPr>
                     <a:xfrm>
                       <a:off x="0" y="0"/>
-                      <a:ext cx="5166360" cy="3444240"/>
+                      <a:ext cx="5166360" cy="2771969"/>
                     </a:xfrm>
                     <a:prstGeom prst="rect"/>
                   </pic:spPr>
@@ -1814,13 +1823,14 @@
     </w:p>
     <w:p>
       <w:pPr>
+        <w:keepNext/>
         <w:spacing w:after="40"/>
         <w:jc w:val="center"/>
       </w:pPr>
       <w:r>
         <w:drawing>
           <wp:inline xmlns:a="http://schemas.openxmlformats.org/drawingml/2006/main" xmlns:pic="http://schemas.openxmlformats.org/drawingml/2006/picture">
-            <wp:extent cx="5166360" cy="3444240"/>
+            <wp:extent cx="5166360" cy="2493219"/>
             <wp:docPr id="10" name="Picture 10"/>
             <wp:cNvGraphicFramePr>
               <a:graphicFrameLocks noChangeAspect="1"/>
@@ -1841,7 +1851,7 @@
                   <pic:spPr>
                     <a:xfrm>
                       <a:off x="0" y="0"/>
-                      <a:ext cx="5166360" cy="3444240"/>
+                      <a:ext cx="5166360" cy="2493219"/>
                     </a:xfrm>
                     <a:prstGeom prst="rect"/>
                   </pic:spPr>
@@ -1864,13 +1874,14 @@
     </w:p>
     <w:p>
       <w:pPr>
+        <w:keepNext/>
         <w:spacing w:after="40"/>
         <w:jc w:val="center"/>
       </w:pPr>
       <w:r>
         <w:drawing>
           <wp:inline xmlns:a="http://schemas.openxmlformats.org/drawingml/2006/main" xmlns:pic="http://schemas.openxmlformats.org/drawingml/2006/picture">
-            <wp:extent cx="5166360" cy="3444240"/>
+            <wp:extent cx="5166360" cy="2739242"/>
             <wp:docPr id="11" name="Picture 11"/>
             <wp:cNvGraphicFramePr>
               <a:graphicFrameLocks noChangeAspect="1"/>
@@ -1891,7 +1902,7 @@
                   <pic:spPr>
                     <a:xfrm>
                       <a:off x="0" y="0"/>
-                      <a:ext cx="5166360" cy="3444240"/>
+                      <a:ext cx="5166360" cy="2739242"/>
                     </a:xfrm>
                     <a:prstGeom prst="rect"/>
                   </pic:spPr>
@@ -1927,13 +1938,14 @@
     </w:p>
     <w:p>
       <w:pPr>
+        <w:keepNext/>
         <w:spacing w:after="40"/>
         <w:jc w:val="center"/>
       </w:pPr>
       <w:r>
         <w:drawing>
           <wp:inline xmlns:a="http://schemas.openxmlformats.org/drawingml/2006/main" xmlns:pic="http://schemas.openxmlformats.org/drawingml/2006/picture">
-            <wp:extent cx="5760720" cy="4114800"/>
+            <wp:extent cx="5760720" cy="3314941"/>
             <wp:docPr id="12" name="Picture 12"/>
             <wp:cNvGraphicFramePr>
               <a:graphicFrameLocks noChangeAspect="1"/>
@@ -1954,7 +1966,7 @@
                   <pic:spPr>
                     <a:xfrm>
                       <a:off x="0" y="0"/>
-                      <a:ext cx="5760720" cy="4114800"/>
+                      <a:ext cx="5760720" cy="3314941"/>
                     </a:xfrm>
                     <a:prstGeom prst="rect"/>
                   </pic:spPr>
@@ -1998,13 +2010,14 @@
     </w:p>
     <w:p>
       <w:pPr>
+        <w:keepNext/>
         <w:spacing w:after="40"/>
         <w:jc w:val="center"/>
       </w:pPr>
       <w:r>
         <w:drawing>
           <wp:inline xmlns:a="http://schemas.openxmlformats.org/drawingml/2006/main" xmlns:pic="http://schemas.openxmlformats.org/drawingml/2006/picture">
-            <wp:extent cx="5760720" cy="4114800"/>
+            <wp:extent cx="5760720" cy="3250078"/>
             <wp:docPr id="13" name="Picture 13"/>
             <wp:cNvGraphicFramePr>
               <a:graphicFrameLocks noChangeAspect="1"/>
@@ -2025,7 +2038,7 @@
                   <pic:spPr>
                     <a:xfrm>
                       <a:off x="0" y="0"/>
-                      <a:ext cx="5760720" cy="4114800"/>
+                      <a:ext cx="5760720" cy="3250078"/>
                     </a:xfrm>
                     <a:prstGeom prst="rect"/>
                   </pic:spPr>
@@ -2069,13 +2082,14 @@
     </w:p>
     <w:p>
       <w:pPr>
+        <w:keepNext/>
         <w:spacing w:after="40"/>
         <w:jc w:val="center"/>
       </w:pPr>
       <w:r>
         <w:drawing>
           <wp:inline xmlns:a="http://schemas.openxmlformats.org/drawingml/2006/main" xmlns:pic="http://schemas.openxmlformats.org/drawingml/2006/picture">
-            <wp:extent cx="5760720" cy="4114800"/>
+            <wp:extent cx="5760720" cy="3182112"/>
             <wp:docPr id="14" name="Picture 14"/>
             <wp:cNvGraphicFramePr>
               <a:graphicFrameLocks noChangeAspect="1"/>
@@ -2096,7 +2110,7 @@
                   <pic:spPr>
                     <a:xfrm>
                       <a:off x="0" y="0"/>
-                      <a:ext cx="5760720" cy="4114800"/>
+                      <a:ext cx="5760720" cy="3182112"/>
                     </a:xfrm>
                     <a:prstGeom prst="rect"/>
                   </pic:spPr>
@@ -2122,7 +2136,7 @@
         <w:spacing w:after="140"/>
       </w:pPr>
       <w:r>
-        <w:t>每笔交易关联一件物品和一个指定领取者；发布者由物品确定。取消人必须是双方之一；同一物品最多一笔未取消交易。</w:t>
+        <w:t>每笔交易关联一件物品和一个指定领取者；发布者由物品确定。取消联系可选，取消人必须是双方之一；一件物品可有多次取消历史，但最多一笔未取消交易。</w:t>
       </w:r>
     </w:p>
     <w:p>

</xml_diff>

<commit_message>
docs: deliver verified report and narrated application demo
</commit_message>
<xml_diff>
--- a/docs/delivery/邻里闲置_项目设计说明书.docx
+++ b/docs/delivery/邻里闲置_项目设计说明书.docx
@@ -2,11 +2,6 @@
 <file path=word/document.xml><?xml version="1.0" encoding="utf-8"?>
 <w:document xmlns:wpc="http://schemas.microsoft.com/office/word/2010/wordprocessingCanvas" xmlns:mo="http://schemas.microsoft.com/office/mac/office/2008/main" xmlns:mc="http://schemas.openxmlformats.org/markup-compatibility/2006" xmlns:mv="urn:schemas-microsoft-com:mac:vml" xmlns:o="urn:schemas-microsoft-com:office:office" xmlns:r="http://schemas.openxmlformats.org/officeDocument/2006/relationships" xmlns:m="http://schemas.openxmlformats.org/officeDocument/2006/math" xmlns:v="urn:schemas-microsoft-com:vml" xmlns:wp14="http://schemas.microsoft.com/office/word/2010/wordprocessingDrawing" xmlns:wp="http://schemas.openxmlformats.org/drawingml/2006/wordprocessingDrawing" xmlns:w10="urn:schemas-microsoft-com:office:word" xmlns:w="http://schemas.openxmlformats.org/wordprocessingml/2006/main" xmlns:w14="http://schemas.microsoft.com/office/word/2010/wordml" xmlns:wpg="http://schemas.microsoft.com/office/word/2010/wordprocessingGroup" xmlns:wpi="http://schemas.microsoft.com/office/word/2010/wordprocessingInk" xmlns:wne="http://schemas.microsoft.com/office/word/2006/wordml" xmlns:wps="http://schemas.microsoft.com/office/word/2010/wordprocessingShape" mc:Ignorable="w14 wp14">
   <w:body>
-    <w:p>
-      <w:pPr>
-        <w:spacing w:after="140"/>
-      </w:pPr>
-    </w:p>
     <w:p>
       <w:pPr>
         <w:spacing w:after="140"/>
@@ -37,7 +32,7 @@
         <w:jc w:val="center"/>
       </w:pPr>
       <w:r>
-        <w:t>项目设计说明书</w:t>
+        <w:t>项目设计与实现说明书</w:t>
       </w:r>
     </w:p>
     <w:p>
@@ -48,11 +43,6 @@
       <w:r>
         <w:t>社区闲置物品流转 Web 应用</w:t>
       </w:r>
-    </w:p>
-    <w:p>
-      <w:pPr>
-        <w:spacing w:after="140"/>
-      </w:pPr>
     </w:p>
     <w:tbl>
       <w:tblPr>
@@ -102,7 +92,7 @@
                 <w:b/>
                 <w:sz w:val="20"/>
               </w:rPr>
-              <w:t>说明</w:t>
+              <w:t>交付内容</w:t>
             </w:r>
           </w:p>
         </w:tc>
@@ -124,7 +114,7 @@
                 <w:b w:val="0"/>
                 <w:sz w:val="20"/>
               </w:rPr>
-              <w:t>应用形态</w:t>
+              <w:t>应用</w:t>
             </w:r>
           </w:p>
         </w:tc>
@@ -141,7 +131,7 @@
                 <w:b w:val="0"/>
                 <w:sz w:val="20"/>
               </w:rPr>
-              <w:t>移动端优先、兼容桌面浏览器的 Web 应用</w:t>
+              <w:t>React 网页、Fastify HTTP API、持久 SQLite、服务端 AI 发布辅助</w:t>
             </w:r>
           </w:p>
         </w:tc>
@@ -163,7 +153,7 @@
                 <w:b w:val="0"/>
                 <w:sz w:val="20"/>
               </w:rPr>
-              <w:t>文档内容</w:t>
+              <w:t>运行材料</w:t>
             </w:r>
           </w:p>
         </w:tc>
@@ -180,7 +170,7 @@
                 <w:b w:val="0"/>
                 <w:sz w:val="20"/>
               </w:rPr>
-              <w:t>产品说明、Web 页面截图、技术方案、10 张独立 Chen E-R 图</w:t>
+              <w:t>真实页面截图、10 张 Chen E-R 图、约 5 分钟实际操作与讲解视频</w:t>
             </w:r>
           </w:p>
         </w:tc>
@@ -202,7 +192,7 @@
                 <w:b w:val="0"/>
                 <w:sz w:val="20"/>
               </w:rPr>
-              <w:t>文档阶段</w:t>
+              <w:t>本地验收</w:t>
             </w:r>
           </w:p>
         </w:tc>
@@ -219,7 +209,7 @@
                 <w:b w:val="0"/>
                 <w:sz w:val="20"/>
               </w:rPr>
-              <w:t>设计阶段；应用业务与数据库尚未实现</w:t>
+              <w:t>102 项单元/集成测试、4 项真实 HTTP E2E、5 次真实模型调用</w:t>
             </w:r>
           </w:p>
         </w:tc>
@@ -241,7 +231,7 @@
                 <w:b w:val="0"/>
                 <w:sz w:val="20"/>
               </w:rPr>
-              <w:t>截图类型</w:t>
+              <w:t>证据范围</w:t>
             </w:r>
           </w:p>
         </w:tc>
@@ -258,7 +248,46 @@
                 <w:b w:val="0"/>
                 <w:sz w:val="20"/>
               </w:rPr>
-              <w:t>本地 Web 页面原型截图，使用虚构数据</w:t>
+              <w:t>隔离数据库录屏；既有真实 AI 截图明确标识；数据为虚构演示数据</w:t>
+            </w:r>
+          </w:p>
+        </w:tc>
+      </w:tr>
+      <w:tr>
+        <w:trPr>
+          <w:cantSplit/>
+        </w:trPr>
+        <w:tc>
+          <w:tcPr>
+            <w:tcW w:type="dxa" w:w="2268"/>
+          </w:tcPr>
+          <w:p>
+            <w:pPr>
+              <w:spacing w:after="80" w:before="80"/>
+            </w:pPr>
+            <w:r>
+              <w:rPr>
+                <w:b w:val="0"/>
+                <w:sz w:val="20"/>
+              </w:rPr>
+              <w:t>部署</w:t>
+            </w:r>
+          </w:p>
+        </w:tc>
+        <w:tc>
+          <w:tcPr>
+            <w:tcW w:type="dxa" w:w="7370"/>
+          </w:tcPr>
+          <w:p>
+            <w:pPr>
+              <w:spacing w:after="80" w:before="80"/>
+            </w:pPr>
+            <w:r>
+              <w:rPr>
+                <w:b w:val="0"/>
+                <w:sz w:val="20"/>
+              </w:rPr>
+              <w:t>本地运行已验收；未做远端部署</w:t>
             </w:r>
           </w:p>
         </w:tc>
@@ -297,7 +326,7 @@
                 <w:b w:val="0"/>
                 <w:sz w:val="20"/>
               </w:rPr>
-              <w:t>1.0 / 2026-09-27</w:t>
+              <w:t>2.0 / 2026-09-27</w:t>
             </w:r>
           </w:p>
         </w:tc>
@@ -308,7 +337,7 @@
         <w:spacing w:after="140"/>
       </w:pPr>
       <w:r>
-        <w:t>本报告用于说明产品与数据库设计。实现、真实 LLM 调用、运行测试和部署结果需在开发完成后补充核验；设计图或页面原型不作为全栈验收证据。</w:t>
+        <w:t>应用已实现发布、意向、预约、取消、确认、归档与看板闭环。本报告区分自动化测试、真实模型和材料录制证据；第 5 次模型调用返回随便给，不将其表述为数值报价成功。</w:t>
       </w:r>
     </w:p>
     <w:p>
@@ -321,7 +350,15 @@
         <w:pStyle w:val="Heading1"/>
       </w:pPr>
       <w:r>
-        <w:t>1  项目概述与需求</w:t>
+        <w:t>1  项目背景与使用流程</w:t>
+      </w:r>
+    </w:p>
+    <w:p>
+      <w:pPr>
+        <w:spacing w:after="140"/>
+      </w:pPr>
+      <w:r>
+        <w:t>小区群里的闲置容易被新消息淹没，领取者难以判断是否还能领，双方需要反复沟通时间地点。邻里闲置通过物品卡片、明确状态和预约交接，让同一社区的邻居完成线下流转。</w:t>
       </w:r>
     </w:p>
     <w:p>
@@ -329,7 +366,7 @@
         <w:pStyle w:val="Heading2"/>
       </w:pPr>
       <w:r>
-        <w:t>1.1 场景与目标</w:t>
+        <w:t>1.1 范围与角色</w:t>
       </w:r>
     </w:p>
     <w:p>
@@ -337,39 +374,7 @@
         <w:spacing w:after="140"/>
       </w:pPr>
       <w:r>
-        <w:t>小区群里的闲置物品容易被新消息淹没；领取者难以判断物品是否还在，双方又需要反复私聊约时间和地点。邻里闲置面向同一个小区、楼栋或办公室，以物品卡片、明确状态和预约交接减少这些沟通成本。</w:t>
-      </w:r>
-    </w:p>
-    <w:p>
-      <w:pPr>
-        <w:spacing w:after="140"/>
-      </w:pPr>
-      <w:r>
-        <w:t>本次以单一预置社区为范围，采用虚构演示身份和预置图片，优先完成一条可验证的线下交易闭环。</w:t>
-      </w:r>
-    </w:p>
-    <w:p>
-      <w:pPr>
-        <w:pStyle w:val="Heading2"/>
-      </w:pPr>
-      <w:r>
-        <w:t>1.2 主要用户与流程</w:t>
-      </w:r>
-    </w:p>
-    <w:p>
-      <w:pPr>
-        <w:spacing w:after="140"/>
-      </w:pPr>
-      <w:r>
-        <w:t>发布者与领取者都是社区用户，同一用户可在不同物品下承担不同角色。访客可以浏览；写操作由服务端校验身份和权限。</w:t>
-      </w:r>
-    </w:p>
-    <w:p>
-      <w:pPr>
-        <w:spacing w:after="140"/>
-      </w:pPr>
-      <w:r>
-        <w:t>发布物品 → 浏览与搜索 → 表达想要 → 发布者选人并预约 → 领取者确认 → 线下交接 → 发布者确认送出 → 归档与统计更新。</w:t>
+        <w:t>采用单一演示社区和预置虚构身份。访客可浏览；用户可发布、留言或领取别人的物品。发布者和领取者是同一用户实体在不同交易中的角色。物品图使用 30 张 AI 生成的演示图片，页面明确标注，不能当作真实二手物品照片。</w:t>
       </w:r>
     </w:p>
     <w:tbl>
@@ -420,7 +425,7 @@
                 <w:b/>
                 <w:sz w:val="20"/>
               </w:rPr>
-              <w:t>设计说明</w:t>
+              <w:t>实现行为</w:t>
             </w:r>
           </w:p>
         </w:tc>
@@ -442,7 +447,7 @@
                 <w:b w:val="0"/>
                 <w:sz w:val="20"/>
               </w:rPr>
-              <w:t>物品发布</w:t>
+              <w:t>发现与发布</w:t>
             </w:r>
           </w:p>
         </w:tc>
@@ -459,7 +464,7 @@
                 <w:b w:val="0"/>
                 <w:sz w:val="20"/>
               </w:rPr>
-              <w:t>名称、描述、交易方式、预置图片与自提楼栋；支持免费送、随便给、标价。</w:t>
+              <w:t>关键词与交易方式组合筛选；免费送、随便给、标价；预置图片和自提楼栋</w:t>
             </w:r>
           </w:p>
         </w:tc>
@@ -481,7 +486,7 @@
                 <w:b w:val="0"/>
                 <w:sz w:val="20"/>
               </w:rPr>
-              <w:t>发现与检索</w:t>
+              <w:t>意向与留言</w:t>
             </w:r>
           </w:p>
         </w:tc>
@@ -498,7 +503,7 @@
                 <w:b w:val="0"/>
                 <w:sz w:val="20"/>
               </w:rPr>
-              <w:t>卡片按发布时间倒序；支持关键词搜索和交易方式筛选；显示新鲜度。</w:t>
+              <w:t>表达想要、撤回和重新激活；公开留言；名单仅物主可读</w:t>
             </w:r>
           </w:p>
         </w:tc>
@@ -520,7 +525,7 @@
                 <w:b w:val="0"/>
                 <w:sz w:val="20"/>
               </w:rPr>
-              <w:t>意向与交接</w:t>
+              <w:t>预约交接</w:t>
             </w:r>
           </w:p>
         </w:tc>
@@ -537,7 +542,7 @@
                 <w:b w:val="0"/>
                 <w:sz w:val="20"/>
               </w:rPr>
-              <w:t>想要、撤回、查看意向人；约定未来 7 天内的时间和公共地点；确认、取消与完成。</w:t>
+              <w:t>物主选择意向人，约定未来 7 天内的时间和公共地点；双方确认或取消</w:t>
             </w:r>
           </w:p>
         </w:tc>
@@ -559,7 +564,7 @@
                 <w:b w:val="0"/>
                 <w:sz w:val="20"/>
               </w:rPr>
-              <w:t>留言与归档</w:t>
+              <w:t>完成归档</w:t>
             </w:r>
           </w:p>
         </w:tc>
@@ -576,7 +581,7 @@
                 <w:b w:val="0"/>
                 <w:sz w:val="20"/>
               </w:rPr>
-              <w:t>公开问答减少重复私聊；已送出保留记录并禁止写操作。</w:t>
+              <w:t>物主二次确认后归档；详情留言保留，禁止新写入；统计同步更新</w:t>
             </w:r>
           </w:p>
         </w:tc>
@@ -598,7 +603,7 @@
                 <w:b w:val="0"/>
                 <w:sz w:val="20"/>
               </w:rPr>
-              <w:t>社区看板</w:t>
+              <w:t>AI 辅助</w:t>
             </w:r>
           </w:p>
         </w:tc>
@@ -615,46 +620,7 @@
                 <w:b w:val="0"/>
                 <w:sz w:val="20"/>
               </w:rPr>
-              <w:t>本月发布、本月成交、当前在售、最快领走和最想要物品。</w:t>
-            </w:r>
-          </w:p>
-        </w:tc>
-      </w:tr>
-      <w:tr>
-        <w:trPr>
-          <w:cantSplit/>
-        </w:trPr>
-        <w:tc>
-          <w:tcPr>
-            <w:tcW w:type="dxa" w:w="2268"/>
-          </w:tcPr>
-          <w:p>
-            <w:pPr>
-              <w:spacing w:after="80" w:before="80"/>
-            </w:pPr>
-            <w:r>
-              <w:rPr>
-                <w:b w:val="0"/>
-                <w:sz w:val="20"/>
-              </w:rPr>
-              <w:t>LLM 辅助</w:t>
-            </w:r>
-          </w:p>
-        </w:tc>
-        <w:tc>
-          <w:tcPr>
-            <w:tcW w:type="dxa" w:w="7370"/>
-          </w:tcPr>
-          <w:p>
-            <w:pPr>
-              <w:spacing w:after="80" w:before="80"/>
-            </w:pPr>
-            <w:r>
-              <w:rPr>
-                <w:b w:val="0"/>
-                <w:sz w:val="20"/>
-              </w:rPr>
-              <w:t>根据已知事实整理文案和给出参考价；用户选择采用，失败时仍能手动发布。</w:t>
+              <w:t>服务端调用真实模型；严格结构校验；用户主动采用、手动发布；失败保留草稿</w:t>
             </w:r>
           </w:p>
         </w:tc>
@@ -665,7 +631,7 @@
         <w:pStyle w:val="Heading2"/>
       </w:pPr>
       <w:r>
-        <w:t>1.3 取舍与交付</w:t>
+        <w:t>1.2 典型路径</w:t>
       </w:r>
     </w:p>
     <w:p>
@@ -673,7 +639,15 @@
         <w:spacing w:after="140"/>
       </w:pPr>
       <w:r>
-        <w:t>不纳入本次基线：支付、快递、即时私聊、信用体系、多社区、真实注册和图片上传。考试交付包括本地可运行全栈应用、5 分钟视频、数据库 E-R 图及技术栈简介；远端部署为可选项。</w:t>
+        <w:t>发布者发布 → 领取者想要和留言 → 物主发起预约 → 领取者确认 → 线下交接 → 物主确认完成 → 归档并更新看板。时间不合适时可取消，再建立新预约；历史取消记录保留。</w:t>
+      </w:r>
+    </w:p>
+    <w:p>
+      <w:pPr>
+        <w:spacing w:after="140"/>
+      </w:pPr>
+      <w:r>
+        <w:t>本项目不包含在线支付、快递、即时私聊、真实注册、多社区或用户上传照片。演示身份不能作为生产认证。物理交接由双方线下完成；录屏演示的是软件确认流程。</w:t>
       </w:r>
     </w:p>
     <w:p>
@@ -686,7 +660,7 @@
         <w:pStyle w:val="Heading1"/>
       </w:pPr>
       <w:r>
-        <w:t>2  技术架构与系统规则</w:t>
+        <w:t>2  技术架构与核心实现</w:t>
       </w:r>
     </w:p>
     <w:tbl>
@@ -795,7 +769,7 @@
                 <w:b w:val="0"/>
                 <w:sz w:val="20"/>
               </w:rPr>
-              <w:t>React + TypeScript + Vite</w:t>
+              <w:t>React / TypeScript / Vite</w:t>
             </w:r>
           </w:p>
         </w:tc>
@@ -812,7 +786,7 @@
                 <w:b w:val="0"/>
                 <w:sz w:val="20"/>
               </w:rPr>
-              <w:t>页面、表单、状态反馈与 API 调用</w:t>
+              <w:t>页面、表单、身份状态、API adapter 和错误反馈</w:t>
             </w:r>
           </w:p>
         </w:tc>
@@ -834,7 +808,7 @@
                 <w:b w:val="0"/>
                 <w:sz w:val="20"/>
               </w:rPr>
-              <w:t>后端</w:t>
+              <w:t>API</w:t>
             </w:r>
           </w:p>
         </w:tc>
@@ -851,7 +825,7 @@
                 <w:b w:val="0"/>
                 <w:sz w:val="20"/>
               </w:rPr>
-              <w:t>Node.js + Fastify</w:t>
+              <w:t>Node.js 24 / Fastify</w:t>
             </w:r>
           </w:p>
         </w:tc>
@@ -868,7 +842,7 @@
                 <w:b w:val="0"/>
                 <w:sz w:val="20"/>
               </w:rPr>
-              <w:t>身份、权限、参数校验、业务事务与 LLM 接入</w:t>
+              <w:t>23 个契约操作、会话、权限、参数校验和业务事务</w:t>
             </w:r>
           </w:p>
         </w:tc>
@@ -890,7 +864,7 @@
                 <w:b w:val="0"/>
                 <w:sz w:val="20"/>
               </w:rPr>
-              <w:t>数据库</w:t>
+              <w:t>数据</w:t>
             </w:r>
           </w:p>
         </w:tc>
@@ -907,7 +881,7 @@
                 <w:b w:val="0"/>
                 <w:sz w:val="20"/>
               </w:rPr>
-              <w:t>SQLite + Drizzle</w:t>
+              <w:t>SQLite / Drizzle</w:t>
             </w:r>
           </w:p>
         </w:tc>
@@ -924,7 +898,7 @@
                 <w:b w:val="0"/>
                 <w:sz w:val="20"/>
               </w:rPr>
-              <w:t>物品、意向、留言、交易和会话的持久化</w:t>
+              <w:t>6 张表、9 个外键、版本迁移、CHECK 和唯一索引</w:t>
             </w:r>
           </w:p>
         </w:tc>
@@ -946,7 +920,7 @@
                 <w:b w:val="0"/>
                 <w:sz w:val="20"/>
               </w:rPr>
-              <w:t>接口契约</w:t>
+              <w:t>契约</w:t>
             </w:r>
           </w:p>
         </w:tc>
@@ -963,7 +937,7 @@
                 <w:b w:val="0"/>
                 <w:sz w:val="20"/>
               </w:rPr>
-              <w:t>OpenAPI 3.1 + 共享 Schema</w:t>
+              <w:t>OpenAPI 3.1 / Zod</w:t>
             </w:r>
           </w:p>
         </w:tc>
@@ -980,7 +954,63 @@
                 <w:b w:val="0"/>
                 <w:sz w:val="20"/>
               </w:rPr>
-              <w:t>固定输入、输出与错误结构</w:t>
+              <w:t>统一输入输出与错误结构；运行时校验</w:t>
+            </w:r>
+          </w:p>
+        </w:tc>
+      </w:tr>
+      <w:tr>
+        <w:trPr>
+          <w:cantSplit/>
+        </w:trPr>
+        <w:tc>
+          <w:tcPr>
+            <w:tcW w:type="dxa" w:w="1701"/>
+          </w:tcPr>
+          <w:p>
+            <w:pPr>
+              <w:spacing w:after="80" w:before="80"/>
+            </w:pPr>
+            <w:r>
+              <w:rPr>
+                <w:b w:val="0"/>
+                <w:sz w:val="20"/>
+              </w:rPr>
+              <w:t>AI</w:t>
+            </w:r>
+          </w:p>
+        </w:tc>
+        <w:tc>
+          <w:tcPr>
+            <w:tcW w:type="dxa" w:w="2835"/>
+          </w:tcPr>
+          <w:p>
+            <w:pPr>
+              <w:spacing w:after="80" w:before="80"/>
+            </w:pPr>
+            <w:r>
+              <w:rPr>
+                <w:b w:val="0"/>
+                <w:sz w:val="20"/>
+              </w:rPr>
+              <w:t>服务端 Chat Completions</w:t>
+            </w:r>
+          </w:p>
+        </w:tc>
+        <w:tc>
+          <w:tcPr>
+            <w:tcW w:type="dxa" w:w="5102"/>
+          </w:tcPr>
+          <w:p>
+            <w:pPr>
+              <w:spacing w:after="80" w:before="80"/>
+            </w:pPr>
+            <w:r>
+              <w:rPr>
+                <w:b w:val="0"/>
+                <w:sz w:val="20"/>
+              </w:rPr>
+              <w:t>DeepSeek 发布辅助、超时、限流、输出校验与安全降级</w:t>
             </w:r>
           </w:p>
         </w:tc>
@@ -1019,7 +1049,7 @@
                 <w:b w:val="0"/>
                 <w:sz w:val="20"/>
               </w:rPr>
-              <w:t>Vitest + API 测试 + Playwright</w:t>
+              <w:t>Vitest / Playwright / CI</w:t>
             </w:r>
           </w:p>
         </w:tc>
@@ -1036,7 +1066,7 @@
                 <w:b w:val="0"/>
                 <w:sz w:val="20"/>
               </w:rPr>
-              <w:t>业务规则、权限、并发与双会话端到端验收</w:t>
+              <w:t>临时数据库、真实 HTTP、多身份浏览器和构建检查</w:t>
             </w:r>
           </w:p>
         </w:tc>
@@ -1047,7 +1077,7 @@
         <w:spacing w:after="140"/>
       </w:pPr>
       <w:r>
-        <w:t>浏览器通过同源 /api/v1 访问后端；后端访问 SQLite 并调用模型服务。密钥只放在服务端环境变量中。前端、API 与数据库保持明确边界。工程骨架与共享接口契约已建立，具体业务仍在开发中。</w:t>
+        <w:t>浏览器经同源 /api/v1 访问后端；后端操作 SQLite 并调用模型服务。生产构建由 Fastify 托管前端，支持页面深链接。密钥只保存在服务端环境，浏览器不接收密钥。数据库记录会话令牌的哈希，Cookie 使用 HttpOnly。</w:t>
       </w:r>
     </w:p>
     <w:p>
@@ -1055,7 +1085,7 @@
         <w:pStyle w:val="Heading2"/>
       </w:pPr>
       <w:r>
-        <w:t>2.1 状态与一致性</w:t>
+        <w:t>2.1 事务与幂等</w:t>
       </w:r>
     </w:p>
     <w:p>
@@ -1063,7 +1093,15 @@
         <w:spacing w:after="140"/>
       </w:pPr>
       <w:r>
-        <w:t>物品：可领取 → 已预约 → 已送出；取消预约后恢复可领取。交易：待确认 → 已确认 → 已完成；待确认或已确认的交易允许双方取消。物主不能领取自己的物品，只有指定领取者能确认预约，只有物主能确认送出。</w:t>
+        <w:t>物品状态为可领取、已预约、已送出；交易为待确认、已确认、已完成、已取消。创建预约、取消和完成在同一事务内检查状态并更新。唯一部分索引限制每件物品最多一笔未取消交易；重复完成不重复成交，旧取消请求不影响新预约。</w:t>
+      </w:r>
+    </w:p>
+    <w:p>
+      <w:pPr>
+        <w:pStyle w:val="Heading2"/>
+      </w:pPr>
+      <w:r>
+        <w:t>2.2 统计与性能</w:t>
       </w:r>
     </w:p>
     <w:p>
@@ -1071,39 +1109,7 @@
         <w:spacing w:after="140"/>
       </w:pPr>
       <w:r>
-        <w:t>预约创建、取消和完成在事务内校验状态并更新数据。部分唯一索引保证同一物品最多一笔未取消交易；重复确认或完成不会重复成交。交易细节只对双方开放。</w:t>
-      </w:r>
-    </w:p>
-    <w:p>
-      <w:pPr>
-        <w:pStyle w:val="Heading2"/>
-      </w:pPr>
-      <w:r>
-        <w:t>2.2 时间、价格与统计</w:t>
-      </w:r>
-    </w:p>
-    <w:p>
-      <w:pPr>
-        <w:spacing w:after="140"/>
-      </w:pPr>
-      <w:r>
-        <w:t>不足 24 小时为“刚上架”；24 至不足 72 小时为“新上架”；之后按经过整天数展示。金额以整数分保存。月统计按北京时间计算，成交仅统计已完成交易，当前在售含可领取和已预约。</w:t>
-      </w:r>
-    </w:p>
-    <w:p>
-      <w:pPr>
-        <w:pStyle w:val="Heading2"/>
-      </w:pPr>
-      <w:r>
-        <w:t>2.3 模型能力的边界</w:t>
-      </w:r>
-    </w:p>
-    <w:p>
-      <w:pPr>
-        <w:spacing w:after="140"/>
-      </w:pPr>
-      <w:r>
-        <w:t>AI 只根据输入事实优化描述，不擅自补造品牌、成色或故障状况。参考价注明不是行情估价；响应需结构校验，超时或无配置时保留用户输入。最终验收须单独记录一次真实模型调用。</w:t>
+        <w:t>金额保存整数分；时间以 UTC 毫秒存储，本月看板按北京时间统计。当前在售包含可领取和已预约。后端隔离性能复核在 1,000 件物品、5 并发、100 次读取下测得 p95 13.75ms；这是本机样本，不是线上容量保证。</w:t>
       </w:r>
     </w:p>
     <w:p>
@@ -1116,15 +1122,7 @@
         <w:pStyle w:val="Heading1"/>
       </w:pPr>
       <w:r>
-        <w:t>3.1  Web 页面：社区首页</w:t>
-      </w:r>
-    </w:p>
-    <w:p>
-      <w:pPr>
-        <w:spacing w:after="140"/>
-      </w:pPr>
-      <w:r>
-        <w:t>截图来源：本地浏览器打开项目 Web 原型后实拍。页面中的数据与 AI 建议为示例；此原型用于说明交互设计，未连接后端、数据库或真实模型。</w:t>
+        <w:t>3.1  真实运行：社区首页与数据库看板</w:t>
       </w:r>
     </w:p>
     <w:p>
@@ -1136,7 +1134,7 @@
       <w:r>
         <w:drawing>
           <wp:inline xmlns:a="http://schemas.openxmlformats.org/drawingml/2006/main" xmlns:pic="http://schemas.openxmlformats.org/drawingml/2006/picture">
-            <wp:extent cx="5760720" cy="3840480"/>
+            <wp:extent cx="5943600" cy="3343275"/>
             <wp:docPr id="1" name="Picture 1"/>
             <wp:cNvGraphicFramePr>
               <a:graphicFrameLocks noChangeAspect="1"/>
@@ -1157,7 +1155,7 @@
                   <pic:spPr>
                     <a:xfrm>
                       <a:off x="0" y="0"/>
-                      <a:ext cx="5760720" cy="3840480"/>
+                      <a:ext cx="5943600" cy="3343275"/>
                     </a:xfrm>
                     <a:prstGeom prst="rect"/>
                   </pic:spPr>
@@ -1175,15 +1173,7 @@
         <w:jc w:val="center"/>
       </w:pPr>
       <w:r>
-        <w:t>图 3-1  社区首页（Web 原型截图）</w:t>
-      </w:r>
-    </w:p>
-    <w:p>
-      <w:pPr>
-        <w:pStyle w:val="Heading2"/>
-      </w:pPr>
-      <w:r>
-        <w:t>页面说明</w:t>
+        <w:t>图 3-1  社区首页与数据库看板</w:t>
       </w:r>
     </w:p>
     <w:p>
@@ -1191,7 +1181,7 @@
         <w:spacing w:after="140"/>
       </w:pPr>
       <w:r>
-        <w:t>卡片突出物品、新鲜度、价格和所在楼栋。搜索和交易方式筛选支持组合使用；顶部统计与底部热门信息为原型示例。</w:t>
+        <w:t>真实 HTTP 读取物品和统计；当前在售包含可领取与已预约。</w:t>
       </w:r>
     </w:p>
     <w:p>
@@ -1199,7 +1189,7 @@
         <w:spacing w:after="140"/>
       </w:pPr>
       <w:r>
-        <w:t>采集条件：1440 × 960 浏览器视口；对应原型页面：home。</w:t>
+        <w:t>来源：3130 隔离 SQLite / 真实 HTTP 浏览器。采集：1280 × 720；页面：/。</w:t>
       </w:r>
     </w:p>
     <w:p>
@@ -1212,15 +1202,7 @@
         <w:pStyle w:val="Heading1"/>
       </w:pPr>
       <w:r>
-        <w:t>3.2  Web 页面：物品详情与公开留言</w:t>
-      </w:r>
-    </w:p>
-    <w:p>
-      <w:pPr>
-        <w:spacing w:after="140"/>
-      </w:pPr>
-      <w:r>
-        <w:t>截图来源：本地浏览器打开项目 Web 原型后实拍。页面中的数据与 AI 建议为示例；此原型用于说明交互设计，未连接后端、数据库或真实模型。</w:t>
+        <w:t>3.2  真实运行：物品发布</w:t>
       </w:r>
     </w:p>
     <w:p>
@@ -1232,7 +1214,7 @@
       <w:r>
         <w:drawing>
           <wp:inline xmlns:a="http://schemas.openxmlformats.org/drawingml/2006/main" xmlns:pic="http://schemas.openxmlformats.org/drawingml/2006/picture">
-            <wp:extent cx="5760720" cy="3840480"/>
+            <wp:extent cx="5943600" cy="3343275"/>
             <wp:docPr id="2" name="Picture 2"/>
             <wp:cNvGraphicFramePr>
               <a:graphicFrameLocks noChangeAspect="1"/>
@@ -1241,7 +1223,7 @@
               <a:graphicData uri="http://schemas.openxmlformats.org/drawingml/2006/picture">
                 <pic:pic>
                   <pic:nvPicPr>
-                    <pic:cNvPr id="0" name="detail-desktop.png"/>
+                    <pic:cNvPr id="0" name="publish-desktop.png"/>
                     <pic:cNvPicPr/>
                   </pic:nvPicPr>
                   <pic:blipFill>
@@ -1253,7 +1235,7 @@
                   <pic:spPr>
                     <a:xfrm>
                       <a:off x="0" y="0"/>
-                      <a:ext cx="5760720" cy="3840480"/>
+                      <a:ext cx="5943600" cy="3343275"/>
                     </a:xfrm>
                     <a:prstGeom prst="rect"/>
                   </pic:spPr>
@@ -1271,15 +1253,7 @@
         <w:jc w:val="center"/>
       </w:pPr>
       <w:r>
-        <w:t>图 3-2  物品详情与公开留言（Web 原型截图）</w:t>
-      </w:r>
-    </w:p>
-    <w:p>
-      <w:pPr>
-        <w:pStyle w:val="Heading2"/>
-      </w:pPr>
-      <w:r>
-        <w:t>页面说明</w:t>
+        <w:t>图 3-2  物品发布</w:t>
       </w:r>
     </w:p>
     <w:p>
@@ -1287,7 +1261,7 @@
         <w:spacing w:after="140"/>
       </w:pPr>
       <w:r>
-        <w:t>物品详情集中展示描述、发布者、自提方式和当前状态。用户可表达或撤回想要，公开留言可减少重复私聊。页面交互仅模拟前端状态。</w:t>
+        <w:t>真实发布表单；演示本次手动发布，未调用模型。</w:t>
       </w:r>
     </w:p>
     <w:p>
@@ -1295,7 +1269,7 @@
         <w:spacing w:after="140"/>
       </w:pPr>
       <w:r>
-        <w:t>采集条件：1440 × 960 浏览器视口；对应原型页面：detail。</w:t>
+        <w:t>来源：3130 隔离 SQLite / 真实 HTTP 浏览器。采集：1280 × 720；页面：/publish。</w:t>
       </w:r>
     </w:p>
     <w:p>
@@ -1308,15 +1282,7 @@
         <w:pStyle w:val="Heading1"/>
       </w:pPr>
       <w:r>
-        <w:t>3.3  Web 页面：物品发布与 AI 辅助</w:t>
-      </w:r>
-    </w:p>
-    <w:p>
-      <w:pPr>
-        <w:spacing w:after="140"/>
-      </w:pPr>
-      <w:r>
-        <w:t>截图来源：本地浏览器打开项目 Web 原型后实拍。页面中的数据与 AI 建议为示例；此原型用于说明交互设计，未连接后端、数据库或真实模型。</w:t>
+        <w:t>3.3  真实运行：物品详情</w:t>
       </w:r>
     </w:p>
     <w:p>
@@ -1328,7 +1294,7 @@
       <w:r>
         <w:drawing>
           <wp:inline xmlns:a="http://schemas.openxmlformats.org/drawingml/2006/main" xmlns:pic="http://schemas.openxmlformats.org/drawingml/2006/picture">
-            <wp:extent cx="5760720" cy="4064508"/>
+            <wp:extent cx="5943600" cy="3343275"/>
             <wp:docPr id="3" name="Picture 3"/>
             <wp:cNvGraphicFramePr>
               <a:graphicFrameLocks noChangeAspect="1"/>
@@ -1337,7 +1303,7 @@
               <a:graphicData uri="http://schemas.openxmlformats.org/drawingml/2006/picture">
                 <pic:pic>
                   <pic:nvPicPr>
-                    <pic:cNvPr id="0" name="publish-desktop.png"/>
+                    <pic:cNvPr id="0" name="detail-desktop.png"/>
                     <pic:cNvPicPr/>
                   </pic:nvPicPr>
                   <pic:blipFill>
@@ -1349,7 +1315,7 @@
                   <pic:spPr>
                     <a:xfrm>
                       <a:off x="0" y="0"/>
-                      <a:ext cx="5760720" cy="4064508"/>
+                      <a:ext cx="5943600" cy="3343275"/>
                     </a:xfrm>
                     <a:prstGeom prst="rect"/>
                   </pic:spPr>
@@ -1367,15 +1333,7 @@
         <w:jc w:val="center"/>
       </w:pPr>
       <w:r>
-        <w:t>图 3-3  物品发布与 AI 辅助（Web 原型截图）</w:t>
-      </w:r>
-    </w:p>
-    <w:p>
-      <w:pPr>
-        <w:pStyle w:val="Heading2"/>
-      </w:pPr>
-      <w:r>
-        <w:t>页面说明</w:t>
+        <w:t>图 3-3  物品详情</w:t>
       </w:r>
     </w:p>
     <w:p>
@@ -1383,7 +1341,7 @@
         <w:spacing w:after="140"/>
       </w:pPr>
       <w:r>
-        <w:t>左侧填写事实信息，右侧展示固定 AI 建议示例。文案与参考价格分别采用，用户仍可修改；本页没有发出真实模型请求，也不保存业务数据。</w:t>
+        <w:t>物品已真实保存；图片、描述、发布者与物品状态来自 HTTP API。</w:t>
       </w:r>
     </w:p>
     <w:p>
@@ -1391,7 +1349,7 @@
         <w:spacing w:after="140"/>
       </w:pPr>
       <w:r>
-        <w:t>采集条件：1440 × 960 浏览器视口；对应原型页面：publish。</w:t>
+        <w:t>来源：3130 隔离 SQLite / 真实 HTTP 浏览器。采集：1280 × 720；页面：/items/416a9ea7-9ac6-4c08-99fb-56ca22f80430。</w:t>
       </w:r>
     </w:p>
     <w:p>
@@ -1404,15 +1362,7 @@
         <w:pStyle w:val="Heading1"/>
       </w:pPr>
       <w:r>
-        <w:t>3.4  Web 页面：预约交接与完成</w:t>
-      </w:r>
-    </w:p>
-    <w:p>
-      <w:pPr>
-        <w:spacing w:after="140"/>
-      </w:pPr>
-      <w:r>
-        <w:t>截图来源：本地浏览器打开项目 Web 原型后实拍。页面中的数据与 AI 建议为示例；此原型用于说明交互设计，未连接后端、数据库或真实模型。</w:t>
+        <w:t>3.4  真实运行：预约与双方交接信息</w:t>
       </w:r>
     </w:p>
     <w:p>
@@ -1424,7 +1374,7 @@
       <w:r>
         <w:drawing>
           <wp:inline xmlns:a="http://schemas.openxmlformats.org/drawingml/2006/main" xmlns:pic="http://schemas.openxmlformats.org/drawingml/2006/picture">
-            <wp:extent cx="5760720" cy="3840480"/>
+            <wp:extent cx="5731266" cy="5852160"/>
             <wp:docPr id="4" name="Picture 4"/>
             <wp:cNvGraphicFramePr>
               <a:graphicFrameLocks noChangeAspect="1"/>
@@ -1433,7 +1383,7 @@
               <a:graphicData uri="http://schemas.openxmlformats.org/drawingml/2006/picture">
                 <pic:pic>
                   <pic:nvPicPr>
-                    <pic:cNvPr id="0" name="handoff-desktop.png"/>
+                    <pic:cNvPr id="0" name="reservation-desktop.png"/>
                     <pic:cNvPicPr/>
                   </pic:nvPicPr>
                   <pic:blipFill>
@@ -1445,7 +1395,7 @@
                   <pic:spPr>
                     <a:xfrm>
                       <a:off x="0" y="0"/>
-                      <a:ext cx="5760720" cy="3840480"/>
+                      <a:ext cx="5731266" cy="5852160"/>
                     </a:xfrm>
                     <a:prstGeom prst="rect"/>
                   </pic:spPr>
@@ -1463,15 +1413,7 @@
         <w:jc w:val="center"/>
       </w:pPr>
       <w:r>
-        <w:t>图 3-4  预约交接与完成（Web 原型截图）</w:t>
-      </w:r>
-    </w:p>
-    <w:p>
-      <w:pPr>
-        <w:pStyle w:val="Heading2"/>
-      </w:pPr>
-      <w:r>
-        <w:t>页面说明</w:t>
+        <w:t>图 3-4  预约与双方交接信息</w:t>
       </w:r>
     </w:p>
     <w:p>
@@ -1479,7 +1421,7 @@
         <w:spacing w:after="140"/>
       </w:pPr>
       <w:r>
-        <w:t>发布者查看领取人、时间、公共交接地点和确认进度。页面可演示取消、完成二次确认和状态反馈；这些操作未写入后端。</w:t>
+        <w:t>发布者选择意向用户和公共地点；真实预约状态为待确认。</w:t>
       </w:r>
     </w:p>
     <w:p>
@@ -1487,7 +1429,247 @@
         <w:spacing w:after="140"/>
       </w:pPr>
       <w:r>
-        <w:t>采集条件：1440 × 960 浏览器视口；对应原型页面：handoff。</w:t>
+        <w:t>来源：3130 隔离 SQLite / 真实 HTTP 浏览器。采集：1280 × 720；页面：/items/416a9ea7-9ac6-4c08-99fb-56ca22f80430。</w:t>
+      </w:r>
+    </w:p>
+    <w:p>
+      <w:r>
+        <w:br w:type="page"/>
+      </w:r>
+    </w:p>
+    <w:p>
+      <w:pPr>
+        <w:pStyle w:val="Heading1"/>
+      </w:pPr>
+      <w:r>
+        <w:t>3.5  真实运行：已送出归档</w:t>
+      </w:r>
+    </w:p>
+    <w:p>
+      <w:pPr>
+        <w:keepNext/>
+        <w:spacing w:after="40"/>
+        <w:jc w:val="center"/>
+      </w:pPr>
+      <w:r>
+        <w:drawing>
+          <wp:inline xmlns:a="http://schemas.openxmlformats.org/drawingml/2006/main" xmlns:pic="http://schemas.openxmlformats.org/drawingml/2006/picture">
+            <wp:extent cx="5943600" cy="4471630"/>
+            <wp:docPr id="5" name="Picture 5"/>
+            <wp:cNvGraphicFramePr>
+              <a:graphicFrameLocks noChangeAspect="1"/>
+            </wp:cNvGraphicFramePr>
+            <a:graphic>
+              <a:graphicData uri="http://schemas.openxmlformats.org/drawingml/2006/picture">
+                <pic:pic>
+                  <pic:nvPicPr>
+                    <pic:cNvPr id="0" name="archive-desktop.png"/>
+                    <pic:cNvPicPr/>
+                  </pic:nvPicPr>
+                  <pic:blipFill>
+                    <a:blip r:embed="rId15"/>
+                    <a:stretch>
+                      <a:fillRect/>
+                    </a:stretch>
+                  </pic:blipFill>
+                  <pic:spPr>
+                    <a:xfrm>
+                      <a:off x="0" y="0"/>
+                      <a:ext cx="5943600" cy="4471630"/>
+                    </a:xfrm>
+                    <a:prstGeom prst="rect"/>
+                  </pic:spPr>
+                </pic:pic>
+              </a:graphicData>
+            </a:graphic>
+          </wp:inline>
+        </w:drawing>
+      </w:r>
+    </w:p>
+    <w:p>
+      <w:pPr>
+        <w:pStyle w:val="Caption"/>
+        <w:spacing w:after="140"/>
+        <w:jc w:val="center"/>
+      </w:pPr>
+      <w:r>
+        <w:t>图 3-5  已送出归档</w:t>
+      </w:r>
+    </w:p>
+    <w:p>
+      <w:pPr>
+        <w:spacing w:after="140"/>
+      </w:pPr>
+      <w:r>
+        <w:t>本次演示交易已完成并归档；历史详情与留言保留，写操作关闭。</w:t>
+      </w:r>
+    </w:p>
+    <w:p>
+      <w:pPr>
+        <w:spacing w:after="140"/>
+      </w:pPr>
+      <w:r>
+        <w:t>来源：3130 隔离 SQLite / 真实 HTTP 浏览器。采集：1280 × 720；页面：/items/416a9ea7-9ac6-4c08-99fb-56ca22f80430。</w:t>
+      </w:r>
+    </w:p>
+    <w:p>
+      <w:r>
+        <w:br w:type="page"/>
+      </w:r>
+    </w:p>
+    <w:p>
+      <w:pPr>
+        <w:pStyle w:val="Heading1"/>
+      </w:pPr>
+      <w:r>
+        <w:t>3.6  真实运行：真实 AI 建议预览（既有验收截图）</w:t>
+      </w:r>
+    </w:p>
+    <w:p>
+      <w:pPr>
+        <w:keepNext/>
+        <w:spacing w:after="40"/>
+        <w:jc w:val="center"/>
+      </w:pPr>
+      <w:r>
+        <w:drawing>
+          <wp:inline xmlns:a="http://schemas.openxmlformats.org/drawingml/2006/main" xmlns:pic="http://schemas.openxmlformats.org/drawingml/2006/picture">
+            <wp:extent cx="5938767" cy="5852160"/>
+            <wp:docPr id="6" name="Picture 6"/>
+            <wp:cNvGraphicFramePr>
+              <a:graphicFrameLocks noChangeAspect="1"/>
+            </wp:cNvGraphicFramePr>
+            <a:graphic>
+              <a:graphicData uri="http://schemas.openxmlformats.org/drawingml/2006/picture">
+                <pic:pic>
+                  <pic:nvPicPr>
+                    <pic:cNvPr id="0" name="ai-preview.png"/>
+                    <pic:cNvPicPr/>
+                  </pic:nvPicPr>
+                  <pic:blipFill>
+                    <a:blip r:embed="rId16"/>
+                    <a:stretch>
+                      <a:fillRect/>
+                    </a:stretch>
+                  </pic:blipFill>
+                  <pic:spPr>
+                    <a:xfrm>
+                      <a:off x="0" y="0"/>
+                      <a:ext cx="5938767" cy="5852160"/>
+                    </a:xfrm>
+                    <a:prstGeom prst="rect"/>
+                  </pic:spPr>
+                </pic:pic>
+              </a:graphicData>
+            </a:graphic>
+          </wp:inline>
+        </w:drawing>
+      </w:r>
+    </w:p>
+    <w:p>
+      <w:pPr>
+        <w:pStyle w:val="Caption"/>
+        <w:spacing w:after="140"/>
+        <w:jc w:val="center"/>
+      </w:pPr>
+      <w:r>
+        <w:t>图 3-6  真实 AI 建议预览（既有验收截图）</w:t>
+      </w:r>
+    </w:p>
+    <w:p>
+      <w:pPr>
+        <w:spacing w:after="140"/>
+      </w:pPr>
+      <w:r>
+        <w:t>协调者在真实 3000 环境进行第 5 次 DeepSeek 调用：FLEXIBLE/null。核验文案事实后采用并手动发布；本次材料录制没有新增调用，也不声称本次获得数值报价。</w:t>
+      </w:r>
+    </w:p>
+    <w:p>
+      <w:pPr>
+        <w:spacing w:after="140"/>
+      </w:pPr>
+      <w:r>
+        <w:t>来源：3000 真实全栈；协调者已完成的第 5 次模型调用，复用原始截图。采集：1440 × 1000，全页截图；页面：/publish。</w:t>
+      </w:r>
+    </w:p>
+    <w:p>
+      <w:r>
+        <w:br w:type="page"/>
+      </w:r>
+    </w:p>
+    <w:p>
+      <w:pPr>
+        <w:pStyle w:val="Heading1"/>
+      </w:pPr>
+      <w:r>
+        <w:t>3.7  真实运行：采用 AI 文案后真实发布（既有验收截图）</w:t>
+      </w:r>
+    </w:p>
+    <w:p>
+      <w:pPr>
+        <w:keepNext/>
+        <w:spacing w:after="40"/>
+        <w:jc w:val="center"/>
+      </w:pPr>
+      <w:r>
+        <w:drawing>
+          <wp:inline xmlns:a="http://schemas.openxmlformats.org/drawingml/2006/main" xmlns:pic="http://schemas.openxmlformats.org/drawingml/2006/picture">
+            <wp:extent cx="5943600" cy="4552632"/>
+            <wp:docPr id="7" name="Picture 7"/>
+            <wp:cNvGraphicFramePr>
+              <a:graphicFrameLocks noChangeAspect="1"/>
+            </wp:cNvGraphicFramePr>
+            <a:graphic>
+              <a:graphicData uri="http://schemas.openxmlformats.org/drawingml/2006/picture">
+                <pic:pic>
+                  <pic:nvPicPr>
+                    <pic:cNvPr id="0" name="ai-published.png"/>
+                    <pic:cNvPicPr/>
+                  </pic:nvPicPr>
+                  <pic:blipFill>
+                    <a:blip r:embed="rId17"/>
+                    <a:stretch>
+                      <a:fillRect/>
+                    </a:stretch>
+                  </pic:blipFill>
+                  <pic:spPr>
+                    <a:xfrm>
+                      <a:off x="0" y="0"/>
+                      <a:ext cx="5943600" cy="4552632"/>
+                    </a:xfrm>
+                    <a:prstGeom prst="rect"/>
+                  </pic:spPr>
+                </pic:pic>
+              </a:graphicData>
+            </a:graphic>
+          </wp:inline>
+        </w:drawing>
+      </w:r>
+    </w:p>
+    <w:p>
+      <w:pPr>
+        <w:pStyle w:val="Caption"/>
+        <w:spacing w:after="140"/>
+        <w:jc w:val="center"/>
+      </w:pPr>
+      <w:r>
+        <w:t>图 3-7  采用 AI 文案后真实发布（既有验收截图）</w:t>
+      </w:r>
+    </w:p>
+    <w:p>
+      <w:pPr>
+        <w:spacing w:after="140"/>
+      </w:pPr>
+      <w:r>
+        <w:t>已采用文案与建议交易方式并手动确认发布；详情加载完成后采集。对应上一幅既有真实调用，不是视频录制期间新调用。</w:t>
+      </w:r>
+    </w:p>
+    <w:p>
+      <w:pPr>
+        <w:spacing w:after="140"/>
+      </w:pPr>
+      <w:r>
+        <w:t>来源：3000 真实全栈；协调者已完成的发布操作，复用原始截图。采集：1440 × 1000，全页截图；页面：/items/:id。</w:t>
       </w:r>
     </w:p>
     <w:p>
@@ -1508,7 +1690,7 @@
         <w:spacing w:after="140"/>
       </w:pPr>
       <w:r>
-        <w:t>采用 Chen 表示法：矩形表示实体，椭圆表示属性，菱形表示联系，主键属性加下划线，直线无箭头，1 / n 表示联系的最大基数。共包含 6 张实体属性图、3 张局部联系图和 1 张全局图。</w:t>
+        <w:t>Chen 表示法：矩形是实体，椭圆是属性，菱形是联系，主键名称加下划线，直线无箭头，1 / n 表示最大基数。共 6 张实体属性图、3 张局部图和 1 张全局图。图内只保留模型结构与名称。</w:t>
       </w:r>
     </w:p>
     <w:p>
@@ -1521,7 +1703,7 @@
         <w:drawing>
           <wp:inline xmlns:a="http://schemas.openxmlformats.org/drawingml/2006/main" xmlns:pic="http://schemas.openxmlformats.org/drawingml/2006/picture">
             <wp:extent cx="5486400" cy="4620333"/>
-            <wp:docPr id="5" name="Picture 5"/>
+            <wp:docPr id="8" name="Picture 8"/>
             <wp:cNvGraphicFramePr>
               <a:graphicFrameLocks noChangeAspect="1"/>
             </wp:cNvGraphicFramePr>
@@ -1533,7 +1715,7 @@
                     <pic:cNvPicPr/>
                   </pic:nvPicPr>
                   <pic:blipFill>
-                    <a:blip r:embed="rId15"/>
+                    <a:blip r:embed="rId18"/>
                     <a:stretch>
                       <a:fillRect/>
                     </a:stretch>
@@ -1567,7 +1749,7 @@
         <w:spacing w:after="140"/>
       </w:pPr>
       <w:r>
-        <w:t>六个实体为用户、登录会话、物品、意向记录、留言和交易记录，实体属性见第 5 节。取消联系可选，交易有零个或一个取消人；物品与交易的一对多包含取消历史，不表示允许同时成交给多人。</w:t>
+        <w:t>六个实体为用户、登录会话、物品、意向记录、留言和交易记录，属性见第 5 节。取消联系可选，交易有零个或一个取消人；物品与交易的一对多包含取消历史，不表示同时成交给多人。</w:t>
       </w:r>
     </w:p>
     <w:p>
@@ -1593,7 +1775,7 @@
         <w:drawing>
           <wp:inline xmlns:a="http://schemas.openxmlformats.org/drawingml/2006/main" xmlns:pic="http://schemas.openxmlformats.org/drawingml/2006/picture">
             <wp:extent cx="5166360" cy="2771969"/>
-            <wp:docPr id="6" name="Picture 6"/>
+            <wp:docPr id="9" name="Picture 9"/>
             <wp:cNvGraphicFramePr>
               <a:graphicFrameLocks noChangeAspect="1"/>
             </wp:cNvGraphicFramePr>
@@ -1605,7 +1787,7 @@
                     <pic:cNvPicPr/>
                   </pic:nvPicPr>
                   <pic:blipFill>
-                    <a:blip r:embed="rId16"/>
+                    <a:blip r:embed="rId19"/>
                     <a:stretch>
                       <a:fillRect/>
                     </a:stretch>
@@ -1644,7 +1826,7 @@
         <w:drawing>
           <wp:inline xmlns:a="http://schemas.openxmlformats.org/drawingml/2006/main" xmlns:pic="http://schemas.openxmlformats.org/drawingml/2006/picture">
             <wp:extent cx="5166360" cy="2771969"/>
-            <wp:docPr id="7" name="Picture 7"/>
+            <wp:docPr id="10" name="Picture 10"/>
             <wp:cNvGraphicFramePr>
               <a:graphicFrameLocks noChangeAspect="1"/>
             </wp:cNvGraphicFramePr>
@@ -1656,7 +1838,7 @@
                     <pic:cNvPicPr/>
                   </pic:nvPicPr>
                   <pic:blipFill>
-                    <a:blip r:embed="rId17"/>
+                    <a:blip r:embed="rId20"/>
                     <a:stretch>
                       <a:fillRect/>
                     </a:stretch>
@@ -1690,7 +1872,7 @@
         <w:spacing w:after="140"/>
       </w:pPr>
       <w:r>
-        <w:t>标识属性以椭圆内文字下划线表示。外键通过联系图表达；字段英文名、数据类型和约束见 SRS。</w:t>
+        <w:t>标识属性以椭圆内文字下划线表示。外键通过联系图表达；字段英文名、数据类型和约束见迁移核对记录。</w:t>
       </w:r>
     </w:p>
     <w:p>
@@ -1716,7 +1898,7 @@
         <w:drawing>
           <wp:inline xmlns:a="http://schemas.openxmlformats.org/drawingml/2006/main" xmlns:pic="http://schemas.openxmlformats.org/drawingml/2006/picture">
             <wp:extent cx="5166360" cy="2750136"/>
-            <wp:docPr id="8" name="Picture 8"/>
+            <wp:docPr id="11" name="Picture 11"/>
             <wp:cNvGraphicFramePr>
               <a:graphicFrameLocks noChangeAspect="1"/>
             </wp:cNvGraphicFramePr>
@@ -1728,7 +1910,7 @@
                     <pic:cNvPicPr/>
                   </pic:nvPicPr>
                   <pic:blipFill>
-                    <a:blip r:embed="rId18"/>
+                    <a:blip r:embed="rId21"/>
                     <a:stretch>
                       <a:fillRect/>
                     </a:stretch>
@@ -1767,7 +1949,7 @@
         <w:drawing>
           <wp:inline xmlns:a="http://schemas.openxmlformats.org/drawingml/2006/main" xmlns:pic="http://schemas.openxmlformats.org/drawingml/2006/picture">
             <wp:extent cx="5166360" cy="2771969"/>
-            <wp:docPr id="9" name="Picture 9"/>
+            <wp:docPr id="12" name="Picture 12"/>
             <wp:cNvGraphicFramePr>
               <a:graphicFrameLocks noChangeAspect="1"/>
             </wp:cNvGraphicFramePr>
@@ -1779,7 +1961,7 @@
                     <pic:cNvPicPr/>
                   </pic:nvPicPr>
                   <pic:blipFill>
-                    <a:blip r:embed="rId19"/>
+                    <a:blip r:embed="rId22"/>
                     <a:stretch>
                       <a:fillRect/>
                     </a:stretch>
@@ -1831,7 +2013,7 @@
         <w:drawing>
           <wp:inline xmlns:a="http://schemas.openxmlformats.org/drawingml/2006/main" xmlns:pic="http://schemas.openxmlformats.org/drawingml/2006/picture">
             <wp:extent cx="5166360" cy="2493219"/>
-            <wp:docPr id="10" name="Picture 10"/>
+            <wp:docPr id="13" name="Picture 13"/>
             <wp:cNvGraphicFramePr>
               <a:graphicFrameLocks noChangeAspect="1"/>
             </wp:cNvGraphicFramePr>
@@ -1843,7 +2025,7 @@
                     <pic:cNvPicPr/>
                   </pic:nvPicPr>
                   <pic:blipFill>
-                    <a:blip r:embed="rId20"/>
+                    <a:blip r:embed="rId23"/>
                     <a:stretch>
                       <a:fillRect/>
                     </a:stretch>
@@ -1882,7 +2064,7 @@
         <w:drawing>
           <wp:inline xmlns:a="http://schemas.openxmlformats.org/drawingml/2006/main" xmlns:pic="http://schemas.openxmlformats.org/drawingml/2006/picture">
             <wp:extent cx="5166360" cy="2739242"/>
-            <wp:docPr id="11" name="Picture 11"/>
+            <wp:docPr id="14" name="Picture 14"/>
             <wp:cNvGraphicFramePr>
               <a:graphicFrameLocks noChangeAspect="1"/>
             </wp:cNvGraphicFramePr>
@@ -1894,7 +2076,7 @@
                     <pic:cNvPicPr/>
                   </pic:nvPicPr>
                   <pic:blipFill>
-                    <a:blip r:embed="rId21"/>
+                    <a:blip r:embed="rId24"/>
                     <a:stretch>
                       <a:fillRect/>
                     </a:stretch>
@@ -1946,7 +2128,7 @@
         <w:drawing>
           <wp:inline xmlns:a="http://schemas.openxmlformats.org/drawingml/2006/main" xmlns:pic="http://schemas.openxmlformats.org/drawingml/2006/picture">
             <wp:extent cx="5760720" cy="3314941"/>
-            <wp:docPr id="12" name="Picture 12"/>
+            <wp:docPr id="15" name="Picture 15"/>
             <wp:cNvGraphicFramePr>
               <a:graphicFrameLocks noChangeAspect="1"/>
             </wp:cNvGraphicFramePr>
@@ -1958,7 +2140,7 @@
                     <pic:cNvPicPr/>
                   </pic:nvPicPr>
                   <pic:blipFill>
-                    <a:blip r:embed="rId22"/>
+                    <a:blip r:embed="rId25"/>
                     <a:stretch>
                       <a:fillRect/>
                     </a:stretch>
@@ -1992,7 +2174,7 @@
         <w:spacing w:after="140"/>
       </w:pPr>
       <w:r>
-        <w:t>一个用户可拥有多个会话、发布多件物品。会话与物品各属于一个用户。</w:t>
+        <w:t>一个用户可拥有多个会话、发布多件物品。会话和物品各属于一个用户。</w:t>
       </w:r>
     </w:p>
     <w:p>
@@ -2018,7 +2200,7 @@
         <w:drawing>
           <wp:inline xmlns:a="http://schemas.openxmlformats.org/drawingml/2006/main" xmlns:pic="http://schemas.openxmlformats.org/drawingml/2006/picture">
             <wp:extent cx="5760720" cy="3250078"/>
-            <wp:docPr id="13" name="Picture 13"/>
+            <wp:docPr id="16" name="Picture 16"/>
             <wp:cNvGraphicFramePr>
               <a:graphicFrameLocks noChangeAspect="1"/>
             </wp:cNvGraphicFramePr>
@@ -2030,7 +2212,7 @@
                     <pic:cNvPicPr/>
                   </pic:nvPicPr>
                   <pic:blipFill>
-                    <a:blip r:embed="rId23"/>
+                    <a:blip r:embed="rId26"/>
                     <a:stretch>
                       <a:fillRect/>
                     </a:stretch>
@@ -2064,7 +2246,7 @@
         <w:spacing w:after="140"/>
       </w:pPr>
       <w:r>
-        <w:t>每条意向或留言关联一个用户和一件物品。同一用户对同一物品只有一条意向记录，撤回后可再次激活。</w:t>
+        <w:t>每条意向或留言关联一个用户和一件物品。同一用户对同一物品仅一条意向记录，撤回后可重新激活。</w:t>
       </w:r>
     </w:p>
     <w:p>
@@ -2090,7 +2272,7 @@
         <w:drawing>
           <wp:inline xmlns:a="http://schemas.openxmlformats.org/drawingml/2006/main" xmlns:pic="http://schemas.openxmlformats.org/drawingml/2006/picture">
             <wp:extent cx="5760720" cy="3182112"/>
-            <wp:docPr id="14" name="Picture 14"/>
+            <wp:docPr id="17" name="Picture 17"/>
             <wp:cNvGraphicFramePr>
               <a:graphicFrameLocks noChangeAspect="1"/>
             </wp:cNvGraphicFramePr>
@@ -2102,7 +2284,7 @@
                     <pic:cNvPicPr/>
                   </pic:nvPicPr>
                   <pic:blipFill>
-                    <a:blip r:embed="rId24"/>
+                    <a:blip r:embed="rId27"/>
                     <a:stretch>
                       <a:fillRect/>
                     </a:stretch>
@@ -2136,7 +2318,7 @@
         <w:spacing w:after="140"/>
       </w:pPr>
       <w:r>
-        <w:t>每笔交易关联一件物品和一个指定领取者；发布者由物品确定。取消联系可选，取消人必须是双方之一；一件物品可有多次取消历史，但最多一笔未取消交易。</w:t>
+        <w:t>每笔交易关联一件物品和一个领取者；发布者由物品确定。取消联系可选，取消人限交易双方；每件物品可有多次取消历史，但最多一笔未取消交易。</w:t>
       </w:r>
     </w:p>
     <w:p>
@@ -2149,7 +2331,15 @@
         <w:pStyle w:val="Heading1"/>
       </w:pPr>
       <w:r>
-        <w:t>7  关系模式与完整性约束</w:t>
+        <w:t>7  实际迁移与完整性核对</w:t>
+      </w:r>
+    </w:p>
+    <w:p>
+      <w:pPr>
+        <w:spacing w:after="140"/>
+      </w:pPr>
+      <w:r>
+        <w:t>已在独立内存数据库执行 migration001 和 migration002，核验 user_version=2、6 张表、9 个外键及全部属性。v2 仅把物品图片标识白名单扩展到 30 项，没有改变实体或联系；现有 10 张图与迁移一致。</w:t>
       </w:r>
     </w:p>
     <w:tbl>
@@ -2201,7 +2391,7 @@
                 <w:b/>
                 <w:sz w:val="20"/>
               </w:rPr>
-              <w:t>主键与关键引用</w:t>
+              <w:t>主键与引用</w:t>
             </w:r>
           </w:p>
         </w:tc>
@@ -2219,7 +2409,7 @@
                 <w:b/>
                 <w:sz w:val="20"/>
               </w:rPr>
-              <w:t>主要约束</w:t>
+              <w:t>核对的约束</w:t>
             </w:r>
           </w:p>
         </w:tc>
@@ -2275,7 +2465,7 @@
                 <w:b w:val="0"/>
                 <w:sz w:val="20"/>
               </w:rPr>
-              <w:t>昵称与楼栋；用户可同时承担发布和领取角色</w:t>
+              <w:t>昵称、楼栋、创建时间</w:t>
             </w:r>
           </w:p>
         </w:tc>
@@ -2331,7 +2521,7 @@
                 <w:b w:val="0"/>
                 <w:sz w:val="20"/>
               </w:rPr>
-              <w:t>token_hash 唯一，仅保存令牌哈希，支持过期</w:t>
+              <w:t>token_hash 唯一、到期时间晚于创建时间</w:t>
             </w:r>
           </w:p>
         </w:tc>
@@ -2387,7 +2577,7 @@
                 <w:b w:val="0"/>
                 <w:sz w:val="20"/>
               </w:rPr>
-              <w:t>交易方式与金额匹配；GIVEN 必须有送出时间</w:t>
+              <w:t>价格与交易方式匹配、GIVEN 送出时间、30 图片标识</w:t>
             </w:r>
           </w:p>
         </w:tc>
@@ -2443,7 +2633,7 @@
                 <w:b w:val="0"/>
                 <w:sz w:val="20"/>
               </w:rPr>
-              <w:t>(item_id,user_id) 联合唯一；active 标记有效状态</w:t>
+              <w:t>联合唯一与 active 有效状态</w:t>
             </w:r>
           </w:p>
         </w:tc>
@@ -2499,7 +2689,7 @@
                 <w:b w:val="0"/>
                 <w:sz w:val="20"/>
               </w:rPr>
-              <w:t>归档物品不可新增留言；正文为纯文本</w:t>
+              <w:t>正文长度 CHECK，创建时间</w:t>
             </w:r>
           </w:p>
         </w:tc>
@@ -2555,7 +2745,7 @@
                 <w:b w:val="0"/>
                 <w:sz w:val="20"/>
               </w:rPr>
-              <w:t>状态时间字段一致；取消人可空；未取消交易部分唯一</w:t>
+              <w:t>状态时间 CHECK、可空取消人、未取消交易唯一索引</w:t>
             </w:r>
           </w:p>
         </w:tc>
@@ -2566,31 +2756,7 @@
         <w:spacing w:after="140"/>
       </w:pPr>
       <w:r>
-        <w:t>ID 使用 UUID；数据库时间采用 UTC 毫秒，API 使用带时区的 ISO 8601。外键、CHECK 与唯一索引由迁移建立；跨表身份和状态条件在同一事务中校验。图纸在开发完成后还须对照实际迁移复核。</w:t>
-      </w:r>
-    </w:p>
-    <w:p>
-      <w:pPr>
-        <w:pStyle w:val="Heading2"/>
-      </w:pPr>
-      <w:r>
-        <w:t>7.1 关键约束示例</w:t>
-      </w:r>
-    </w:p>
-    <w:p>
-      <w:pPr>
-        <w:spacing w:after="140"/>
-      </w:pPr>
-      <w:r>
-        <w:t>免费送价格为 0；随便给无固定价格；标价为正整数分。一个物品可以有多次取消的历史交易，但 PENDING、CONFIRMED、COMPLETED 范围内最多一条交易。</w:t>
-      </w:r>
-    </w:p>
-    <w:p>
-      <w:pPr>
-        <w:spacing w:after="140"/>
-      </w:pPr>
-      <w:r>
-        <w:t>交易完成时，交易状态与物品状态同时更新，完成时间保持一致。重复完成返回原结果，不新增成交记录；旧取消请求不能影响后续新预约。</w:t>
+        <w:t>图展示概念结构。字段类型、最小参与、唯一索引、金额和状态 CHECK 属于逻辑约束，不在图内堆放说明。物主不能领取自己物品、取消人限双方、跨表状态同步等规则由服务端事务和权限检查保证。逐字段记录见 docs/delivery/erd-verification.md。</w:t>
       </w:r>
     </w:p>
     <w:p>
@@ -2603,15 +2769,7 @@
         <w:pStyle w:val="Heading1"/>
       </w:pPr>
       <w:r>
-        <w:t>8  开发计划、验证与交付状态</w:t>
-      </w:r>
-    </w:p>
-    <w:p>
-      <w:pPr>
-        <w:spacing w:after="140"/>
-      </w:pPr>
-      <w:r>
-        <w:t>GitHub Epic #1 下设 6 个必需交付任务，另有 1 个可选部署任务。工程与契约完成后，完整前端 #9 和完整后端 #4 分别由一个会话独立并行开发，再由 #11 联调、#12 制作最终材料。前端以统一 API 适配层预留接口，开发 Mock 只用于独立交互演示。页面原型与本报告不代表这些开发任务已完成。</w:t>
+        <w:t>8  测试、真实 AI 与已知边界</w:t>
       </w:r>
     </w:p>
     <w:tbl>
@@ -2622,9 +2780,8 @@
         <w:tblLook w:firstColumn="1" w:firstRow="1" w:lastColumn="0" w:lastRow="0" w:noHBand="0" w:noVBand="1" w:val="04A0"/>
       </w:tblPr>
       <w:tblGrid>
-        <w:gridCol w:w="1701"/>
-        <w:gridCol w:w="2835"/>
-        <w:gridCol w:w="5102"/>
+        <w:gridCol w:w="2268"/>
+        <w:gridCol w:w="7370"/>
       </w:tblGrid>
       <w:tr>
         <w:trPr>
@@ -2633,7 +2790,7 @@
         </w:trPr>
         <w:tc>
           <w:tcPr>
-            <w:tcW w:type="dxa" w:w="1701"/>
+            <w:tcW w:type="dxa" w:w="2268"/>
             <w:shd w:fill="EAF0EE"/>
           </w:tcPr>
           <w:p>
@@ -2645,13 +2802,13 @@
                 <w:b/>
                 <w:sz w:val="20"/>
               </w:rPr>
-              <w:t>验证项</w:t>
+              <w:t>验证</w:t>
             </w:r>
           </w:p>
         </w:tc>
         <w:tc>
           <w:tcPr>
-            <w:tcW w:type="dxa" w:w="2835"/>
+            <w:tcW w:type="dxa" w:w="7370"/>
             <w:shd w:fill="EAF0EE"/>
           </w:tcPr>
           <w:p>
@@ -2663,25 +2820,7 @@
                 <w:b/>
                 <w:sz w:val="20"/>
               </w:rPr>
-              <w:t>验收要求</w:t>
-            </w:r>
-          </w:p>
-        </w:tc>
-        <w:tc>
-          <w:tcPr>
-            <w:tcW w:type="dxa" w:w="5102"/>
-            <w:shd w:fill="EAF0EE"/>
-          </w:tcPr>
-          <w:p>
-            <w:pPr>
-              <w:spacing w:after="80" w:before="80"/>
-            </w:pPr>
-            <w:r>
-              <w:rPr>
-                <w:b/>
-                <w:sz w:val="20"/>
-              </w:rPr>
-              <w:t>当前状态</w:t>
+              <w:t>实际结果</w:t>
             </w:r>
           </w:p>
         </w:tc>
@@ -2692,7 +2831,7 @@
         </w:trPr>
         <w:tc>
           <w:tcPr>
-            <w:tcW w:type="dxa" w:w="1701"/>
+            <w:tcW w:type="dxa" w:w="2268"/>
           </w:tcPr>
           <w:p>
             <w:pPr>
@@ -2703,13 +2842,13 @@
                 <w:b w:val="0"/>
                 <w:sz w:val="20"/>
               </w:rPr>
-              <w:t>双角色交易</w:t>
+              <w:t>单元与集成</w:t>
             </w:r>
           </w:p>
         </w:tc>
         <w:tc>
           <w:tcPr>
-            <w:tcW w:type="dxa" w:w="2835"/>
+            <w:tcW w:type="dxa" w:w="7370"/>
           </w:tcPr>
           <w:p>
             <w:pPr>
@@ -2720,13 +2859,18 @@
                 <w:b w:val="0"/>
                 <w:sz w:val="20"/>
               </w:rPr>
-              <w:t>发布→想要→预约→确认→完成→归档</w:t>
+              <w:t>102 项通过；含会话、权限、状态事务、回滚、幂等、月边界、AI 异常</w:t>
             </w:r>
           </w:p>
         </w:tc>
+      </w:tr>
+      <w:tr>
+        <w:trPr>
+          <w:cantSplit/>
+        </w:trPr>
         <w:tc>
           <w:tcPr>
-            <w:tcW w:type="dxa" w:w="5102"/>
+            <w:tcW w:type="dxa" w:w="2268"/>
           </w:tcPr>
           <w:p>
             <w:pPr>
@@ -2737,7 +2881,24 @@
                 <w:b w:val="0"/>
                 <w:sz w:val="20"/>
               </w:rPr>
-              <w:t>待实现与验证</w:t>
+              <w:t>真实 HTTP E2E</w:t>
+            </w:r>
+          </w:p>
+        </w:tc>
+        <w:tc>
+          <w:tcPr>
+            <w:tcW w:type="dxa" w:w="7370"/>
+          </w:tcPr>
+          <w:p>
+            <w:pPr>
+              <w:spacing w:after="80" w:before="80"/>
+            </w:pPr>
+            <w:r>
+              <w:rPr>
+                <w:b w:val="0"/>
+                <w:sz w:val="20"/>
+              </w:rPr>
+              <w:t>4 项通过；双身份完整交易、拒绝重约、30 图片解码、独立进程重启持久化</w:t>
             </w:r>
           </w:p>
         </w:tc>
@@ -2748,7 +2909,7 @@
         </w:trPr>
         <w:tc>
           <w:tcPr>
-            <w:tcW w:type="dxa" w:w="1701"/>
+            <w:tcW w:type="dxa" w:w="2268"/>
           </w:tcPr>
           <w:p>
             <w:pPr>
@@ -2759,13 +2920,13 @@
                 <w:b w:val="0"/>
                 <w:sz w:val="20"/>
               </w:rPr>
-              <w:t>权限与并发</w:t>
+              <w:t>页面核验</w:t>
             </w:r>
           </w:p>
         </w:tc>
         <w:tc>
           <w:tcPr>
-            <w:tcW w:type="dxa" w:w="2835"/>
+            <w:tcW w:type="dxa" w:w="7370"/>
           </w:tcPr>
           <w:p>
             <w:pPr>
@@ -2776,13 +2937,18 @@
                 <w:b w:val="0"/>
                 <w:sz w:val="20"/>
               </w:rPr>
-              <w:t>越权拒绝、同一物品唯一有效预约、重试幂等</w:t>
+              <w:t>桌面与手机无横向溢出；本次录制无页面脚本错误，成交统计增加 1</w:t>
             </w:r>
           </w:p>
         </w:tc>
+      </w:tr>
+      <w:tr>
+        <w:trPr>
+          <w:cantSplit/>
+        </w:trPr>
         <w:tc>
           <w:tcPr>
-            <w:tcW w:type="dxa" w:w="5102"/>
+            <w:tcW w:type="dxa" w:w="2268"/>
           </w:tcPr>
           <w:p>
             <w:pPr>
@@ -2793,7 +2959,24 @@
                 <w:b w:val="0"/>
                 <w:sz w:val="20"/>
               </w:rPr>
-              <w:t>待实现与验证</w:t>
+              <w:t>真实模型</w:t>
+            </w:r>
+          </w:p>
+        </w:tc>
+        <w:tc>
+          <w:tcPr>
+            <w:tcW w:type="dxa" w:w="7370"/>
+          </w:tcPr>
+          <w:p>
+            <w:pPr>
+              <w:spacing w:after="80" w:before="80"/>
+            </w:pPr>
+            <w:r>
+              <w:rPr>
+                <w:b w:val="0"/>
+                <w:sz w:val="20"/>
+              </w:rPr>
+              <w:t>累计 5 次 DeepSeek 请求：4 次脚本、1 次浏览器；本次交付零新增调用</w:t>
             </w:r>
           </w:p>
         </w:tc>
@@ -2804,7 +2987,7 @@
         </w:trPr>
         <w:tc>
           <w:tcPr>
-            <w:tcW w:type="dxa" w:w="1701"/>
+            <w:tcW w:type="dxa" w:w="2268"/>
           </w:tcPr>
           <w:p>
             <w:pPr>
@@ -2815,13 +2998,13 @@
                 <w:b w:val="0"/>
                 <w:sz w:val="20"/>
               </w:rPr>
-              <w:t>数据持久化</w:t>
+              <w:t>干净启动</w:t>
             </w:r>
           </w:p>
         </w:tc>
         <w:tc>
           <w:tcPr>
-            <w:tcW w:type="dxa" w:w="2835"/>
+            <w:tcW w:type="dxa" w:w="7370"/>
           </w:tcPr>
           <w:p>
             <w:pPr>
@@ -2832,13 +3015,18 @@
                 <w:b w:val="0"/>
                 <w:sz w:val="20"/>
               </w:rPr>
-              <w:t>迁移、种子及服务重启后数据保存</w:t>
+              <w:t>协调者 clone 237b491 后安装、构建、迁移、种子、启动成功；首页、健康、图片 200</w:t>
             </w:r>
           </w:p>
         </w:tc>
+      </w:tr>
+      <w:tr>
+        <w:trPr>
+          <w:cantSplit/>
+        </w:trPr>
         <w:tc>
           <w:tcPr>
-            <w:tcW w:type="dxa" w:w="5102"/>
+            <w:tcW w:type="dxa" w:w="2268"/>
           </w:tcPr>
           <w:p>
             <w:pPr>
@@ -2849,18 +3037,13 @@
                 <w:b w:val="0"/>
                 <w:sz w:val="20"/>
               </w:rPr>
-              <w:t>待实现与验证</w:t>
+              <w:t>远端部署</w:t>
             </w:r>
           </w:p>
         </w:tc>
-      </w:tr>
-      <w:tr>
-        <w:trPr>
-          <w:cantSplit/>
-        </w:trPr>
         <w:tc>
           <w:tcPr>
-            <w:tcW w:type="dxa" w:w="1701"/>
+            <w:tcW w:type="dxa" w:w="7370"/>
           </w:tcPr>
           <w:p>
             <w:pPr>
@@ -2871,265 +3054,7 @@
                 <w:b w:val="0"/>
                 <w:sz w:val="20"/>
               </w:rPr>
-              <w:t>真实 LLM</w:t>
-            </w:r>
-          </w:p>
-        </w:tc>
-        <w:tc>
-          <w:tcPr>
-            <w:tcW w:type="dxa" w:w="2835"/>
-          </w:tcPr>
-          <w:p>
-            <w:pPr>
-              <w:spacing w:after="80" w:before="80"/>
-            </w:pPr>
-            <w:r>
-              <w:rPr>
-                <w:b w:val="0"/>
-                <w:sz w:val="20"/>
-              </w:rPr>
-              <w:t>成功调用证据与超时/缺配置降级</w:t>
-            </w:r>
-          </w:p>
-        </w:tc>
-        <w:tc>
-          <w:tcPr>
-            <w:tcW w:type="dxa" w:w="5102"/>
-          </w:tcPr>
-          <w:p>
-            <w:pPr>
-              <w:spacing w:after="80" w:before="80"/>
-            </w:pPr>
-            <w:r>
-              <w:rPr>
-                <w:b w:val="0"/>
-                <w:sz w:val="20"/>
-              </w:rPr>
-              <w:t>待配置与验证</w:t>
-            </w:r>
-          </w:p>
-        </w:tc>
-      </w:tr>
-      <w:tr>
-        <w:trPr>
-          <w:cantSplit/>
-        </w:trPr>
-        <w:tc>
-          <w:tcPr>
-            <w:tcW w:type="dxa" w:w="1701"/>
-          </w:tcPr>
-          <w:p>
-            <w:pPr>
-              <w:spacing w:after="80" w:before="80"/>
-            </w:pPr>
-            <w:r>
-              <w:rPr>
-                <w:b w:val="0"/>
-                <w:sz w:val="20"/>
-              </w:rPr>
-              <w:t>Web 截图</w:t>
-            </w:r>
-          </w:p>
-        </w:tc>
-        <w:tc>
-          <w:tcPr>
-            <w:tcW w:type="dxa" w:w="2835"/>
-          </w:tcPr>
-          <w:p>
-            <w:pPr>
-              <w:spacing w:after="80" w:before="80"/>
-            </w:pPr>
-            <w:r>
-              <w:rPr>
-                <w:b w:val="0"/>
-                <w:sz w:val="20"/>
-              </w:rPr>
-              <w:t>截图来源、页面用途和演示数据标注</w:t>
-            </w:r>
-          </w:p>
-        </w:tc>
-        <w:tc>
-          <w:tcPr>
-            <w:tcW w:type="dxa" w:w="5102"/>
-          </w:tcPr>
-          <w:p>
-            <w:pPr>
-              <w:spacing w:after="80" w:before="80"/>
-            </w:pPr>
-            <w:r>
-              <w:rPr>
-                <w:b w:val="0"/>
-                <w:sz w:val="20"/>
-              </w:rPr>
-              <w:t>原型截图已纳入</w:t>
-            </w:r>
-          </w:p>
-        </w:tc>
-      </w:tr>
-      <w:tr>
-        <w:trPr>
-          <w:cantSplit/>
-        </w:trPr>
-        <w:tc>
-          <w:tcPr>
-            <w:tcW w:type="dxa" w:w="1701"/>
-          </w:tcPr>
-          <w:p>
-            <w:pPr>
-              <w:spacing w:after="80" w:before="80"/>
-            </w:pPr>
-            <w:r>
-              <w:rPr>
-                <w:b w:val="0"/>
-                <w:sz w:val="20"/>
-              </w:rPr>
-              <w:t>E-R 图</w:t>
-            </w:r>
-          </w:p>
-        </w:tc>
-        <w:tc>
-          <w:tcPr>
-            <w:tcW w:type="dxa" w:w="2835"/>
-          </w:tcPr>
-          <w:p>
-            <w:pPr>
-              <w:spacing w:after="80" w:before="80"/>
-            </w:pPr>
-            <w:r>
-              <w:rPr>
-                <w:b w:val="0"/>
-                <w:sz w:val="20"/>
-              </w:rPr>
-              <w:t>10 张独立 Chen 图已绘制，后续核对实际迁移</w:t>
-            </w:r>
-          </w:p>
-        </w:tc>
-        <w:tc>
-          <w:tcPr>
-            <w:tcW w:type="dxa" w:w="5102"/>
-          </w:tcPr>
-          <w:p>
-            <w:pPr>
-              <w:spacing w:after="80" w:before="80"/>
-            </w:pPr>
-            <w:r>
-              <w:rPr>
-                <w:b w:val="0"/>
-                <w:sz w:val="20"/>
-              </w:rPr>
-              <w:t>设计图已完成</w:t>
-            </w:r>
-          </w:p>
-        </w:tc>
-      </w:tr>
-      <w:tr>
-        <w:trPr>
-          <w:cantSplit/>
-        </w:trPr>
-        <w:tc>
-          <w:tcPr>
-            <w:tcW w:type="dxa" w:w="1701"/>
-          </w:tcPr>
-          <w:p>
-            <w:pPr>
-              <w:spacing w:after="80" w:before="80"/>
-            </w:pPr>
-            <w:r>
-              <w:rPr>
-                <w:b w:val="0"/>
-                <w:sz w:val="20"/>
-              </w:rPr>
-              <w:t>5 分钟视频</w:t>
-            </w:r>
-          </w:p>
-        </w:tc>
-        <w:tc>
-          <w:tcPr>
-            <w:tcW w:type="dxa" w:w="2835"/>
-          </w:tcPr>
-          <w:p>
-            <w:pPr>
-              <w:spacing w:after="80" w:before="80"/>
-            </w:pPr>
-            <w:r>
-              <w:rPr>
-                <w:b w:val="0"/>
-                <w:sz w:val="20"/>
-              </w:rPr>
-              <w:t>可运行 Demo 和实现讲解</w:t>
-            </w:r>
-          </w:p>
-        </w:tc>
-        <w:tc>
-          <w:tcPr>
-            <w:tcW w:type="dxa" w:w="5102"/>
-          </w:tcPr>
-          <w:p>
-            <w:pPr>
-              <w:spacing w:after="80" w:before="80"/>
-            </w:pPr>
-            <w:r>
-              <w:rPr>
-                <w:b w:val="0"/>
-                <w:sz w:val="20"/>
-              </w:rPr>
-              <w:t>待开发完成后录制</w:t>
-            </w:r>
-          </w:p>
-        </w:tc>
-      </w:tr>
-      <w:tr>
-        <w:trPr>
-          <w:cantSplit/>
-        </w:trPr>
-        <w:tc>
-          <w:tcPr>
-            <w:tcW w:type="dxa" w:w="1701"/>
-          </w:tcPr>
-          <w:p>
-            <w:pPr>
-              <w:spacing w:after="80" w:before="80"/>
-            </w:pPr>
-            <w:r>
-              <w:rPr>
-                <w:b w:val="0"/>
-                <w:sz w:val="20"/>
-              </w:rPr>
-              <w:t>CI / 部署</w:t>
-            </w:r>
-          </w:p>
-        </w:tc>
-        <w:tc>
-          <w:tcPr>
-            <w:tcW w:type="dxa" w:w="2835"/>
-          </w:tcPr>
-          <w:p>
-            <w:pPr>
-              <w:spacing w:after="80" w:before="80"/>
-            </w:pPr>
-            <w:r>
-              <w:rPr>
-                <w:b w:val="0"/>
-                <w:sz w:val="20"/>
-              </w:rPr>
-              <w:t>配置后跟踪终态，部署后核验线上</w:t>
-            </w:r>
-          </w:p>
-        </w:tc>
-        <w:tc>
-          <w:tcPr>
-            <w:tcW w:type="dxa" w:w="5102"/>
-          </w:tcPr>
-          <w:p>
-            <w:pPr>
-              <w:spacing w:after="80" w:before="80"/>
-            </w:pPr>
-            <w:r>
-              <w:rPr>
-                <w:b w:val="0"/>
-                <w:sz w:val="20"/>
-              </w:rPr>
-              <w:t>CI 已配置；未部署</w:t>
+              <w:t>未部署；GitHub Actions 为 CI，没有 CD 或线上运行验收</w:t>
             </w:r>
           </w:p>
         </w:tc>
@@ -3140,7 +3065,7 @@
         <w:pStyle w:val="Heading2"/>
       </w:pPr>
       <w:r>
-        <w:t>8.1 配套资料</w:t>
+        <w:t>8.1 模型输出的实际质量</w:t>
       </w:r>
     </w:p>
     <w:p>
@@ -3148,7 +3073,7 @@
         <w:spacing w:after="140"/>
       </w:pPr>
       <w:r>
-        <w:t>产品范围：docs/product/PRD.md；系统规格：docs/engineering/SRS.md；图纸与映射：docs/engineering/ERD.md；依赖计划：docs/planning/DAG.md。</w:t>
+        <w:t>第一次稀疏描述获得 0.01–99,999 元的全范围报价，属于无实用价值的质量失败。已调整提示词并增加服务端拒绝回归。修复后脚本中，稀疏描述返回随便给，充分描述返回 80–150 元；价格仍不是市场行情认证。</w:t>
       </w:r>
     </w:p>
     <w:p>
@@ -3156,9 +3081,7 @@
         <w:spacing w:after="140"/>
       </w:pPr>
       <w:r>
-        <w:t>仓库：https://github.com/luochen211/neighborhood-exchange</w:t>
-        <w:br/>
-        <w:t>交付 Epic：https://github.com/luochen211/neighborhood-exchange/issues/1</w:t>
+        <w:t>第五次真实浏览器调用返回 FLEXIBLE/null，即随便给，没有数值报价。协调者逐句核对标题、功能、成色和配件均来自输入，再采用文案与交易方式并手动发布。报告截图复用该次验收，未为获得特定价格再次调用。</w:t>
       </w:r>
     </w:p>
     <w:p>
@@ -3166,7 +3089,92 @@
         <w:spacing w:after="140"/>
       </w:pPr>
       <w:r>
-        <w:t>后续报告应逐项记录通过、实际失败、跳过与外部阻塞；不得把原型、模拟模型响应或计划中的行为写成已完成的全栈测试结果。</w:t>
+        <w:t>CI 使用标明的模型 stub，不调用付费服务。已有真实调用与独立浏览器核验单独记录在 acceptance.md / backend.md；两类证据互不替代。</w:t>
+      </w:r>
+    </w:p>
+    <w:p>
+      <w:r>
+        <w:br w:type="page"/>
+      </w:r>
+    </w:p>
+    <w:p>
+      <w:pPr>
+        <w:pStyle w:val="Heading1"/>
+      </w:pPr>
+      <w:r>
+        <w:t>9  运行、视频与 AI Coding 记录</w:t>
+      </w:r>
+    </w:p>
+    <w:p>
+      <w:pPr>
+        <w:pStyle w:val="Heading2"/>
+      </w:pPr>
+      <w:r>
+        <w:t>9.1 本地复现</w:t>
+      </w:r>
+    </w:p>
+    <w:p>
+      <w:pPr>
+        <w:spacing w:after="140"/>
+      </w:pPr>
+      <w:r>
+        <w:t>使用 Node.js 24 / npm 11：npm ci → npm run build → 创建根 .env → npm run db:migrate → npm run db:seed → npm start。DEMO_MODE=true，APP_ORIGIN 与访问端口一致；默认 http://127.0.0.1:3000。完整配置步骤与检查命令见根 README。</w:t>
+      </w:r>
+    </w:p>
+    <w:p>
+      <w:pPr>
+        <w:spacing w:after="140"/>
+      </w:pPr>
+      <w:r>
+        <w:t>数据库路径相对仓库根解析。迁移和种子不会重置已有业务；复现及测试使用独立数据库。模型凭据可选填入本地 .env；缺凭据时 AI 明确报错，手动发布仍可使用。</w:t>
+      </w:r>
+    </w:p>
+    <w:p>
+      <w:pPr>
+        <w:pStyle w:val="Heading2"/>
+      </w:pPr>
+      <w:r>
+        <w:t>9.2 实际演示成片</w:t>
+      </w:r>
+    </w:p>
+    <w:p>
+      <w:pPr>
+        <w:spacing w:after="140"/>
+      </w:pPr>
+      <w:r>
+        <w:t>docs/delivery/邻里闲置_演示视频.mp4：约 5 分钟，包含真实浏览器交易、取消重约、手机界面，以及既有 AI 证据、架构与验收讲解。成片附中文合成讲解音轨、烧录字幕和独立 SRT；镜头来源标明，物理交接未在视频中声称发生。</w:t>
+      </w:r>
+    </w:p>
+    <w:p>
+      <w:pPr>
+        <w:pStyle w:val="Heading2"/>
+      </w:pPr>
+      <w:r>
+        <w:t>9.3 AI Coding 与核验</w:t>
+      </w:r>
+    </w:p>
+    <w:p>
+      <w:pPr>
+        <w:spacing w:after="140"/>
+      </w:pPr>
+      <w:r>
+        <w:t>Codex 辅助需求与接口契约、前后端实现、测试与文档生成。独立任务按完整前端、完整后端和集成验收分工；协调者审查 PR、真实浏览器证据和 CI。关键迭代包括事务与幂等、30 图片迁移、真实模型接入及全范围无效报价修复。</w:t>
+      </w:r>
+    </w:p>
+    <w:p>
+      <w:pPr>
+        <w:spacing w:after="140"/>
+      </w:pPr>
+      <w:r>
+        <w:t>自动化完成后仍逐页目视检查截图、10 张 ER 图和 PDF 排版，并核验视频时长、音轨和抽帧。用户提供的学校参考文档未修改；现有用户数据库未用于录制写操作。</w:t>
+      </w:r>
+    </w:p>
+    <w:p>
+      <w:pPr>
+        <w:spacing w:after="140"/>
+      </w:pPr>
+      <w:r>
+        <w:t>交付索引：docs/delivery/README.md；验收：acceptance.md；ER 核对：erd-verification.md；视频时间轴与制作证据：video.md。最终 Issue 与 Epic 由协调者在 PR 合并、main CI 核验后关闭。</w:t>
       </w:r>
     </w:p>
     <w:sectPr>
@@ -3206,7 +3214,7 @@
       <w:pStyle w:val="Caption"/>
     </w:pPr>
     <w:r>
-      <w:t>邻里闲置  |  项目设计说明书</w:t>
+      <w:t>邻里闲置  |  项目设计与实现说明书</w:t>
     </w:r>
   </w:p>
 </w:hdr>

</xml_diff>

<commit_message>
docs: deliver verified report and narrated application demo (#23)
</commit_message>
<xml_diff>
--- a/docs/delivery/邻里闲置_项目设计说明书.docx
+++ b/docs/delivery/邻里闲置_项目设计说明书.docx
@@ -2,11 +2,6 @@
 <file path=word/document.xml><?xml version="1.0" encoding="utf-8"?>
 <w:document xmlns:wpc="http://schemas.microsoft.com/office/word/2010/wordprocessingCanvas" xmlns:mo="http://schemas.microsoft.com/office/mac/office/2008/main" xmlns:mc="http://schemas.openxmlformats.org/markup-compatibility/2006" xmlns:mv="urn:schemas-microsoft-com:mac:vml" xmlns:o="urn:schemas-microsoft-com:office:office" xmlns:r="http://schemas.openxmlformats.org/officeDocument/2006/relationships" xmlns:m="http://schemas.openxmlformats.org/officeDocument/2006/math" xmlns:v="urn:schemas-microsoft-com:vml" xmlns:wp14="http://schemas.microsoft.com/office/word/2010/wordprocessingDrawing" xmlns:wp="http://schemas.openxmlformats.org/drawingml/2006/wordprocessingDrawing" xmlns:w10="urn:schemas-microsoft-com:office:word" xmlns:w="http://schemas.openxmlformats.org/wordprocessingml/2006/main" xmlns:w14="http://schemas.microsoft.com/office/word/2010/wordml" xmlns:wpg="http://schemas.microsoft.com/office/word/2010/wordprocessingGroup" xmlns:wpi="http://schemas.microsoft.com/office/word/2010/wordprocessingInk" xmlns:wne="http://schemas.microsoft.com/office/word/2006/wordml" xmlns:wps="http://schemas.microsoft.com/office/word/2010/wordprocessingShape" mc:Ignorable="w14 wp14">
   <w:body>
-    <w:p>
-      <w:pPr>
-        <w:spacing w:after="140"/>
-      </w:pPr>
-    </w:p>
     <w:p>
       <w:pPr>
         <w:spacing w:after="140"/>
@@ -37,7 +32,7 @@
         <w:jc w:val="center"/>
       </w:pPr>
       <w:r>
-        <w:t>项目设计说明书</w:t>
+        <w:t>项目设计与实现说明书</w:t>
       </w:r>
     </w:p>
     <w:p>
@@ -48,11 +43,6 @@
       <w:r>
         <w:t>社区闲置物品流转 Web 应用</w:t>
       </w:r>
-    </w:p>
-    <w:p>
-      <w:pPr>
-        <w:spacing w:after="140"/>
-      </w:pPr>
     </w:p>
     <w:tbl>
       <w:tblPr>
@@ -102,7 +92,7 @@
                 <w:b/>
                 <w:sz w:val="20"/>
               </w:rPr>
-              <w:t>说明</w:t>
+              <w:t>交付内容</w:t>
             </w:r>
           </w:p>
         </w:tc>
@@ -124,7 +114,7 @@
                 <w:b w:val="0"/>
                 <w:sz w:val="20"/>
               </w:rPr>
-              <w:t>应用形态</w:t>
+              <w:t>应用</w:t>
             </w:r>
           </w:p>
         </w:tc>
@@ -141,7 +131,7 @@
                 <w:b w:val="0"/>
                 <w:sz w:val="20"/>
               </w:rPr>
-              <w:t>移动端优先、兼容桌面浏览器的 Web 应用</w:t>
+              <w:t>React 网页、Fastify HTTP API、持久 SQLite、服务端 AI 发布辅助</w:t>
             </w:r>
           </w:p>
         </w:tc>
@@ -163,7 +153,7 @@
                 <w:b w:val="0"/>
                 <w:sz w:val="20"/>
               </w:rPr>
-              <w:t>文档内容</w:t>
+              <w:t>运行材料</w:t>
             </w:r>
           </w:p>
         </w:tc>
@@ -180,7 +170,7 @@
                 <w:b w:val="0"/>
                 <w:sz w:val="20"/>
               </w:rPr>
-              <w:t>产品说明、Web 页面截图、技术方案、10 张独立 Chen E-R 图</w:t>
+              <w:t>真实页面截图、10 张 Chen E-R 图、约 5 分钟实际操作与讲解视频</w:t>
             </w:r>
           </w:p>
         </w:tc>
@@ -202,7 +192,7 @@
                 <w:b w:val="0"/>
                 <w:sz w:val="20"/>
               </w:rPr>
-              <w:t>文档阶段</w:t>
+              <w:t>本地验收</w:t>
             </w:r>
           </w:p>
         </w:tc>
@@ -219,7 +209,7 @@
                 <w:b w:val="0"/>
                 <w:sz w:val="20"/>
               </w:rPr>
-              <w:t>设计阶段；应用业务与数据库尚未实现</w:t>
+              <w:t>102 项单元/集成测试、4 项真实 HTTP E2E、5 次真实模型调用</w:t>
             </w:r>
           </w:p>
         </w:tc>
@@ -241,7 +231,7 @@
                 <w:b w:val="0"/>
                 <w:sz w:val="20"/>
               </w:rPr>
-              <w:t>截图类型</w:t>
+              <w:t>证据范围</w:t>
             </w:r>
           </w:p>
         </w:tc>
@@ -258,7 +248,46 @@
                 <w:b w:val="0"/>
                 <w:sz w:val="20"/>
               </w:rPr>
-              <w:t>本地 Web 页面原型截图，使用虚构数据</w:t>
+              <w:t>隔离数据库录屏；既有真实 AI 截图明确标识；数据为虚构演示数据</w:t>
+            </w:r>
+          </w:p>
+        </w:tc>
+      </w:tr>
+      <w:tr>
+        <w:trPr>
+          <w:cantSplit/>
+        </w:trPr>
+        <w:tc>
+          <w:tcPr>
+            <w:tcW w:type="dxa" w:w="2268"/>
+          </w:tcPr>
+          <w:p>
+            <w:pPr>
+              <w:spacing w:after="80" w:before="80"/>
+            </w:pPr>
+            <w:r>
+              <w:rPr>
+                <w:b w:val="0"/>
+                <w:sz w:val="20"/>
+              </w:rPr>
+              <w:t>部署</w:t>
+            </w:r>
+          </w:p>
+        </w:tc>
+        <w:tc>
+          <w:tcPr>
+            <w:tcW w:type="dxa" w:w="7370"/>
+          </w:tcPr>
+          <w:p>
+            <w:pPr>
+              <w:spacing w:after="80" w:before="80"/>
+            </w:pPr>
+            <w:r>
+              <w:rPr>
+                <w:b w:val="0"/>
+                <w:sz w:val="20"/>
+              </w:rPr>
+              <w:t>本地运行已验收；未做远端部署</w:t>
             </w:r>
           </w:p>
         </w:tc>
@@ -297,7 +326,7 @@
                 <w:b w:val="0"/>
                 <w:sz w:val="20"/>
               </w:rPr>
-              <w:t>1.0 / 2026-09-27</w:t>
+              <w:t>2.0 / 2026-09-27</w:t>
             </w:r>
           </w:p>
         </w:tc>
@@ -308,7 +337,7 @@
         <w:spacing w:after="140"/>
       </w:pPr>
       <w:r>
-        <w:t>本报告用于说明产品与数据库设计。实现、真实 LLM 调用、运行测试和部署结果需在开发完成后补充核验；设计图或页面原型不作为全栈验收证据。</w:t>
+        <w:t>应用已实现发布、意向、预约、取消、确认、归档与看板闭环。本报告区分自动化测试、真实模型和材料录制证据；第 5 次模型调用返回随便给，不将其表述为数值报价成功。</w:t>
       </w:r>
     </w:p>
     <w:p>
@@ -321,7 +350,15 @@
         <w:pStyle w:val="Heading1"/>
       </w:pPr>
       <w:r>
-        <w:t>1  项目概述与需求</w:t>
+        <w:t>1  项目背景与使用流程</w:t>
+      </w:r>
+    </w:p>
+    <w:p>
+      <w:pPr>
+        <w:spacing w:after="140"/>
+      </w:pPr>
+      <w:r>
+        <w:t>小区群里的闲置容易被新消息淹没，领取者难以判断是否还能领，双方需要反复沟通时间地点。邻里闲置通过物品卡片、明确状态和预约交接，让同一社区的邻居完成线下流转。</w:t>
       </w:r>
     </w:p>
     <w:p>
@@ -329,7 +366,7 @@
         <w:pStyle w:val="Heading2"/>
       </w:pPr>
       <w:r>
-        <w:t>1.1 场景与目标</w:t>
+        <w:t>1.1 范围与角色</w:t>
       </w:r>
     </w:p>
     <w:p>
@@ -337,39 +374,7 @@
         <w:spacing w:after="140"/>
       </w:pPr>
       <w:r>
-        <w:t>小区群里的闲置物品容易被新消息淹没；领取者难以判断物品是否还在，双方又需要反复私聊约时间和地点。邻里闲置面向同一个小区、楼栋或办公室，以物品卡片、明确状态和预约交接减少这些沟通成本。</w:t>
-      </w:r>
-    </w:p>
-    <w:p>
-      <w:pPr>
-        <w:spacing w:after="140"/>
-      </w:pPr>
-      <w:r>
-        <w:t>本次以单一预置社区为范围，采用虚构演示身份和预置图片，优先完成一条可验证的线下交易闭环。</w:t>
-      </w:r>
-    </w:p>
-    <w:p>
-      <w:pPr>
-        <w:pStyle w:val="Heading2"/>
-      </w:pPr>
-      <w:r>
-        <w:t>1.2 主要用户与流程</w:t>
-      </w:r>
-    </w:p>
-    <w:p>
-      <w:pPr>
-        <w:spacing w:after="140"/>
-      </w:pPr>
-      <w:r>
-        <w:t>发布者与领取者都是社区用户，同一用户可在不同物品下承担不同角色。访客可以浏览；写操作由服务端校验身份和权限。</w:t>
-      </w:r>
-    </w:p>
-    <w:p>
-      <w:pPr>
-        <w:spacing w:after="140"/>
-      </w:pPr>
-      <w:r>
-        <w:t>发布物品 → 浏览与搜索 → 表达想要 → 发布者选人并预约 → 领取者确认 → 线下交接 → 发布者确认送出 → 归档与统计更新。</w:t>
+        <w:t>采用单一演示社区和预置虚构身份。访客可浏览；用户可发布、留言或领取别人的物品。发布者和领取者是同一用户实体在不同交易中的角色。物品图使用 30 张 AI 生成的演示图片，页面明确标注，不能当作真实二手物品照片。</w:t>
       </w:r>
     </w:p>
     <w:tbl>
@@ -420,7 +425,7 @@
                 <w:b/>
                 <w:sz w:val="20"/>
               </w:rPr>
-              <w:t>设计说明</w:t>
+              <w:t>实现行为</w:t>
             </w:r>
           </w:p>
         </w:tc>
@@ -442,7 +447,7 @@
                 <w:b w:val="0"/>
                 <w:sz w:val="20"/>
               </w:rPr>
-              <w:t>物品发布</w:t>
+              <w:t>发现与发布</w:t>
             </w:r>
           </w:p>
         </w:tc>
@@ -459,7 +464,7 @@
                 <w:b w:val="0"/>
                 <w:sz w:val="20"/>
               </w:rPr>
-              <w:t>名称、描述、交易方式、预置图片与自提楼栋；支持免费送、随便给、标价。</w:t>
+              <w:t>关键词与交易方式组合筛选；免费送、随便给、标价；预置图片和自提楼栋</w:t>
             </w:r>
           </w:p>
         </w:tc>
@@ -481,7 +486,7 @@
                 <w:b w:val="0"/>
                 <w:sz w:val="20"/>
               </w:rPr>
-              <w:t>发现与检索</w:t>
+              <w:t>意向与留言</w:t>
             </w:r>
           </w:p>
         </w:tc>
@@ -498,7 +503,7 @@
                 <w:b w:val="0"/>
                 <w:sz w:val="20"/>
               </w:rPr>
-              <w:t>卡片按发布时间倒序；支持关键词搜索和交易方式筛选；显示新鲜度。</w:t>
+              <w:t>表达想要、撤回和重新激活；公开留言；名单仅物主可读</w:t>
             </w:r>
           </w:p>
         </w:tc>
@@ -520,7 +525,7 @@
                 <w:b w:val="0"/>
                 <w:sz w:val="20"/>
               </w:rPr>
-              <w:t>意向与交接</w:t>
+              <w:t>预约交接</w:t>
             </w:r>
           </w:p>
         </w:tc>
@@ -537,7 +542,7 @@
                 <w:b w:val="0"/>
                 <w:sz w:val="20"/>
               </w:rPr>
-              <w:t>想要、撤回、查看意向人；约定未来 7 天内的时间和公共地点；确认、取消与完成。</w:t>
+              <w:t>物主选择意向人，约定未来 7 天内的时间和公共地点；双方确认或取消</w:t>
             </w:r>
           </w:p>
         </w:tc>
@@ -559,7 +564,7 @@
                 <w:b w:val="0"/>
                 <w:sz w:val="20"/>
               </w:rPr>
-              <w:t>留言与归档</w:t>
+              <w:t>完成归档</w:t>
             </w:r>
           </w:p>
         </w:tc>
@@ -576,7 +581,7 @@
                 <w:b w:val="0"/>
                 <w:sz w:val="20"/>
               </w:rPr>
-              <w:t>公开问答减少重复私聊；已送出保留记录并禁止写操作。</w:t>
+              <w:t>物主二次确认后归档；详情留言保留，禁止新写入；统计同步更新</w:t>
             </w:r>
           </w:p>
         </w:tc>
@@ -598,7 +603,7 @@
                 <w:b w:val="0"/>
                 <w:sz w:val="20"/>
               </w:rPr>
-              <w:t>社区看板</w:t>
+              <w:t>AI 辅助</w:t>
             </w:r>
           </w:p>
         </w:tc>
@@ -615,46 +620,7 @@
                 <w:b w:val="0"/>
                 <w:sz w:val="20"/>
               </w:rPr>
-              <w:t>本月发布、本月成交、当前在售、最快领走和最想要物品。</w:t>
-            </w:r>
-          </w:p>
-        </w:tc>
-      </w:tr>
-      <w:tr>
-        <w:trPr>
-          <w:cantSplit/>
-        </w:trPr>
-        <w:tc>
-          <w:tcPr>
-            <w:tcW w:type="dxa" w:w="2268"/>
-          </w:tcPr>
-          <w:p>
-            <w:pPr>
-              <w:spacing w:after="80" w:before="80"/>
-            </w:pPr>
-            <w:r>
-              <w:rPr>
-                <w:b w:val="0"/>
-                <w:sz w:val="20"/>
-              </w:rPr>
-              <w:t>LLM 辅助</w:t>
-            </w:r>
-          </w:p>
-        </w:tc>
-        <w:tc>
-          <w:tcPr>
-            <w:tcW w:type="dxa" w:w="7370"/>
-          </w:tcPr>
-          <w:p>
-            <w:pPr>
-              <w:spacing w:after="80" w:before="80"/>
-            </w:pPr>
-            <w:r>
-              <w:rPr>
-                <w:b w:val="0"/>
-                <w:sz w:val="20"/>
-              </w:rPr>
-              <w:t>根据已知事实整理文案和给出参考价；用户选择采用，失败时仍能手动发布。</w:t>
+              <w:t>服务端调用真实模型；严格结构校验；用户主动采用、手动发布；失败保留草稿</w:t>
             </w:r>
           </w:p>
         </w:tc>
@@ -665,7 +631,7 @@
         <w:pStyle w:val="Heading2"/>
       </w:pPr>
       <w:r>
-        <w:t>1.3 取舍与交付</w:t>
+        <w:t>1.2 典型路径</w:t>
       </w:r>
     </w:p>
     <w:p>
@@ -673,7 +639,15 @@
         <w:spacing w:after="140"/>
       </w:pPr>
       <w:r>
-        <w:t>不纳入本次基线：支付、快递、即时私聊、信用体系、多社区、真实注册和图片上传。考试交付包括本地可运行全栈应用、5 分钟视频、数据库 E-R 图及技术栈简介；远端部署为可选项。</w:t>
+        <w:t>发布者发布 → 领取者想要和留言 → 物主发起预约 → 领取者确认 → 线下交接 → 物主确认完成 → 归档并更新看板。时间不合适时可取消，再建立新预约；历史取消记录保留。</w:t>
+      </w:r>
+    </w:p>
+    <w:p>
+      <w:pPr>
+        <w:spacing w:after="140"/>
+      </w:pPr>
+      <w:r>
+        <w:t>本项目不包含在线支付、快递、即时私聊、真实注册、多社区或用户上传照片。演示身份不能作为生产认证。物理交接由双方线下完成；录屏演示的是软件确认流程。</w:t>
       </w:r>
     </w:p>
     <w:p>
@@ -686,7 +660,7 @@
         <w:pStyle w:val="Heading1"/>
       </w:pPr>
       <w:r>
-        <w:t>2  技术架构与系统规则</w:t>
+        <w:t>2  技术架构与核心实现</w:t>
       </w:r>
     </w:p>
     <w:tbl>
@@ -795,7 +769,7 @@
                 <w:b w:val="0"/>
                 <w:sz w:val="20"/>
               </w:rPr>
-              <w:t>React + TypeScript + Vite</w:t>
+              <w:t>React / TypeScript / Vite</w:t>
             </w:r>
           </w:p>
         </w:tc>
@@ -812,7 +786,7 @@
                 <w:b w:val="0"/>
                 <w:sz w:val="20"/>
               </w:rPr>
-              <w:t>页面、表单、状态反馈与 API 调用</w:t>
+              <w:t>页面、表单、身份状态、API adapter 和错误反馈</w:t>
             </w:r>
           </w:p>
         </w:tc>
@@ -834,7 +808,7 @@
                 <w:b w:val="0"/>
                 <w:sz w:val="20"/>
               </w:rPr>
-              <w:t>后端</w:t>
+              <w:t>API</w:t>
             </w:r>
           </w:p>
         </w:tc>
@@ -851,7 +825,7 @@
                 <w:b w:val="0"/>
                 <w:sz w:val="20"/>
               </w:rPr>
-              <w:t>Node.js + Fastify</w:t>
+              <w:t>Node.js 24 / Fastify</w:t>
             </w:r>
           </w:p>
         </w:tc>
@@ -868,7 +842,7 @@
                 <w:b w:val="0"/>
                 <w:sz w:val="20"/>
               </w:rPr>
-              <w:t>身份、权限、参数校验、业务事务与 LLM 接入</w:t>
+              <w:t>23 个契约操作、会话、权限、参数校验和业务事务</w:t>
             </w:r>
           </w:p>
         </w:tc>
@@ -890,7 +864,7 @@
                 <w:b w:val="0"/>
                 <w:sz w:val="20"/>
               </w:rPr>
-              <w:t>数据库</w:t>
+              <w:t>数据</w:t>
             </w:r>
           </w:p>
         </w:tc>
@@ -907,7 +881,7 @@
                 <w:b w:val="0"/>
                 <w:sz w:val="20"/>
               </w:rPr>
-              <w:t>SQLite + Drizzle</w:t>
+              <w:t>SQLite / Drizzle</w:t>
             </w:r>
           </w:p>
         </w:tc>
@@ -924,7 +898,7 @@
                 <w:b w:val="0"/>
                 <w:sz w:val="20"/>
               </w:rPr>
-              <w:t>物品、意向、留言、交易和会话的持久化</w:t>
+              <w:t>6 张表、9 个外键、版本迁移、CHECK 和唯一索引</w:t>
             </w:r>
           </w:p>
         </w:tc>
@@ -946,7 +920,7 @@
                 <w:b w:val="0"/>
                 <w:sz w:val="20"/>
               </w:rPr>
-              <w:t>接口契约</w:t>
+              <w:t>契约</w:t>
             </w:r>
           </w:p>
         </w:tc>
@@ -963,7 +937,7 @@
                 <w:b w:val="0"/>
                 <w:sz w:val="20"/>
               </w:rPr>
-              <w:t>OpenAPI 3.1 + 共享 Schema</w:t>
+              <w:t>OpenAPI 3.1 / Zod</w:t>
             </w:r>
           </w:p>
         </w:tc>
@@ -980,7 +954,63 @@
                 <w:b w:val="0"/>
                 <w:sz w:val="20"/>
               </w:rPr>
-              <w:t>固定输入、输出与错误结构</w:t>
+              <w:t>统一输入输出与错误结构；运行时校验</w:t>
+            </w:r>
+          </w:p>
+        </w:tc>
+      </w:tr>
+      <w:tr>
+        <w:trPr>
+          <w:cantSplit/>
+        </w:trPr>
+        <w:tc>
+          <w:tcPr>
+            <w:tcW w:type="dxa" w:w="1701"/>
+          </w:tcPr>
+          <w:p>
+            <w:pPr>
+              <w:spacing w:after="80" w:before="80"/>
+            </w:pPr>
+            <w:r>
+              <w:rPr>
+                <w:b w:val="0"/>
+                <w:sz w:val="20"/>
+              </w:rPr>
+              <w:t>AI</w:t>
+            </w:r>
+          </w:p>
+        </w:tc>
+        <w:tc>
+          <w:tcPr>
+            <w:tcW w:type="dxa" w:w="2835"/>
+          </w:tcPr>
+          <w:p>
+            <w:pPr>
+              <w:spacing w:after="80" w:before="80"/>
+            </w:pPr>
+            <w:r>
+              <w:rPr>
+                <w:b w:val="0"/>
+                <w:sz w:val="20"/>
+              </w:rPr>
+              <w:t>服务端 Chat Completions</w:t>
+            </w:r>
+          </w:p>
+        </w:tc>
+        <w:tc>
+          <w:tcPr>
+            <w:tcW w:type="dxa" w:w="5102"/>
+          </w:tcPr>
+          <w:p>
+            <w:pPr>
+              <w:spacing w:after="80" w:before="80"/>
+            </w:pPr>
+            <w:r>
+              <w:rPr>
+                <w:b w:val="0"/>
+                <w:sz w:val="20"/>
+              </w:rPr>
+              <w:t>DeepSeek 发布辅助、超时、限流、输出校验与安全降级</w:t>
             </w:r>
           </w:p>
         </w:tc>
@@ -1019,7 +1049,7 @@
                 <w:b w:val="0"/>
                 <w:sz w:val="20"/>
               </w:rPr>
-              <w:t>Vitest + API 测试 + Playwright</w:t>
+              <w:t>Vitest / Playwright / CI</w:t>
             </w:r>
           </w:p>
         </w:tc>
@@ -1036,7 +1066,7 @@
                 <w:b w:val="0"/>
                 <w:sz w:val="20"/>
               </w:rPr>
-              <w:t>业务规则、权限、并发与双会话端到端验收</w:t>
+              <w:t>临时数据库、真实 HTTP、多身份浏览器和构建检查</w:t>
             </w:r>
           </w:p>
         </w:tc>
@@ -1047,7 +1077,7 @@
         <w:spacing w:after="140"/>
       </w:pPr>
       <w:r>
-        <w:t>浏览器通过同源 /api/v1 访问后端；后端访问 SQLite 并调用模型服务。密钥只放在服务端环境变量中。前端、API 与数据库保持明确边界。工程骨架与共享接口契约已建立，具体业务仍在开发中。</w:t>
+        <w:t>浏览器经同源 /api/v1 访问后端；后端操作 SQLite 并调用模型服务。生产构建由 Fastify 托管前端，支持页面深链接。密钥只保存在服务端环境，浏览器不接收密钥。数据库记录会话令牌的哈希，Cookie 使用 HttpOnly。</w:t>
       </w:r>
     </w:p>
     <w:p>
@@ -1055,7 +1085,7 @@
         <w:pStyle w:val="Heading2"/>
       </w:pPr>
       <w:r>
-        <w:t>2.1 状态与一致性</w:t>
+        <w:t>2.1 事务与幂等</w:t>
       </w:r>
     </w:p>
     <w:p>
@@ -1063,7 +1093,15 @@
         <w:spacing w:after="140"/>
       </w:pPr>
       <w:r>
-        <w:t>物品：可领取 → 已预约 → 已送出；取消预约后恢复可领取。交易：待确认 → 已确认 → 已完成；待确认或已确认的交易允许双方取消。物主不能领取自己的物品，只有指定领取者能确认预约，只有物主能确认送出。</w:t>
+        <w:t>物品状态为可领取、已预约、已送出；交易为待确认、已确认、已完成、已取消。创建预约、取消和完成在同一事务内检查状态并更新。唯一部分索引限制每件物品最多一笔未取消交易；重复完成不重复成交，旧取消请求不影响新预约。</w:t>
+      </w:r>
+    </w:p>
+    <w:p>
+      <w:pPr>
+        <w:pStyle w:val="Heading2"/>
+      </w:pPr>
+      <w:r>
+        <w:t>2.2 统计与性能</w:t>
       </w:r>
     </w:p>
     <w:p>
@@ -1071,39 +1109,7 @@
         <w:spacing w:after="140"/>
       </w:pPr>
       <w:r>
-        <w:t>预约创建、取消和完成在事务内校验状态并更新数据。部分唯一索引保证同一物品最多一笔未取消交易；重复确认或完成不会重复成交。交易细节只对双方开放。</w:t>
-      </w:r>
-    </w:p>
-    <w:p>
-      <w:pPr>
-        <w:pStyle w:val="Heading2"/>
-      </w:pPr>
-      <w:r>
-        <w:t>2.2 时间、价格与统计</w:t>
-      </w:r>
-    </w:p>
-    <w:p>
-      <w:pPr>
-        <w:spacing w:after="140"/>
-      </w:pPr>
-      <w:r>
-        <w:t>不足 24 小时为“刚上架”；24 至不足 72 小时为“新上架”；之后按经过整天数展示。金额以整数分保存。月统计按北京时间计算，成交仅统计已完成交易，当前在售含可领取和已预约。</w:t>
-      </w:r>
-    </w:p>
-    <w:p>
-      <w:pPr>
-        <w:pStyle w:val="Heading2"/>
-      </w:pPr>
-      <w:r>
-        <w:t>2.3 模型能力的边界</w:t>
-      </w:r>
-    </w:p>
-    <w:p>
-      <w:pPr>
-        <w:spacing w:after="140"/>
-      </w:pPr>
-      <w:r>
-        <w:t>AI 只根据输入事实优化描述，不擅自补造品牌、成色或故障状况。参考价注明不是行情估价；响应需结构校验，超时或无配置时保留用户输入。最终验收须单独记录一次真实模型调用。</w:t>
+        <w:t>金额保存整数分；时间以 UTC 毫秒存储，本月看板按北京时间统计。当前在售包含可领取和已预约。后端隔离性能复核在 1,000 件物品、5 并发、100 次读取下测得 p95 13.75ms；这是本机样本，不是线上容量保证。</w:t>
       </w:r>
     </w:p>
     <w:p>
@@ -1116,15 +1122,7 @@
         <w:pStyle w:val="Heading1"/>
       </w:pPr>
       <w:r>
-        <w:t>3.1  Web 页面：社区首页</w:t>
-      </w:r>
-    </w:p>
-    <w:p>
-      <w:pPr>
-        <w:spacing w:after="140"/>
-      </w:pPr>
-      <w:r>
-        <w:t>截图来源：本地浏览器打开项目 Web 原型后实拍。页面中的数据与 AI 建议为示例；此原型用于说明交互设计，未连接后端、数据库或真实模型。</w:t>
+        <w:t>3.1  真实运行：社区首页与数据库看板</w:t>
       </w:r>
     </w:p>
     <w:p>
@@ -1136,7 +1134,7 @@
       <w:r>
         <w:drawing>
           <wp:inline xmlns:a="http://schemas.openxmlformats.org/drawingml/2006/main" xmlns:pic="http://schemas.openxmlformats.org/drawingml/2006/picture">
-            <wp:extent cx="5760720" cy="3840480"/>
+            <wp:extent cx="5943600" cy="3343275"/>
             <wp:docPr id="1" name="Picture 1"/>
             <wp:cNvGraphicFramePr>
               <a:graphicFrameLocks noChangeAspect="1"/>
@@ -1157,7 +1155,7 @@
                   <pic:spPr>
                     <a:xfrm>
                       <a:off x="0" y="0"/>
-                      <a:ext cx="5760720" cy="3840480"/>
+                      <a:ext cx="5943600" cy="3343275"/>
                     </a:xfrm>
                     <a:prstGeom prst="rect"/>
                   </pic:spPr>
@@ -1175,15 +1173,7 @@
         <w:jc w:val="center"/>
       </w:pPr>
       <w:r>
-        <w:t>图 3-1  社区首页（Web 原型截图）</w:t>
-      </w:r>
-    </w:p>
-    <w:p>
-      <w:pPr>
-        <w:pStyle w:val="Heading2"/>
-      </w:pPr>
-      <w:r>
-        <w:t>页面说明</w:t>
+        <w:t>图 3-1  社区首页与数据库看板</w:t>
       </w:r>
     </w:p>
     <w:p>
@@ -1191,7 +1181,7 @@
         <w:spacing w:after="140"/>
       </w:pPr>
       <w:r>
-        <w:t>卡片突出物品、新鲜度、价格和所在楼栋。搜索和交易方式筛选支持组合使用；顶部统计与底部热门信息为原型示例。</w:t>
+        <w:t>真实 HTTP 读取物品和统计；当前在售包含可领取与已预约。</w:t>
       </w:r>
     </w:p>
     <w:p>
@@ -1199,7 +1189,7 @@
         <w:spacing w:after="140"/>
       </w:pPr>
       <w:r>
-        <w:t>采集条件：1440 × 960 浏览器视口；对应原型页面：home。</w:t>
+        <w:t>来源：3130 隔离 SQLite / 真实 HTTP 浏览器。采集：1280 × 720；页面：/。</w:t>
       </w:r>
     </w:p>
     <w:p>
@@ -1212,15 +1202,7 @@
         <w:pStyle w:val="Heading1"/>
       </w:pPr>
       <w:r>
-        <w:t>3.2  Web 页面：物品详情与公开留言</w:t>
-      </w:r>
-    </w:p>
-    <w:p>
-      <w:pPr>
-        <w:spacing w:after="140"/>
-      </w:pPr>
-      <w:r>
-        <w:t>截图来源：本地浏览器打开项目 Web 原型后实拍。页面中的数据与 AI 建议为示例；此原型用于说明交互设计，未连接后端、数据库或真实模型。</w:t>
+        <w:t>3.2  真实运行：物品发布</w:t>
       </w:r>
     </w:p>
     <w:p>
@@ -1232,7 +1214,7 @@
       <w:r>
         <w:drawing>
           <wp:inline xmlns:a="http://schemas.openxmlformats.org/drawingml/2006/main" xmlns:pic="http://schemas.openxmlformats.org/drawingml/2006/picture">
-            <wp:extent cx="5760720" cy="3840480"/>
+            <wp:extent cx="5943600" cy="3343275"/>
             <wp:docPr id="2" name="Picture 2"/>
             <wp:cNvGraphicFramePr>
               <a:graphicFrameLocks noChangeAspect="1"/>
@@ -1241,7 +1223,7 @@
               <a:graphicData uri="http://schemas.openxmlformats.org/drawingml/2006/picture">
                 <pic:pic>
                   <pic:nvPicPr>
-                    <pic:cNvPr id="0" name="detail-desktop.png"/>
+                    <pic:cNvPr id="0" name="publish-desktop.png"/>
                     <pic:cNvPicPr/>
                   </pic:nvPicPr>
                   <pic:blipFill>
@@ -1253,7 +1235,7 @@
                   <pic:spPr>
                     <a:xfrm>
                       <a:off x="0" y="0"/>
-                      <a:ext cx="5760720" cy="3840480"/>
+                      <a:ext cx="5943600" cy="3343275"/>
                     </a:xfrm>
                     <a:prstGeom prst="rect"/>
                   </pic:spPr>
@@ -1271,15 +1253,7 @@
         <w:jc w:val="center"/>
       </w:pPr>
       <w:r>
-        <w:t>图 3-2  物品详情与公开留言（Web 原型截图）</w:t>
-      </w:r>
-    </w:p>
-    <w:p>
-      <w:pPr>
-        <w:pStyle w:val="Heading2"/>
-      </w:pPr>
-      <w:r>
-        <w:t>页面说明</w:t>
+        <w:t>图 3-2  物品发布</w:t>
       </w:r>
     </w:p>
     <w:p>
@@ -1287,7 +1261,7 @@
         <w:spacing w:after="140"/>
       </w:pPr>
       <w:r>
-        <w:t>物品详情集中展示描述、发布者、自提方式和当前状态。用户可表达或撤回想要，公开留言可减少重复私聊。页面交互仅模拟前端状态。</w:t>
+        <w:t>真实发布表单；演示本次手动发布，未调用模型。</w:t>
       </w:r>
     </w:p>
     <w:p>
@@ -1295,7 +1269,7 @@
         <w:spacing w:after="140"/>
       </w:pPr>
       <w:r>
-        <w:t>采集条件：1440 × 960 浏览器视口；对应原型页面：detail。</w:t>
+        <w:t>来源：3130 隔离 SQLite / 真实 HTTP 浏览器。采集：1280 × 720；页面：/publish。</w:t>
       </w:r>
     </w:p>
     <w:p>
@@ -1308,15 +1282,7 @@
         <w:pStyle w:val="Heading1"/>
       </w:pPr>
       <w:r>
-        <w:t>3.3  Web 页面：物品发布与 AI 辅助</w:t>
-      </w:r>
-    </w:p>
-    <w:p>
-      <w:pPr>
-        <w:spacing w:after="140"/>
-      </w:pPr>
-      <w:r>
-        <w:t>截图来源：本地浏览器打开项目 Web 原型后实拍。页面中的数据与 AI 建议为示例；此原型用于说明交互设计，未连接后端、数据库或真实模型。</w:t>
+        <w:t>3.3  真实运行：物品详情</w:t>
       </w:r>
     </w:p>
     <w:p>
@@ -1328,7 +1294,7 @@
       <w:r>
         <w:drawing>
           <wp:inline xmlns:a="http://schemas.openxmlformats.org/drawingml/2006/main" xmlns:pic="http://schemas.openxmlformats.org/drawingml/2006/picture">
-            <wp:extent cx="5760720" cy="4064508"/>
+            <wp:extent cx="5943600" cy="3343275"/>
             <wp:docPr id="3" name="Picture 3"/>
             <wp:cNvGraphicFramePr>
               <a:graphicFrameLocks noChangeAspect="1"/>
@@ -1337,7 +1303,7 @@
               <a:graphicData uri="http://schemas.openxmlformats.org/drawingml/2006/picture">
                 <pic:pic>
                   <pic:nvPicPr>
-                    <pic:cNvPr id="0" name="publish-desktop.png"/>
+                    <pic:cNvPr id="0" name="detail-desktop.png"/>
                     <pic:cNvPicPr/>
                   </pic:nvPicPr>
                   <pic:blipFill>
@@ -1349,7 +1315,7 @@
                   <pic:spPr>
                     <a:xfrm>
                       <a:off x="0" y="0"/>
-                      <a:ext cx="5760720" cy="4064508"/>
+                      <a:ext cx="5943600" cy="3343275"/>
                     </a:xfrm>
                     <a:prstGeom prst="rect"/>
                   </pic:spPr>
@@ -1367,15 +1333,7 @@
         <w:jc w:val="center"/>
       </w:pPr>
       <w:r>
-        <w:t>图 3-3  物品发布与 AI 辅助（Web 原型截图）</w:t>
-      </w:r>
-    </w:p>
-    <w:p>
-      <w:pPr>
-        <w:pStyle w:val="Heading2"/>
-      </w:pPr>
-      <w:r>
-        <w:t>页面说明</w:t>
+        <w:t>图 3-3  物品详情</w:t>
       </w:r>
     </w:p>
     <w:p>
@@ -1383,7 +1341,7 @@
         <w:spacing w:after="140"/>
       </w:pPr>
       <w:r>
-        <w:t>左侧填写事实信息，右侧展示固定 AI 建议示例。文案与参考价格分别采用，用户仍可修改；本页没有发出真实模型请求，也不保存业务数据。</w:t>
+        <w:t>物品已真实保存；图片、描述、发布者与物品状态来自 HTTP API。</w:t>
       </w:r>
     </w:p>
     <w:p>
@@ -1391,7 +1349,7 @@
         <w:spacing w:after="140"/>
       </w:pPr>
       <w:r>
-        <w:t>采集条件：1440 × 960 浏览器视口；对应原型页面：publish。</w:t>
+        <w:t>来源：3130 隔离 SQLite / 真实 HTTP 浏览器。采集：1280 × 720；页面：/items/416a9ea7-9ac6-4c08-99fb-56ca22f80430。</w:t>
       </w:r>
     </w:p>
     <w:p>
@@ -1404,15 +1362,7 @@
         <w:pStyle w:val="Heading1"/>
       </w:pPr>
       <w:r>
-        <w:t>3.4  Web 页面：预约交接与完成</w:t>
-      </w:r>
-    </w:p>
-    <w:p>
-      <w:pPr>
-        <w:spacing w:after="140"/>
-      </w:pPr>
-      <w:r>
-        <w:t>截图来源：本地浏览器打开项目 Web 原型后实拍。页面中的数据与 AI 建议为示例；此原型用于说明交互设计，未连接后端、数据库或真实模型。</w:t>
+        <w:t>3.4  真实运行：预约与双方交接信息</w:t>
       </w:r>
     </w:p>
     <w:p>
@@ -1424,7 +1374,7 @@
       <w:r>
         <w:drawing>
           <wp:inline xmlns:a="http://schemas.openxmlformats.org/drawingml/2006/main" xmlns:pic="http://schemas.openxmlformats.org/drawingml/2006/picture">
-            <wp:extent cx="5760720" cy="3840480"/>
+            <wp:extent cx="5731266" cy="5852160"/>
             <wp:docPr id="4" name="Picture 4"/>
             <wp:cNvGraphicFramePr>
               <a:graphicFrameLocks noChangeAspect="1"/>
@@ -1433,7 +1383,7 @@
               <a:graphicData uri="http://schemas.openxmlformats.org/drawingml/2006/picture">
                 <pic:pic>
                   <pic:nvPicPr>
-                    <pic:cNvPr id="0" name="handoff-desktop.png"/>
+                    <pic:cNvPr id="0" name="reservation-desktop.png"/>
                     <pic:cNvPicPr/>
                   </pic:nvPicPr>
                   <pic:blipFill>
@@ -1445,7 +1395,7 @@
                   <pic:spPr>
                     <a:xfrm>
                       <a:off x="0" y="0"/>
-                      <a:ext cx="5760720" cy="3840480"/>
+                      <a:ext cx="5731266" cy="5852160"/>
                     </a:xfrm>
                     <a:prstGeom prst="rect"/>
                   </pic:spPr>
@@ -1463,15 +1413,7 @@
         <w:jc w:val="center"/>
       </w:pPr>
       <w:r>
-        <w:t>图 3-4  预约交接与完成（Web 原型截图）</w:t>
-      </w:r>
-    </w:p>
-    <w:p>
-      <w:pPr>
-        <w:pStyle w:val="Heading2"/>
-      </w:pPr>
-      <w:r>
-        <w:t>页面说明</w:t>
+        <w:t>图 3-4  预约与双方交接信息</w:t>
       </w:r>
     </w:p>
     <w:p>
@@ -1479,7 +1421,7 @@
         <w:spacing w:after="140"/>
       </w:pPr>
       <w:r>
-        <w:t>发布者查看领取人、时间、公共交接地点和确认进度。页面可演示取消、完成二次确认和状态反馈；这些操作未写入后端。</w:t>
+        <w:t>发布者选择意向用户和公共地点；真实预约状态为待确认。</w:t>
       </w:r>
     </w:p>
     <w:p>
@@ -1487,7 +1429,247 @@
         <w:spacing w:after="140"/>
       </w:pPr>
       <w:r>
-        <w:t>采集条件：1440 × 960 浏览器视口；对应原型页面：handoff。</w:t>
+        <w:t>来源：3130 隔离 SQLite / 真实 HTTP 浏览器。采集：1280 × 720；页面：/items/416a9ea7-9ac6-4c08-99fb-56ca22f80430。</w:t>
+      </w:r>
+    </w:p>
+    <w:p>
+      <w:r>
+        <w:br w:type="page"/>
+      </w:r>
+    </w:p>
+    <w:p>
+      <w:pPr>
+        <w:pStyle w:val="Heading1"/>
+      </w:pPr>
+      <w:r>
+        <w:t>3.5  真实运行：已送出归档</w:t>
+      </w:r>
+    </w:p>
+    <w:p>
+      <w:pPr>
+        <w:keepNext/>
+        <w:spacing w:after="40"/>
+        <w:jc w:val="center"/>
+      </w:pPr>
+      <w:r>
+        <w:drawing>
+          <wp:inline xmlns:a="http://schemas.openxmlformats.org/drawingml/2006/main" xmlns:pic="http://schemas.openxmlformats.org/drawingml/2006/picture">
+            <wp:extent cx="5943600" cy="4471630"/>
+            <wp:docPr id="5" name="Picture 5"/>
+            <wp:cNvGraphicFramePr>
+              <a:graphicFrameLocks noChangeAspect="1"/>
+            </wp:cNvGraphicFramePr>
+            <a:graphic>
+              <a:graphicData uri="http://schemas.openxmlformats.org/drawingml/2006/picture">
+                <pic:pic>
+                  <pic:nvPicPr>
+                    <pic:cNvPr id="0" name="archive-desktop.png"/>
+                    <pic:cNvPicPr/>
+                  </pic:nvPicPr>
+                  <pic:blipFill>
+                    <a:blip r:embed="rId15"/>
+                    <a:stretch>
+                      <a:fillRect/>
+                    </a:stretch>
+                  </pic:blipFill>
+                  <pic:spPr>
+                    <a:xfrm>
+                      <a:off x="0" y="0"/>
+                      <a:ext cx="5943600" cy="4471630"/>
+                    </a:xfrm>
+                    <a:prstGeom prst="rect"/>
+                  </pic:spPr>
+                </pic:pic>
+              </a:graphicData>
+            </a:graphic>
+          </wp:inline>
+        </w:drawing>
+      </w:r>
+    </w:p>
+    <w:p>
+      <w:pPr>
+        <w:pStyle w:val="Caption"/>
+        <w:spacing w:after="140"/>
+        <w:jc w:val="center"/>
+      </w:pPr>
+      <w:r>
+        <w:t>图 3-5  已送出归档</w:t>
+      </w:r>
+    </w:p>
+    <w:p>
+      <w:pPr>
+        <w:spacing w:after="140"/>
+      </w:pPr>
+      <w:r>
+        <w:t>本次演示交易已完成并归档；历史详情与留言保留，写操作关闭。</w:t>
+      </w:r>
+    </w:p>
+    <w:p>
+      <w:pPr>
+        <w:spacing w:after="140"/>
+      </w:pPr>
+      <w:r>
+        <w:t>来源：3130 隔离 SQLite / 真实 HTTP 浏览器。采集：1280 × 720；页面：/items/416a9ea7-9ac6-4c08-99fb-56ca22f80430。</w:t>
+      </w:r>
+    </w:p>
+    <w:p>
+      <w:r>
+        <w:br w:type="page"/>
+      </w:r>
+    </w:p>
+    <w:p>
+      <w:pPr>
+        <w:pStyle w:val="Heading1"/>
+      </w:pPr>
+      <w:r>
+        <w:t>3.6  真实运行：真实 AI 建议预览（既有验收截图）</w:t>
+      </w:r>
+    </w:p>
+    <w:p>
+      <w:pPr>
+        <w:keepNext/>
+        <w:spacing w:after="40"/>
+        <w:jc w:val="center"/>
+      </w:pPr>
+      <w:r>
+        <w:drawing>
+          <wp:inline xmlns:a="http://schemas.openxmlformats.org/drawingml/2006/main" xmlns:pic="http://schemas.openxmlformats.org/drawingml/2006/picture">
+            <wp:extent cx="5938767" cy="5852160"/>
+            <wp:docPr id="6" name="Picture 6"/>
+            <wp:cNvGraphicFramePr>
+              <a:graphicFrameLocks noChangeAspect="1"/>
+            </wp:cNvGraphicFramePr>
+            <a:graphic>
+              <a:graphicData uri="http://schemas.openxmlformats.org/drawingml/2006/picture">
+                <pic:pic>
+                  <pic:nvPicPr>
+                    <pic:cNvPr id="0" name="ai-preview.png"/>
+                    <pic:cNvPicPr/>
+                  </pic:nvPicPr>
+                  <pic:blipFill>
+                    <a:blip r:embed="rId16"/>
+                    <a:stretch>
+                      <a:fillRect/>
+                    </a:stretch>
+                  </pic:blipFill>
+                  <pic:spPr>
+                    <a:xfrm>
+                      <a:off x="0" y="0"/>
+                      <a:ext cx="5938767" cy="5852160"/>
+                    </a:xfrm>
+                    <a:prstGeom prst="rect"/>
+                  </pic:spPr>
+                </pic:pic>
+              </a:graphicData>
+            </a:graphic>
+          </wp:inline>
+        </w:drawing>
+      </w:r>
+    </w:p>
+    <w:p>
+      <w:pPr>
+        <w:pStyle w:val="Caption"/>
+        <w:spacing w:after="140"/>
+        <w:jc w:val="center"/>
+      </w:pPr>
+      <w:r>
+        <w:t>图 3-6  真实 AI 建议预览（既有验收截图）</w:t>
+      </w:r>
+    </w:p>
+    <w:p>
+      <w:pPr>
+        <w:spacing w:after="140"/>
+      </w:pPr>
+      <w:r>
+        <w:t>协调者在真实 3000 环境进行第 5 次 DeepSeek 调用：FLEXIBLE/null。核验文案事实后采用并手动发布；本次材料录制没有新增调用，也不声称本次获得数值报价。</w:t>
+      </w:r>
+    </w:p>
+    <w:p>
+      <w:pPr>
+        <w:spacing w:after="140"/>
+      </w:pPr>
+      <w:r>
+        <w:t>来源：3000 真实全栈；协调者已完成的第 5 次模型调用，复用原始截图。采集：1440 × 1000，全页截图；页面：/publish。</w:t>
+      </w:r>
+    </w:p>
+    <w:p>
+      <w:r>
+        <w:br w:type="page"/>
+      </w:r>
+    </w:p>
+    <w:p>
+      <w:pPr>
+        <w:pStyle w:val="Heading1"/>
+      </w:pPr>
+      <w:r>
+        <w:t>3.7  真实运行：采用 AI 文案后真实发布（既有验收截图）</w:t>
+      </w:r>
+    </w:p>
+    <w:p>
+      <w:pPr>
+        <w:keepNext/>
+        <w:spacing w:after="40"/>
+        <w:jc w:val="center"/>
+      </w:pPr>
+      <w:r>
+        <w:drawing>
+          <wp:inline xmlns:a="http://schemas.openxmlformats.org/drawingml/2006/main" xmlns:pic="http://schemas.openxmlformats.org/drawingml/2006/picture">
+            <wp:extent cx="5943600" cy="4552632"/>
+            <wp:docPr id="7" name="Picture 7"/>
+            <wp:cNvGraphicFramePr>
+              <a:graphicFrameLocks noChangeAspect="1"/>
+            </wp:cNvGraphicFramePr>
+            <a:graphic>
+              <a:graphicData uri="http://schemas.openxmlformats.org/drawingml/2006/picture">
+                <pic:pic>
+                  <pic:nvPicPr>
+                    <pic:cNvPr id="0" name="ai-published.png"/>
+                    <pic:cNvPicPr/>
+                  </pic:nvPicPr>
+                  <pic:blipFill>
+                    <a:blip r:embed="rId17"/>
+                    <a:stretch>
+                      <a:fillRect/>
+                    </a:stretch>
+                  </pic:blipFill>
+                  <pic:spPr>
+                    <a:xfrm>
+                      <a:off x="0" y="0"/>
+                      <a:ext cx="5943600" cy="4552632"/>
+                    </a:xfrm>
+                    <a:prstGeom prst="rect"/>
+                  </pic:spPr>
+                </pic:pic>
+              </a:graphicData>
+            </a:graphic>
+          </wp:inline>
+        </w:drawing>
+      </w:r>
+    </w:p>
+    <w:p>
+      <w:pPr>
+        <w:pStyle w:val="Caption"/>
+        <w:spacing w:after="140"/>
+        <w:jc w:val="center"/>
+      </w:pPr>
+      <w:r>
+        <w:t>图 3-7  采用 AI 文案后真实发布（既有验收截图）</w:t>
+      </w:r>
+    </w:p>
+    <w:p>
+      <w:pPr>
+        <w:spacing w:after="140"/>
+      </w:pPr>
+      <w:r>
+        <w:t>已采用文案与建议交易方式并手动确认发布；详情加载完成后采集。对应上一幅既有真实调用，不是视频录制期间新调用。</w:t>
+      </w:r>
+    </w:p>
+    <w:p>
+      <w:pPr>
+        <w:spacing w:after="140"/>
+      </w:pPr>
+      <w:r>
+        <w:t>来源：3000 真实全栈；协调者已完成的发布操作，复用原始截图。采集：1440 × 1000，全页截图；页面：/items/:id。</w:t>
       </w:r>
     </w:p>
     <w:p>
@@ -1508,7 +1690,7 @@
         <w:spacing w:after="140"/>
       </w:pPr>
       <w:r>
-        <w:t>采用 Chen 表示法：矩形表示实体，椭圆表示属性，菱形表示联系，主键属性加下划线，直线无箭头，1 / n 表示联系的最大基数。共包含 6 张实体属性图、3 张局部联系图和 1 张全局图。</w:t>
+        <w:t>Chen 表示法：矩形是实体，椭圆是属性，菱形是联系，主键名称加下划线，直线无箭头，1 / n 表示最大基数。共 6 张实体属性图、3 张局部图和 1 张全局图。图内只保留模型结构与名称。</w:t>
       </w:r>
     </w:p>
     <w:p>
@@ -1521,7 +1703,7 @@
         <w:drawing>
           <wp:inline xmlns:a="http://schemas.openxmlformats.org/drawingml/2006/main" xmlns:pic="http://schemas.openxmlformats.org/drawingml/2006/picture">
             <wp:extent cx="5486400" cy="4620333"/>
-            <wp:docPr id="5" name="Picture 5"/>
+            <wp:docPr id="8" name="Picture 8"/>
             <wp:cNvGraphicFramePr>
               <a:graphicFrameLocks noChangeAspect="1"/>
             </wp:cNvGraphicFramePr>
@@ -1533,7 +1715,7 @@
                     <pic:cNvPicPr/>
                   </pic:nvPicPr>
                   <pic:blipFill>
-                    <a:blip r:embed="rId15"/>
+                    <a:blip r:embed="rId18"/>
                     <a:stretch>
                       <a:fillRect/>
                     </a:stretch>
@@ -1567,7 +1749,7 @@
         <w:spacing w:after="140"/>
       </w:pPr>
       <w:r>
-        <w:t>六个实体为用户、登录会话、物品、意向记录、留言和交易记录，实体属性见第 5 节。取消联系可选，交易有零个或一个取消人；物品与交易的一对多包含取消历史，不表示允许同时成交给多人。</w:t>
+        <w:t>六个实体为用户、登录会话、物品、意向记录、留言和交易记录，属性见第 5 节。取消联系可选，交易有零个或一个取消人；物品与交易的一对多包含取消历史，不表示同时成交给多人。</w:t>
       </w:r>
     </w:p>
     <w:p>
@@ -1593,7 +1775,7 @@
         <w:drawing>
           <wp:inline xmlns:a="http://schemas.openxmlformats.org/drawingml/2006/main" xmlns:pic="http://schemas.openxmlformats.org/drawingml/2006/picture">
             <wp:extent cx="5166360" cy="2771969"/>
-            <wp:docPr id="6" name="Picture 6"/>
+            <wp:docPr id="9" name="Picture 9"/>
             <wp:cNvGraphicFramePr>
               <a:graphicFrameLocks noChangeAspect="1"/>
             </wp:cNvGraphicFramePr>
@@ -1605,7 +1787,7 @@
                     <pic:cNvPicPr/>
                   </pic:nvPicPr>
                   <pic:blipFill>
-                    <a:blip r:embed="rId16"/>
+                    <a:blip r:embed="rId19"/>
                     <a:stretch>
                       <a:fillRect/>
                     </a:stretch>
@@ -1644,7 +1826,7 @@
         <w:drawing>
           <wp:inline xmlns:a="http://schemas.openxmlformats.org/drawingml/2006/main" xmlns:pic="http://schemas.openxmlformats.org/drawingml/2006/picture">
             <wp:extent cx="5166360" cy="2771969"/>
-            <wp:docPr id="7" name="Picture 7"/>
+            <wp:docPr id="10" name="Picture 10"/>
             <wp:cNvGraphicFramePr>
               <a:graphicFrameLocks noChangeAspect="1"/>
             </wp:cNvGraphicFramePr>
@@ -1656,7 +1838,7 @@
                     <pic:cNvPicPr/>
                   </pic:nvPicPr>
                   <pic:blipFill>
-                    <a:blip r:embed="rId17"/>
+                    <a:blip r:embed="rId20"/>
                     <a:stretch>
                       <a:fillRect/>
                     </a:stretch>
@@ -1690,7 +1872,7 @@
         <w:spacing w:after="140"/>
       </w:pPr>
       <w:r>
-        <w:t>标识属性以椭圆内文字下划线表示。外键通过联系图表达；字段英文名、数据类型和约束见 SRS。</w:t>
+        <w:t>标识属性以椭圆内文字下划线表示。外键通过联系图表达；字段英文名、数据类型和约束见迁移核对记录。</w:t>
       </w:r>
     </w:p>
     <w:p>
@@ -1716,7 +1898,7 @@
         <w:drawing>
           <wp:inline xmlns:a="http://schemas.openxmlformats.org/drawingml/2006/main" xmlns:pic="http://schemas.openxmlformats.org/drawingml/2006/picture">
             <wp:extent cx="5166360" cy="2750136"/>
-            <wp:docPr id="8" name="Picture 8"/>
+            <wp:docPr id="11" name="Picture 11"/>
             <wp:cNvGraphicFramePr>
               <a:graphicFrameLocks noChangeAspect="1"/>
             </wp:cNvGraphicFramePr>
@@ -1728,7 +1910,7 @@
                     <pic:cNvPicPr/>
                   </pic:nvPicPr>
                   <pic:blipFill>
-                    <a:blip r:embed="rId18"/>
+                    <a:blip r:embed="rId21"/>
                     <a:stretch>
                       <a:fillRect/>
                     </a:stretch>
@@ -1767,7 +1949,7 @@
         <w:drawing>
           <wp:inline xmlns:a="http://schemas.openxmlformats.org/drawingml/2006/main" xmlns:pic="http://schemas.openxmlformats.org/drawingml/2006/picture">
             <wp:extent cx="5166360" cy="2771969"/>
-            <wp:docPr id="9" name="Picture 9"/>
+            <wp:docPr id="12" name="Picture 12"/>
             <wp:cNvGraphicFramePr>
               <a:graphicFrameLocks noChangeAspect="1"/>
             </wp:cNvGraphicFramePr>
@@ -1779,7 +1961,7 @@
                     <pic:cNvPicPr/>
                   </pic:nvPicPr>
                   <pic:blipFill>
-                    <a:blip r:embed="rId19"/>
+                    <a:blip r:embed="rId22"/>
                     <a:stretch>
                       <a:fillRect/>
                     </a:stretch>
@@ -1831,7 +2013,7 @@
         <w:drawing>
           <wp:inline xmlns:a="http://schemas.openxmlformats.org/drawingml/2006/main" xmlns:pic="http://schemas.openxmlformats.org/drawingml/2006/picture">
             <wp:extent cx="5166360" cy="2493219"/>
-            <wp:docPr id="10" name="Picture 10"/>
+            <wp:docPr id="13" name="Picture 13"/>
             <wp:cNvGraphicFramePr>
               <a:graphicFrameLocks noChangeAspect="1"/>
             </wp:cNvGraphicFramePr>
@@ -1843,7 +2025,7 @@
                     <pic:cNvPicPr/>
                   </pic:nvPicPr>
                   <pic:blipFill>
-                    <a:blip r:embed="rId20"/>
+                    <a:blip r:embed="rId23"/>
                     <a:stretch>
                       <a:fillRect/>
                     </a:stretch>
@@ -1882,7 +2064,7 @@
         <w:drawing>
           <wp:inline xmlns:a="http://schemas.openxmlformats.org/drawingml/2006/main" xmlns:pic="http://schemas.openxmlformats.org/drawingml/2006/picture">
             <wp:extent cx="5166360" cy="2739242"/>
-            <wp:docPr id="11" name="Picture 11"/>
+            <wp:docPr id="14" name="Picture 14"/>
             <wp:cNvGraphicFramePr>
               <a:graphicFrameLocks noChangeAspect="1"/>
             </wp:cNvGraphicFramePr>
@@ -1894,7 +2076,7 @@
                     <pic:cNvPicPr/>
                   </pic:nvPicPr>
                   <pic:blipFill>
-                    <a:blip r:embed="rId21"/>
+                    <a:blip r:embed="rId24"/>
                     <a:stretch>
                       <a:fillRect/>
                     </a:stretch>
@@ -1946,7 +2128,7 @@
         <w:drawing>
           <wp:inline xmlns:a="http://schemas.openxmlformats.org/drawingml/2006/main" xmlns:pic="http://schemas.openxmlformats.org/drawingml/2006/picture">
             <wp:extent cx="5760720" cy="3314941"/>
-            <wp:docPr id="12" name="Picture 12"/>
+            <wp:docPr id="15" name="Picture 15"/>
             <wp:cNvGraphicFramePr>
               <a:graphicFrameLocks noChangeAspect="1"/>
             </wp:cNvGraphicFramePr>
@@ -1958,7 +2140,7 @@
                     <pic:cNvPicPr/>
                   </pic:nvPicPr>
                   <pic:blipFill>
-                    <a:blip r:embed="rId22"/>
+                    <a:blip r:embed="rId25"/>
                     <a:stretch>
                       <a:fillRect/>
                     </a:stretch>
@@ -1992,7 +2174,7 @@
         <w:spacing w:after="140"/>
       </w:pPr>
       <w:r>
-        <w:t>一个用户可拥有多个会话、发布多件物品。会话与物品各属于一个用户。</w:t>
+        <w:t>一个用户可拥有多个会话、发布多件物品。会话和物品各属于一个用户。</w:t>
       </w:r>
     </w:p>
     <w:p>
@@ -2018,7 +2200,7 @@
         <w:drawing>
           <wp:inline xmlns:a="http://schemas.openxmlformats.org/drawingml/2006/main" xmlns:pic="http://schemas.openxmlformats.org/drawingml/2006/picture">
             <wp:extent cx="5760720" cy="3250078"/>
-            <wp:docPr id="13" name="Picture 13"/>
+            <wp:docPr id="16" name="Picture 16"/>
             <wp:cNvGraphicFramePr>
               <a:graphicFrameLocks noChangeAspect="1"/>
             </wp:cNvGraphicFramePr>
@@ -2030,7 +2212,7 @@
                     <pic:cNvPicPr/>
                   </pic:nvPicPr>
                   <pic:blipFill>
-                    <a:blip r:embed="rId23"/>
+                    <a:blip r:embed="rId26"/>
                     <a:stretch>
                       <a:fillRect/>
                     </a:stretch>
@@ -2064,7 +2246,7 @@
         <w:spacing w:after="140"/>
       </w:pPr>
       <w:r>
-        <w:t>每条意向或留言关联一个用户和一件物品。同一用户对同一物品只有一条意向记录，撤回后可再次激活。</w:t>
+        <w:t>每条意向或留言关联一个用户和一件物品。同一用户对同一物品仅一条意向记录，撤回后可重新激活。</w:t>
       </w:r>
     </w:p>
     <w:p>
@@ -2090,7 +2272,7 @@
         <w:drawing>
           <wp:inline xmlns:a="http://schemas.openxmlformats.org/drawingml/2006/main" xmlns:pic="http://schemas.openxmlformats.org/drawingml/2006/picture">
             <wp:extent cx="5760720" cy="3182112"/>
-            <wp:docPr id="14" name="Picture 14"/>
+            <wp:docPr id="17" name="Picture 17"/>
             <wp:cNvGraphicFramePr>
               <a:graphicFrameLocks noChangeAspect="1"/>
             </wp:cNvGraphicFramePr>
@@ -2102,7 +2284,7 @@
                     <pic:cNvPicPr/>
                   </pic:nvPicPr>
                   <pic:blipFill>
-                    <a:blip r:embed="rId24"/>
+                    <a:blip r:embed="rId27"/>
                     <a:stretch>
                       <a:fillRect/>
                     </a:stretch>
@@ -2136,7 +2318,7 @@
         <w:spacing w:after="140"/>
       </w:pPr>
       <w:r>
-        <w:t>每笔交易关联一件物品和一个指定领取者；发布者由物品确定。取消联系可选，取消人必须是双方之一；一件物品可有多次取消历史，但最多一笔未取消交易。</w:t>
+        <w:t>每笔交易关联一件物品和一个领取者；发布者由物品确定。取消联系可选，取消人限交易双方；每件物品可有多次取消历史，但最多一笔未取消交易。</w:t>
       </w:r>
     </w:p>
     <w:p>
@@ -2149,7 +2331,15 @@
         <w:pStyle w:val="Heading1"/>
       </w:pPr>
       <w:r>
-        <w:t>7  关系模式与完整性约束</w:t>
+        <w:t>7  实际迁移与完整性核对</w:t>
+      </w:r>
+    </w:p>
+    <w:p>
+      <w:pPr>
+        <w:spacing w:after="140"/>
+      </w:pPr>
+      <w:r>
+        <w:t>已在独立内存数据库执行 migration001 和 migration002，核验 user_version=2、6 张表、9 个外键及全部属性。v2 仅把物品图片标识白名单扩展到 30 项，没有改变实体或联系；现有 10 张图与迁移一致。</w:t>
       </w:r>
     </w:p>
     <w:tbl>
@@ -2201,7 +2391,7 @@
                 <w:b/>
                 <w:sz w:val="20"/>
               </w:rPr>
-              <w:t>主键与关键引用</w:t>
+              <w:t>主键与引用</w:t>
             </w:r>
           </w:p>
         </w:tc>
@@ -2219,7 +2409,7 @@
                 <w:b/>
                 <w:sz w:val="20"/>
               </w:rPr>
-              <w:t>主要约束</w:t>
+              <w:t>核对的约束</w:t>
             </w:r>
           </w:p>
         </w:tc>
@@ -2275,7 +2465,7 @@
                 <w:b w:val="0"/>
                 <w:sz w:val="20"/>
               </w:rPr>
-              <w:t>昵称与楼栋；用户可同时承担发布和领取角色</w:t>
+              <w:t>昵称、楼栋、创建时间</w:t>
             </w:r>
           </w:p>
         </w:tc>
@@ -2331,7 +2521,7 @@
                 <w:b w:val="0"/>
                 <w:sz w:val="20"/>
               </w:rPr>
-              <w:t>token_hash 唯一，仅保存令牌哈希，支持过期</w:t>
+              <w:t>token_hash 唯一、到期时间晚于创建时间</w:t>
             </w:r>
           </w:p>
         </w:tc>
@@ -2387,7 +2577,7 @@
                 <w:b w:val="0"/>
                 <w:sz w:val="20"/>
               </w:rPr>
-              <w:t>交易方式与金额匹配；GIVEN 必须有送出时间</w:t>
+              <w:t>价格与交易方式匹配、GIVEN 送出时间、30 图片标识</w:t>
             </w:r>
           </w:p>
         </w:tc>
@@ -2443,7 +2633,7 @@
                 <w:b w:val="0"/>
                 <w:sz w:val="20"/>
               </w:rPr>
-              <w:t>(item_id,user_id) 联合唯一；active 标记有效状态</w:t>
+              <w:t>联合唯一与 active 有效状态</w:t>
             </w:r>
           </w:p>
         </w:tc>
@@ -2499,7 +2689,7 @@
                 <w:b w:val="0"/>
                 <w:sz w:val="20"/>
               </w:rPr>
-              <w:t>归档物品不可新增留言；正文为纯文本</w:t>
+              <w:t>正文长度 CHECK，创建时间</w:t>
             </w:r>
           </w:p>
         </w:tc>
@@ -2555,7 +2745,7 @@
                 <w:b w:val="0"/>
                 <w:sz w:val="20"/>
               </w:rPr>
-              <w:t>状态时间字段一致；取消人可空；未取消交易部分唯一</w:t>
+              <w:t>状态时间 CHECK、可空取消人、未取消交易唯一索引</w:t>
             </w:r>
           </w:p>
         </w:tc>
@@ -2566,31 +2756,7 @@
         <w:spacing w:after="140"/>
       </w:pPr>
       <w:r>
-        <w:t>ID 使用 UUID；数据库时间采用 UTC 毫秒，API 使用带时区的 ISO 8601。外键、CHECK 与唯一索引由迁移建立；跨表身份和状态条件在同一事务中校验。图纸在开发完成后还须对照实际迁移复核。</w:t>
-      </w:r>
-    </w:p>
-    <w:p>
-      <w:pPr>
-        <w:pStyle w:val="Heading2"/>
-      </w:pPr>
-      <w:r>
-        <w:t>7.1 关键约束示例</w:t>
-      </w:r>
-    </w:p>
-    <w:p>
-      <w:pPr>
-        <w:spacing w:after="140"/>
-      </w:pPr>
-      <w:r>
-        <w:t>免费送价格为 0；随便给无固定价格；标价为正整数分。一个物品可以有多次取消的历史交易，但 PENDING、CONFIRMED、COMPLETED 范围内最多一条交易。</w:t>
-      </w:r>
-    </w:p>
-    <w:p>
-      <w:pPr>
-        <w:spacing w:after="140"/>
-      </w:pPr>
-      <w:r>
-        <w:t>交易完成时，交易状态与物品状态同时更新，完成时间保持一致。重复完成返回原结果，不新增成交记录；旧取消请求不能影响后续新预约。</w:t>
+        <w:t>图展示概念结构。字段类型、最小参与、唯一索引、金额和状态 CHECK 属于逻辑约束，不在图内堆放说明。物主不能领取自己物品、取消人限双方、跨表状态同步等规则由服务端事务和权限检查保证。逐字段记录见 docs/delivery/erd-verification.md。</w:t>
       </w:r>
     </w:p>
     <w:p>
@@ -2603,15 +2769,7 @@
         <w:pStyle w:val="Heading1"/>
       </w:pPr>
       <w:r>
-        <w:t>8  开发计划、验证与交付状态</w:t>
-      </w:r>
-    </w:p>
-    <w:p>
-      <w:pPr>
-        <w:spacing w:after="140"/>
-      </w:pPr>
-      <w:r>
-        <w:t>GitHub Epic #1 下设 6 个必需交付任务，另有 1 个可选部署任务。工程与契约完成后，完整前端 #9 和完整后端 #4 分别由一个会话独立并行开发，再由 #11 联调、#12 制作最终材料。前端以统一 API 适配层预留接口，开发 Mock 只用于独立交互演示。页面原型与本报告不代表这些开发任务已完成。</w:t>
+        <w:t>8  测试、真实 AI 与已知边界</w:t>
       </w:r>
     </w:p>
     <w:tbl>
@@ -2622,9 +2780,8 @@
         <w:tblLook w:firstColumn="1" w:firstRow="1" w:lastColumn="0" w:lastRow="0" w:noHBand="0" w:noVBand="1" w:val="04A0"/>
       </w:tblPr>
       <w:tblGrid>
-        <w:gridCol w:w="1701"/>
-        <w:gridCol w:w="2835"/>
-        <w:gridCol w:w="5102"/>
+        <w:gridCol w:w="2268"/>
+        <w:gridCol w:w="7370"/>
       </w:tblGrid>
       <w:tr>
         <w:trPr>
@@ -2633,7 +2790,7 @@
         </w:trPr>
         <w:tc>
           <w:tcPr>
-            <w:tcW w:type="dxa" w:w="1701"/>
+            <w:tcW w:type="dxa" w:w="2268"/>
             <w:shd w:fill="EAF0EE"/>
           </w:tcPr>
           <w:p>
@@ -2645,13 +2802,13 @@
                 <w:b/>
                 <w:sz w:val="20"/>
               </w:rPr>
-              <w:t>验证项</w:t>
+              <w:t>验证</w:t>
             </w:r>
           </w:p>
         </w:tc>
         <w:tc>
           <w:tcPr>
-            <w:tcW w:type="dxa" w:w="2835"/>
+            <w:tcW w:type="dxa" w:w="7370"/>
             <w:shd w:fill="EAF0EE"/>
           </w:tcPr>
           <w:p>
@@ -2663,25 +2820,7 @@
                 <w:b/>
                 <w:sz w:val="20"/>
               </w:rPr>
-              <w:t>验收要求</w:t>
-            </w:r>
-          </w:p>
-        </w:tc>
-        <w:tc>
-          <w:tcPr>
-            <w:tcW w:type="dxa" w:w="5102"/>
-            <w:shd w:fill="EAF0EE"/>
-          </w:tcPr>
-          <w:p>
-            <w:pPr>
-              <w:spacing w:after="80" w:before="80"/>
-            </w:pPr>
-            <w:r>
-              <w:rPr>
-                <w:b/>
-                <w:sz w:val="20"/>
-              </w:rPr>
-              <w:t>当前状态</w:t>
+              <w:t>实际结果</w:t>
             </w:r>
           </w:p>
         </w:tc>
@@ -2692,7 +2831,7 @@
         </w:trPr>
         <w:tc>
           <w:tcPr>
-            <w:tcW w:type="dxa" w:w="1701"/>
+            <w:tcW w:type="dxa" w:w="2268"/>
           </w:tcPr>
           <w:p>
             <w:pPr>
@@ -2703,13 +2842,13 @@
                 <w:b w:val="0"/>
                 <w:sz w:val="20"/>
               </w:rPr>
-              <w:t>双角色交易</w:t>
+              <w:t>单元与集成</w:t>
             </w:r>
           </w:p>
         </w:tc>
         <w:tc>
           <w:tcPr>
-            <w:tcW w:type="dxa" w:w="2835"/>
+            <w:tcW w:type="dxa" w:w="7370"/>
           </w:tcPr>
           <w:p>
             <w:pPr>
@@ -2720,13 +2859,18 @@
                 <w:b w:val="0"/>
                 <w:sz w:val="20"/>
               </w:rPr>
-              <w:t>发布→想要→预约→确认→完成→归档</w:t>
+              <w:t>102 项通过；含会话、权限、状态事务、回滚、幂等、月边界、AI 异常</w:t>
             </w:r>
           </w:p>
         </w:tc>
+      </w:tr>
+      <w:tr>
+        <w:trPr>
+          <w:cantSplit/>
+        </w:trPr>
         <w:tc>
           <w:tcPr>
-            <w:tcW w:type="dxa" w:w="5102"/>
+            <w:tcW w:type="dxa" w:w="2268"/>
           </w:tcPr>
           <w:p>
             <w:pPr>
@@ -2737,7 +2881,24 @@
                 <w:b w:val="0"/>
                 <w:sz w:val="20"/>
               </w:rPr>
-              <w:t>待实现与验证</w:t>
+              <w:t>真实 HTTP E2E</w:t>
+            </w:r>
+          </w:p>
+        </w:tc>
+        <w:tc>
+          <w:tcPr>
+            <w:tcW w:type="dxa" w:w="7370"/>
+          </w:tcPr>
+          <w:p>
+            <w:pPr>
+              <w:spacing w:after="80" w:before="80"/>
+            </w:pPr>
+            <w:r>
+              <w:rPr>
+                <w:b w:val="0"/>
+                <w:sz w:val="20"/>
+              </w:rPr>
+              <w:t>4 项通过；双身份完整交易、拒绝重约、30 图片解码、独立进程重启持久化</w:t>
             </w:r>
           </w:p>
         </w:tc>
@@ -2748,7 +2909,7 @@
         </w:trPr>
         <w:tc>
           <w:tcPr>
-            <w:tcW w:type="dxa" w:w="1701"/>
+            <w:tcW w:type="dxa" w:w="2268"/>
           </w:tcPr>
           <w:p>
             <w:pPr>
@@ -2759,13 +2920,13 @@
                 <w:b w:val="0"/>
                 <w:sz w:val="20"/>
               </w:rPr>
-              <w:t>权限与并发</w:t>
+              <w:t>页面核验</w:t>
             </w:r>
           </w:p>
         </w:tc>
         <w:tc>
           <w:tcPr>
-            <w:tcW w:type="dxa" w:w="2835"/>
+            <w:tcW w:type="dxa" w:w="7370"/>
           </w:tcPr>
           <w:p>
             <w:pPr>
@@ -2776,13 +2937,18 @@
                 <w:b w:val="0"/>
                 <w:sz w:val="20"/>
               </w:rPr>
-              <w:t>越权拒绝、同一物品唯一有效预约、重试幂等</w:t>
+              <w:t>桌面与手机无横向溢出；本次录制无页面脚本错误，成交统计增加 1</w:t>
             </w:r>
           </w:p>
         </w:tc>
+      </w:tr>
+      <w:tr>
+        <w:trPr>
+          <w:cantSplit/>
+        </w:trPr>
         <w:tc>
           <w:tcPr>
-            <w:tcW w:type="dxa" w:w="5102"/>
+            <w:tcW w:type="dxa" w:w="2268"/>
           </w:tcPr>
           <w:p>
             <w:pPr>
@@ -2793,7 +2959,24 @@
                 <w:b w:val="0"/>
                 <w:sz w:val="20"/>
               </w:rPr>
-              <w:t>待实现与验证</w:t>
+              <w:t>真实模型</w:t>
+            </w:r>
+          </w:p>
+        </w:tc>
+        <w:tc>
+          <w:tcPr>
+            <w:tcW w:type="dxa" w:w="7370"/>
+          </w:tcPr>
+          <w:p>
+            <w:pPr>
+              <w:spacing w:after="80" w:before="80"/>
+            </w:pPr>
+            <w:r>
+              <w:rPr>
+                <w:b w:val="0"/>
+                <w:sz w:val="20"/>
+              </w:rPr>
+              <w:t>累计 5 次 DeepSeek 请求：4 次脚本、1 次浏览器；本次交付零新增调用</w:t>
             </w:r>
           </w:p>
         </w:tc>
@@ -2804,7 +2987,7 @@
         </w:trPr>
         <w:tc>
           <w:tcPr>
-            <w:tcW w:type="dxa" w:w="1701"/>
+            <w:tcW w:type="dxa" w:w="2268"/>
           </w:tcPr>
           <w:p>
             <w:pPr>
@@ -2815,13 +2998,13 @@
                 <w:b w:val="0"/>
                 <w:sz w:val="20"/>
               </w:rPr>
-              <w:t>数据持久化</w:t>
+              <w:t>干净启动</w:t>
             </w:r>
           </w:p>
         </w:tc>
         <w:tc>
           <w:tcPr>
-            <w:tcW w:type="dxa" w:w="2835"/>
+            <w:tcW w:type="dxa" w:w="7370"/>
           </w:tcPr>
           <w:p>
             <w:pPr>
@@ -2832,13 +3015,18 @@
                 <w:b w:val="0"/>
                 <w:sz w:val="20"/>
               </w:rPr>
-              <w:t>迁移、种子及服务重启后数据保存</w:t>
+              <w:t>协调者 clone 237b491 后安装、构建、迁移、种子、启动成功；首页、健康、图片 200</w:t>
             </w:r>
           </w:p>
         </w:tc>
+      </w:tr>
+      <w:tr>
+        <w:trPr>
+          <w:cantSplit/>
+        </w:trPr>
         <w:tc>
           <w:tcPr>
-            <w:tcW w:type="dxa" w:w="5102"/>
+            <w:tcW w:type="dxa" w:w="2268"/>
           </w:tcPr>
           <w:p>
             <w:pPr>
@@ -2849,18 +3037,13 @@
                 <w:b w:val="0"/>
                 <w:sz w:val="20"/>
               </w:rPr>
-              <w:t>待实现与验证</w:t>
+              <w:t>远端部署</w:t>
             </w:r>
           </w:p>
         </w:tc>
-      </w:tr>
-      <w:tr>
-        <w:trPr>
-          <w:cantSplit/>
-        </w:trPr>
         <w:tc>
           <w:tcPr>
-            <w:tcW w:type="dxa" w:w="1701"/>
+            <w:tcW w:type="dxa" w:w="7370"/>
           </w:tcPr>
           <w:p>
             <w:pPr>
@@ -2871,265 +3054,7 @@
                 <w:b w:val="0"/>
                 <w:sz w:val="20"/>
               </w:rPr>
-              <w:t>真实 LLM</w:t>
-            </w:r>
-          </w:p>
-        </w:tc>
-        <w:tc>
-          <w:tcPr>
-            <w:tcW w:type="dxa" w:w="2835"/>
-          </w:tcPr>
-          <w:p>
-            <w:pPr>
-              <w:spacing w:after="80" w:before="80"/>
-            </w:pPr>
-            <w:r>
-              <w:rPr>
-                <w:b w:val="0"/>
-                <w:sz w:val="20"/>
-              </w:rPr>
-              <w:t>成功调用证据与超时/缺配置降级</w:t>
-            </w:r>
-          </w:p>
-        </w:tc>
-        <w:tc>
-          <w:tcPr>
-            <w:tcW w:type="dxa" w:w="5102"/>
-          </w:tcPr>
-          <w:p>
-            <w:pPr>
-              <w:spacing w:after="80" w:before="80"/>
-            </w:pPr>
-            <w:r>
-              <w:rPr>
-                <w:b w:val="0"/>
-                <w:sz w:val="20"/>
-              </w:rPr>
-              <w:t>待配置与验证</w:t>
-            </w:r>
-          </w:p>
-        </w:tc>
-      </w:tr>
-      <w:tr>
-        <w:trPr>
-          <w:cantSplit/>
-        </w:trPr>
-        <w:tc>
-          <w:tcPr>
-            <w:tcW w:type="dxa" w:w="1701"/>
-          </w:tcPr>
-          <w:p>
-            <w:pPr>
-              <w:spacing w:after="80" w:before="80"/>
-            </w:pPr>
-            <w:r>
-              <w:rPr>
-                <w:b w:val="0"/>
-                <w:sz w:val="20"/>
-              </w:rPr>
-              <w:t>Web 截图</w:t>
-            </w:r>
-          </w:p>
-        </w:tc>
-        <w:tc>
-          <w:tcPr>
-            <w:tcW w:type="dxa" w:w="2835"/>
-          </w:tcPr>
-          <w:p>
-            <w:pPr>
-              <w:spacing w:after="80" w:before="80"/>
-            </w:pPr>
-            <w:r>
-              <w:rPr>
-                <w:b w:val="0"/>
-                <w:sz w:val="20"/>
-              </w:rPr>
-              <w:t>截图来源、页面用途和演示数据标注</w:t>
-            </w:r>
-          </w:p>
-        </w:tc>
-        <w:tc>
-          <w:tcPr>
-            <w:tcW w:type="dxa" w:w="5102"/>
-          </w:tcPr>
-          <w:p>
-            <w:pPr>
-              <w:spacing w:after="80" w:before="80"/>
-            </w:pPr>
-            <w:r>
-              <w:rPr>
-                <w:b w:val="0"/>
-                <w:sz w:val="20"/>
-              </w:rPr>
-              <w:t>原型截图已纳入</w:t>
-            </w:r>
-          </w:p>
-        </w:tc>
-      </w:tr>
-      <w:tr>
-        <w:trPr>
-          <w:cantSplit/>
-        </w:trPr>
-        <w:tc>
-          <w:tcPr>
-            <w:tcW w:type="dxa" w:w="1701"/>
-          </w:tcPr>
-          <w:p>
-            <w:pPr>
-              <w:spacing w:after="80" w:before="80"/>
-            </w:pPr>
-            <w:r>
-              <w:rPr>
-                <w:b w:val="0"/>
-                <w:sz w:val="20"/>
-              </w:rPr>
-              <w:t>E-R 图</w:t>
-            </w:r>
-          </w:p>
-        </w:tc>
-        <w:tc>
-          <w:tcPr>
-            <w:tcW w:type="dxa" w:w="2835"/>
-          </w:tcPr>
-          <w:p>
-            <w:pPr>
-              <w:spacing w:after="80" w:before="80"/>
-            </w:pPr>
-            <w:r>
-              <w:rPr>
-                <w:b w:val="0"/>
-                <w:sz w:val="20"/>
-              </w:rPr>
-              <w:t>10 张独立 Chen 图已绘制，后续核对实际迁移</w:t>
-            </w:r>
-          </w:p>
-        </w:tc>
-        <w:tc>
-          <w:tcPr>
-            <w:tcW w:type="dxa" w:w="5102"/>
-          </w:tcPr>
-          <w:p>
-            <w:pPr>
-              <w:spacing w:after="80" w:before="80"/>
-            </w:pPr>
-            <w:r>
-              <w:rPr>
-                <w:b w:val="0"/>
-                <w:sz w:val="20"/>
-              </w:rPr>
-              <w:t>设计图已完成</w:t>
-            </w:r>
-          </w:p>
-        </w:tc>
-      </w:tr>
-      <w:tr>
-        <w:trPr>
-          <w:cantSplit/>
-        </w:trPr>
-        <w:tc>
-          <w:tcPr>
-            <w:tcW w:type="dxa" w:w="1701"/>
-          </w:tcPr>
-          <w:p>
-            <w:pPr>
-              <w:spacing w:after="80" w:before="80"/>
-            </w:pPr>
-            <w:r>
-              <w:rPr>
-                <w:b w:val="0"/>
-                <w:sz w:val="20"/>
-              </w:rPr>
-              <w:t>5 分钟视频</w:t>
-            </w:r>
-          </w:p>
-        </w:tc>
-        <w:tc>
-          <w:tcPr>
-            <w:tcW w:type="dxa" w:w="2835"/>
-          </w:tcPr>
-          <w:p>
-            <w:pPr>
-              <w:spacing w:after="80" w:before="80"/>
-            </w:pPr>
-            <w:r>
-              <w:rPr>
-                <w:b w:val="0"/>
-                <w:sz w:val="20"/>
-              </w:rPr>
-              <w:t>可运行 Demo 和实现讲解</w:t>
-            </w:r>
-          </w:p>
-        </w:tc>
-        <w:tc>
-          <w:tcPr>
-            <w:tcW w:type="dxa" w:w="5102"/>
-          </w:tcPr>
-          <w:p>
-            <w:pPr>
-              <w:spacing w:after="80" w:before="80"/>
-            </w:pPr>
-            <w:r>
-              <w:rPr>
-                <w:b w:val="0"/>
-                <w:sz w:val="20"/>
-              </w:rPr>
-              <w:t>待开发完成后录制</w:t>
-            </w:r>
-          </w:p>
-        </w:tc>
-      </w:tr>
-      <w:tr>
-        <w:trPr>
-          <w:cantSplit/>
-        </w:trPr>
-        <w:tc>
-          <w:tcPr>
-            <w:tcW w:type="dxa" w:w="1701"/>
-          </w:tcPr>
-          <w:p>
-            <w:pPr>
-              <w:spacing w:after="80" w:before="80"/>
-            </w:pPr>
-            <w:r>
-              <w:rPr>
-                <w:b w:val="0"/>
-                <w:sz w:val="20"/>
-              </w:rPr>
-              <w:t>CI / 部署</w:t>
-            </w:r>
-          </w:p>
-        </w:tc>
-        <w:tc>
-          <w:tcPr>
-            <w:tcW w:type="dxa" w:w="2835"/>
-          </w:tcPr>
-          <w:p>
-            <w:pPr>
-              <w:spacing w:after="80" w:before="80"/>
-            </w:pPr>
-            <w:r>
-              <w:rPr>
-                <w:b w:val="0"/>
-                <w:sz w:val="20"/>
-              </w:rPr>
-              <w:t>配置后跟踪终态，部署后核验线上</w:t>
-            </w:r>
-          </w:p>
-        </w:tc>
-        <w:tc>
-          <w:tcPr>
-            <w:tcW w:type="dxa" w:w="5102"/>
-          </w:tcPr>
-          <w:p>
-            <w:pPr>
-              <w:spacing w:after="80" w:before="80"/>
-            </w:pPr>
-            <w:r>
-              <w:rPr>
-                <w:b w:val="0"/>
-                <w:sz w:val="20"/>
-              </w:rPr>
-              <w:t>CI 已配置；未部署</w:t>
+              <w:t>未部署；GitHub Actions 为 CI，没有 CD 或线上运行验收</w:t>
             </w:r>
           </w:p>
         </w:tc>
@@ -3140,7 +3065,7 @@
         <w:pStyle w:val="Heading2"/>
       </w:pPr>
       <w:r>
-        <w:t>8.1 配套资料</w:t>
+        <w:t>8.1 模型输出的实际质量</w:t>
       </w:r>
     </w:p>
     <w:p>
@@ -3148,7 +3073,7 @@
         <w:spacing w:after="140"/>
       </w:pPr>
       <w:r>
-        <w:t>产品范围：docs/product/PRD.md；系统规格：docs/engineering/SRS.md；图纸与映射：docs/engineering/ERD.md；依赖计划：docs/planning/DAG.md。</w:t>
+        <w:t>第一次稀疏描述获得 0.01–99,999 元的全范围报价，属于无实用价值的质量失败。已调整提示词并增加服务端拒绝回归。修复后脚本中，稀疏描述返回随便给，充分描述返回 80–150 元；价格仍不是市场行情认证。</w:t>
       </w:r>
     </w:p>
     <w:p>
@@ -3156,9 +3081,7 @@
         <w:spacing w:after="140"/>
       </w:pPr>
       <w:r>
-        <w:t>仓库：https://github.com/luochen211/neighborhood-exchange</w:t>
-        <w:br/>
-        <w:t>交付 Epic：https://github.com/luochen211/neighborhood-exchange/issues/1</w:t>
+        <w:t>第五次真实浏览器调用返回 FLEXIBLE/null，即随便给，没有数值报价。协调者逐句核对标题、功能、成色和配件均来自输入，再采用文案与交易方式并手动发布。报告截图复用该次验收，未为获得特定价格再次调用。</w:t>
       </w:r>
     </w:p>
     <w:p>
@@ -3166,7 +3089,92 @@
         <w:spacing w:after="140"/>
       </w:pPr>
       <w:r>
-        <w:t>后续报告应逐项记录通过、实际失败、跳过与外部阻塞；不得把原型、模拟模型响应或计划中的行为写成已完成的全栈测试结果。</w:t>
+        <w:t>CI 使用标明的模型 stub，不调用付费服务。已有真实调用与独立浏览器核验单独记录在 acceptance.md / backend.md；两类证据互不替代。</w:t>
+      </w:r>
+    </w:p>
+    <w:p>
+      <w:r>
+        <w:br w:type="page"/>
+      </w:r>
+    </w:p>
+    <w:p>
+      <w:pPr>
+        <w:pStyle w:val="Heading1"/>
+      </w:pPr>
+      <w:r>
+        <w:t>9  运行、视频与 AI Coding 记录</w:t>
+      </w:r>
+    </w:p>
+    <w:p>
+      <w:pPr>
+        <w:pStyle w:val="Heading2"/>
+      </w:pPr>
+      <w:r>
+        <w:t>9.1 本地复现</w:t>
+      </w:r>
+    </w:p>
+    <w:p>
+      <w:pPr>
+        <w:spacing w:after="140"/>
+      </w:pPr>
+      <w:r>
+        <w:t>使用 Node.js 24 / npm 11：npm ci → npm run build → 创建根 .env → npm run db:migrate → npm run db:seed → npm start。DEMO_MODE=true，APP_ORIGIN 与访问端口一致；默认 http://127.0.0.1:3000。完整配置步骤与检查命令见根 README。</w:t>
+      </w:r>
+    </w:p>
+    <w:p>
+      <w:pPr>
+        <w:spacing w:after="140"/>
+      </w:pPr>
+      <w:r>
+        <w:t>数据库路径相对仓库根解析。迁移和种子不会重置已有业务；复现及测试使用独立数据库。模型凭据可选填入本地 .env；缺凭据时 AI 明确报错，手动发布仍可使用。</w:t>
+      </w:r>
+    </w:p>
+    <w:p>
+      <w:pPr>
+        <w:pStyle w:val="Heading2"/>
+      </w:pPr>
+      <w:r>
+        <w:t>9.2 实际演示成片</w:t>
+      </w:r>
+    </w:p>
+    <w:p>
+      <w:pPr>
+        <w:spacing w:after="140"/>
+      </w:pPr>
+      <w:r>
+        <w:t>docs/delivery/邻里闲置_演示视频.mp4：约 5 分钟，包含真实浏览器交易、取消重约、手机界面，以及既有 AI 证据、架构与验收讲解。成片附中文合成讲解音轨、烧录字幕和独立 SRT；镜头来源标明，物理交接未在视频中声称发生。</w:t>
+      </w:r>
+    </w:p>
+    <w:p>
+      <w:pPr>
+        <w:pStyle w:val="Heading2"/>
+      </w:pPr>
+      <w:r>
+        <w:t>9.3 AI Coding 与核验</w:t>
+      </w:r>
+    </w:p>
+    <w:p>
+      <w:pPr>
+        <w:spacing w:after="140"/>
+      </w:pPr>
+      <w:r>
+        <w:t>Codex 辅助需求与接口契约、前后端实现、测试与文档生成。独立任务按完整前端、完整后端和集成验收分工；协调者审查 PR、真实浏览器证据和 CI。关键迭代包括事务与幂等、30 图片迁移、真实模型接入及全范围无效报价修复。</w:t>
+      </w:r>
+    </w:p>
+    <w:p>
+      <w:pPr>
+        <w:spacing w:after="140"/>
+      </w:pPr>
+      <w:r>
+        <w:t>自动化完成后仍逐页目视检查截图、10 张 ER 图和 PDF 排版，并核验视频时长、音轨和抽帧。用户提供的学校参考文档未修改；现有用户数据库未用于录制写操作。</w:t>
+      </w:r>
+    </w:p>
+    <w:p>
+      <w:pPr>
+        <w:spacing w:after="140"/>
+      </w:pPr>
+      <w:r>
+        <w:t>交付索引：docs/delivery/README.md；验收：acceptance.md；ER 核对：erd-verification.md；视频时间轴与制作证据：video.md。最终 Issue 与 Epic 由协调者在 PR 合并、main CI 核验后关闭。</w:t>
       </w:r>
     </w:p>
     <w:sectPr>
@@ -3206,7 +3214,7 @@
       <w:pStyle w:val="Caption"/>
     </w:pPr>
     <w:r>
-      <w:t>邻里闲置  |  项目设计说明书</w:t>
+      <w:t>邻里闲置  |  项目设计与实现说明书</w:t>
     </w:r>
   </w:p>
 </w:hdr>

</xml_diff>